<commit_message>
correcciones docs fase 2
Co-authored-by: Paula Belman <166656129+suricataa@users.noreply.github.com>
Co-authored-by: Alexander Sepúlveda <134305713+Alexander23S@users.noreply.github.com>
</commit_message>
<xml_diff>
--- a/Fase 2/Evidencias individuales/Carrasco_Vicente_2.1_APT122_DiarioReflexionFase2.docx
+++ b/Fase 2/Evidencias individuales/Carrasco_Vicente_2.1_APT122_DiarioReflexionFase2.docx
@@ -1,86 +1,73 @@
 
 <file path=word/document.xml><?xml version="1.0" encoding="utf-8"?>
-<w:document xmlns:mc="http://schemas.openxmlformats.org/markup-compatibility/2006" xmlns:o="urn:schemas-microsoft-com:office:office" xmlns:r="http://schemas.openxmlformats.org/officeDocument/2006/relationships" xmlns:m="http://schemas.openxmlformats.org/officeDocument/2006/math" xmlns:v="urn:schemas-microsoft-com:vml" xmlns:wp="http://schemas.openxmlformats.org/drawingml/2006/wordprocessingDrawing" xmlns:w10="urn:schemas-microsoft-com:office:word" xmlns:w="http://schemas.openxmlformats.org/wordprocessingml/2006/main" xmlns:wne="http://schemas.microsoft.com/office/word/2006/wordml" xmlns:sl="http://schemas.openxmlformats.org/schemaLibrary/2006/main" xmlns:a="http://schemas.openxmlformats.org/drawingml/2006/main" xmlns:pic="http://schemas.openxmlformats.org/drawingml/2006/picture" xmlns:c="http://schemas.openxmlformats.org/drawingml/2006/chart" xmlns:lc="http://schemas.openxmlformats.org/drawingml/2006/lockedCanvas" xmlns:dgm="http://schemas.openxmlformats.org/drawingml/2006/diagram" xmlns:wps="http://schemas.microsoft.com/office/word/2010/wordprocessingShape" xmlns:wpg="http://schemas.microsoft.com/office/word/2010/wordprocessingGroup" xmlns:w14="http://schemas.microsoft.com/office/word/2010/wordml" xmlns:w15="http://schemas.microsoft.com/office/word/2012/wordml" xmlns:w16="http://schemas.microsoft.com/office/word/2018/wordml" xmlns:w16cex="http://schemas.microsoft.com/office/word/2018/wordml/cex" xmlns:w16cid="http://schemas.microsoft.com/office/word/2016/wordml/cid" xmlns="http://schemas.microsoft.com/office/tasks/2019/documenttasks" xmlns:cr="http://schemas.microsoft.com/office/comments/2020/reactions">
+<w:document xmlns:wpc="http://schemas.microsoft.com/office/word/2010/wordprocessingCanvas" xmlns:cx="http://schemas.microsoft.com/office/drawing/2014/chartex" xmlns:cx1="http://schemas.microsoft.com/office/drawing/2015/9/8/chartex" xmlns:cx2="http://schemas.microsoft.com/office/drawing/2015/10/21/chartex" xmlns:cx3="http://schemas.microsoft.com/office/drawing/2016/5/9/chartex" xmlns:cx4="http://schemas.microsoft.com/office/drawing/2016/5/10/chartex" xmlns:cx5="http://schemas.microsoft.com/office/drawing/2016/5/11/chartex" xmlns:cx6="http://schemas.microsoft.com/office/drawing/2016/5/12/chartex" xmlns:cx7="http://schemas.microsoft.com/office/drawing/2016/5/13/chartex" xmlns:cx8="http://schemas.microsoft.com/office/drawing/2016/5/14/chartex" xmlns:mc="http://schemas.openxmlformats.org/markup-compatibility/2006" xmlns:aink="http://schemas.microsoft.com/office/drawing/2016/ink" xmlns:am3d="http://schemas.microsoft.com/office/drawing/2017/model3d" xmlns:o="urn:schemas-microsoft-com:office:office" xmlns:oel="http://schemas.microsoft.com/office/2019/extlst" xmlns:r="http://schemas.openxmlformats.org/officeDocument/2006/relationships" xmlns:m="http://schemas.openxmlformats.org/officeDocument/2006/math" xmlns:v="urn:schemas-microsoft-com:vml" xmlns:wp14="http://schemas.microsoft.com/office/word/2010/wordprocessingDrawing" xmlns:wp="http://schemas.openxmlformats.org/drawingml/2006/wordprocessingDrawing" xmlns:w10="urn:schemas-microsoft-com:office:word" xmlns:w="http://schemas.openxmlformats.org/wordprocessingml/2006/main" xmlns:w14="http://schemas.microsoft.com/office/word/2010/wordml" xmlns:w15="http://schemas.microsoft.com/office/word/2012/wordml" xmlns:w16cex="http://schemas.microsoft.com/office/word/2018/wordml/cex" xmlns:w16cid="http://schemas.microsoft.com/office/word/2016/wordml/cid" xmlns:w16="http://schemas.microsoft.com/office/word/2018/wordml" xmlns:w16du="http://schemas.microsoft.com/office/word/2023/wordml/word16du" xmlns:w16sdtdh="http://schemas.microsoft.com/office/word/2020/wordml/sdtdatahash" xmlns:w16sdtfl="http://schemas.microsoft.com/office/word/2024/wordml/sdtformatlock" xmlns:w16se="http://schemas.microsoft.com/office/word/2015/wordml/symex" xmlns:wpg="http://schemas.microsoft.com/office/word/2010/wordprocessingGroup" xmlns:wpi="http://schemas.microsoft.com/office/word/2010/wordprocessingInk" xmlns:wne="http://schemas.microsoft.com/office/word/2006/wordml" xmlns:wps="http://schemas.microsoft.com/office/word/2010/wordprocessingShape" mc:Ignorable="w14 w15 w16se w16cid w16 w16cex w16sdtdh w16sdtfl w16du wp14">
   <w:body>
-    <w:p>
-      <w:pPr>
-        <w:rPr/>
-      </w:pPr>
-      <w:r>
-        <w:rPr>
-          <w:rtl w:val="0"/>
-        </w:rPr>
-      </w:r>
-    </w:p>
+    <w:p/>
     <w:tbl>
       <w:tblPr>
-        <w:tblStyle w:val="Table1"/>
-        <w:tblW w:w="9923.0" w:type="dxa"/>
-        <w:jc w:val="left"/>
+        <w:tblStyle w:val="a"/>
+        <w:tblW w:w="9923" w:type="dxa"/>
+        <w:tblInd w:w="0" w:type="dxa"/>
         <w:tblBorders>
-          <w:top w:color="000000" w:space="0" w:sz="0" w:val="nil"/>
-          <w:left w:color="000000" w:space="0" w:sz="0" w:val="nil"/>
-          <w:bottom w:color="000000" w:space="0" w:sz="0" w:val="nil"/>
-          <w:right w:color="000000" w:space="0" w:sz="0" w:val="nil"/>
-          <w:insideH w:color="000000" w:space="0" w:sz="0" w:val="nil"/>
-          <w:insideV w:color="000000" w:space="0" w:sz="0" w:val="nil"/>
+          <w:top w:val="nil"/>
+          <w:left w:val="nil"/>
+          <w:bottom w:val="nil"/>
+          <w:right w:val="nil"/>
+          <w:insideH w:val="nil"/>
+          <w:insideV w:val="nil"/>
         </w:tblBorders>
         <w:tblLayout w:type="fixed"/>
-        <w:tblLook w:val="0400"/>
+        <w:tblLook w:val="0400" w:firstRow="0" w:lastRow="0" w:firstColumn="0" w:lastColumn="0" w:noHBand="0" w:noVBand="1"/>
       </w:tblPr>
       <w:tblGrid>
         <w:gridCol w:w="835"/>
         <w:gridCol w:w="9088"/>
-        <w:tblGridChange w:id="0">
-          <w:tblGrid>
-            <w:gridCol w:w="835"/>
-            <w:gridCol w:w="9088"/>
-          </w:tblGrid>
-        </w:tblGridChange>
       </w:tblGrid>
       <w:tr>
         <w:trPr>
-          <w:cantSplit w:val="0"/>
-          <w:trHeight w:val="2192" w:hRule="atLeast"/>
-          <w:tblHeader w:val="0"/>
+          <w:trHeight w:val="2192"/>
         </w:trPr>
         <w:tc>
-          <w:tcPr/>
+          <w:tcPr>
+            <w:tcW w:w="835" w:type="dxa"/>
+          </w:tcPr>
           <w:p>
             <w:pPr>
               <w:jc w:val="both"/>
               <w:rPr>
-                <w:rFonts w:ascii="Century Gothic" w:cs="Century Gothic" w:eastAsia="Century Gothic" w:hAnsi="Century Gothic"/>
-                <w:b w:val="1"/>
-                <w:bCs w:val="1"/>
+                <w:rFonts w:ascii="Century Gothic" w:eastAsia="Century Gothic" w:hAnsi="Century Gothic" w:cs="Century Gothic"/>
+                <w:b/>
+                <w:bCs/>
                 <w:sz w:val="28"/>
                 <w:szCs w:val="28"/>
               </w:rPr>
             </w:pPr>
             <w:r>
               <w:rPr>
-                <w:rFonts w:ascii="Century Gothic" w:cs="Century Gothic" w:eastAsia="Century Gothic" w:hAnsi="Century Gothic"/>
-                <w:b w:val="1"/>
-                <w:bCs w:val="1"/>
-                <w:color w:val="1d2763"/>
+                <w:rFonts w:ascii="Century Gothic" w:eastAsia="Century Gothic" w:hAnsi="Century Gothic" w:cs="Century Gothic"/>
+                <w:b/>
+                <w:bCs/>
+                <w:noProof/>
+                <w:color w:val="1D2763"/>
                 <w:sz w:val="28"/>
                 <w:szCs w:val="28"/>
               </w:rPr>
               <w:drawing>
-                <wp:inline distB="0" distT="0" distL="0" distR="0">
+                <wp:inline distT="0" distB="0" distL="0" distR="0" wp14:anchorId="43429BBF" wp14:editId="6D5DD4E3">
                   <wp:extent cx="393640" cy="444500"/>
-                  <wp:effectExtent b="0" l="0" r="0" t="0"/>
+                  <wp:effectExtent l="0" t="0" r="0" b="0"/>
                   <wp:docPr id="17580" name="image1.png"/>
-                  <a:graphic>
+                  <wp:cNvGraphicFramePr/>
+                  <a:graphic xmlns:a="http://schemas.openxmlformats.org/drawingml/2006/main">
                     <a:graphicData uri="http://schemas.openxmlformats.org/drawingml/2006/picture">
-                      <pic:pic>
+                      <pic:pic xmlns:pic="http://schemas.openxmlformats.org/drawingml/2006/picture">
                         <pic:nvPicPr>
                           <pic:cNvPr id="0" name="image1.png"/>
                           <pic:cNvPicPr preferRelativeResize="0"/>
                         </pic:nvPicPr>
                         <pic:blipFill>
                           <a:blip r:embed="rId7"/>
-                          <a:srcRect b="0" l="0" r="0" t="0"/>
+                          <a:srcRect/>
                           <a:stretch>
                             <a:fillRect/>
                           </a:stretch>
@@ -90,7 +77,9 @@
                             <a:off x="0" y="0"/>
                             <a:ext cx="393640" cy="444500"/>
                           </a:xfrm>
-                          <a:prstGeom prst="rect"/>
+                          <a:prstGeom prst="rect">
+                            <a:avLst/>
+                          </a:prstGeom>
                           <a:ln/>
                         </pic:spPr>
                       </pic:pic>
@@ -99,15 +88,12 @@
                 </wp:inline>
               </w:drawing>
             </w:r>
-            <w:r>
-              <w:rPr>
-                <w:rtl w:val="0"/>
-              </w:rPr>
-            </w:r>
           </w:p>
         </w:tc>
         <w:tc>
-          <w:tcPr/>
+          <w:tcPr>
+            <w:tcW w:w="9088" w:type="dxa"/>
+          </w:tcPr>
           <w:p>
             <w:pPr>
               <w:jc w:val="both"/>
@@ -121,14 +107,8 @@
               <w:rPr>
                 <w:sz w:val="24"/>
                 <w:szCs w:val="24"/>
-                <w:rtl w:val="0"/>
               </w:rPr>
               <w:t xml:space="preserve">Esta pauta tiene como objetivo ayudarte a monitorear el desarrollo de tu Proyecto APT, reflexionando sobre tus avances de acuerdo con lo planificado en la fase anterior y recibiendo retroalimentación de tus pares y docentes que te permita hacer los ajustes necesarios para cumplir con los objetivos de tu proyecto. Esta pauta debe ser respondida con tu grupo. </w:t>
-            </w:r>
-            <w:r>
-              <w:rPr>
-                <w:rtl w:val="0"/>
-              </w:rPr>
             </w:r>
           </w:p>
         </w:tc>
@@ -143,40 +123,27 @@
           <w:szCs w:val="24"/>
         </w:rPr>
       </w:pPr>
-      <w:r>
-        <w:rPr>
-          <w:rtl w:val="0"/>
-        </w:rPr>
-      </w:r>
     </w:p>
     <w:tbl>
       <w:tblPr>
-        <w:tblStyle w:val="Table2"/>
-        <w:tblW w:w="10057.0" w:type="dxa"/>
-        <w:jc w:val="left"/>
+        <w:tblStyle w:val="a0"/>
+        <w:tblW w:w="10057" w:type="dxa"/>
+        <w:tblInd w:w="0" w:type="dxa"/>
         <w:tblLayout w:type="fixed"/>
-        <w:tblLook w:val="0400"/>
+        <w:tblLook w:val="0400" w:firstRow="0" w:lastRow="0" w:firstColumn="0" w:lastColumn="0" w:noHBand="0" w:noVBand="1"/>
       </w:tblPr>
       <w:tblGrid>
         <w:gridCol w:w="10057"/>
-        <w:tblGridChange w:id="0">
-          <w:tblGrid>
-            <w:gridCol w:w="10057"/>
-          </w:tblGrid>
-        </w:tblGridChange>
       </w:tblGrid>
       <w:tr>
-        <w:trPr>
-          <w:cantSplit w:val="0"/>
-          <w:tblHeader w:val="0"/>
-        </w:trPr>
         <w:tc>
           <w:tcPr>
+            <w:tcW w:w="10057" w:type="dxa"/>
             <w:tcBorders>
-              <w:top w:color="cdcdcd" w:space="0" w:sz="6" w:val="single"/>
-              <w:left w:color="cdcdcd" w:space="0" w:sz="6" w:val="single"/>
-              <w:bottom w:color="cdcdcd" w:space="0" w:sz="6" w:val="single"/>
-              <w:right w:color="cdcdcd" w:space="0" w:sz="6" w:val="single"/>
+              <w:top w:val="single" w:sz="6" w:space="0" w:color="CDCDCD"/>
+              <w:left w:val="single" w:sz="6" w:space="0" w:color="CDCDCD"/>
+              <w:bottom w:val="single" w:sz="6" w:space="0" w:color="CDCDCD"/>
+              <w:right w:val="single" w:sz="6" w:space="0" w:color="CDCDCD"/>
             </w:tcBorders>
             <w:vAlign w:val="center"/>
           </w:tcPr>
@@ -193,14 +160,8 @@
               <w:rPr>
                 <w:sz w:val="24"/>
                 <w:szCs w:val="24"/>
-                <w:rtl w:val="0"/>
-              </w:rPr>
-              <w:t xml:space="preserve">Puedes completar esta guía y, posteriormente, cargarla en la sección de reflexión de la Fase 2, para retroalimentación de tu docente.</w:t>
-            </w:r>
-            <w:r>
-              <w:rPr>
-                <w:rtl w:val="0"/>
-              </w:rPr>
+              </w:rPr>
+              <w:t>Puedes completar esta guía y, posteriormente, cargarla en la sección de reflexión de la Fase 2, para retroalimentación de tu docente.</w:t>
             </w:r>
           </w:p>
         </w:tc>
@@ -211,74 +172,58 @@
         <w:spacing w:after="0" w:line="360" w:lineRule="auto"/>
         <w:jc w:val="both"/>
         <w:rPr>
-          <w:b w:val="1"/>
-          <w:bCs w:val="1"/>
+          <w:b/>
+          <w:bCs/>
           <w:sz w:val="24"/>
           <w:szCs w:val="24"/>
         </w:rPr>
       </w:pPr>
-      <w:r>
-        <w:rPr>
-          <w:rtl w:val="0"/>
-        </w:rPr>
-      </w:r>
     </w:p>
     <w:p>
       <w:pPr>
         <w:spacing w:after="0" w:line="360" w:lineRule="auto"/>
         <w:jc w:val="both"/>
         <w:rPr>
-          <w:b w:val="1"/>
-          <w:bCs w:val="1"/>
+          <w:b/>
+          <w:bCs/>
           <w:sz w:val="24"/>
           <w:szCs w:val="24"/>
         </w:rPr>
       </w:pPr>
-      <w:r>
-        <w:rPr>
-          <w:rtl w:val="0"/>
-        </w:rPr>
-      </w:r>
     </w:p>
     <w:tbl>
       <w:tblPr>
-        <w:tblStyle w:val="Table3"/>
-        <w:tblW w:w="10076.0" w:type="dxa"/>
-        <w:jc w:val="left"/>
+        <w:tblStyle w:val="a1"/>
+        <w:tblW w:w="10076" w:type="dxa"/>
+        <w:tblInd w:w="0" w:type="dxa"/>
         <w:tblBorders>
-          <w:top w:color="bfbfbf" w:space="0" w:sz="4" w:val="single"/>
-          <w:left w:color="bfbfbf" w:space="0" w:sz="4" w:val="single"/>
-          <w:bottom w:color="bfbfbf" w:space="0" w:sz="4" w:val="single"/>
-          <w:right w:color="bfbfbf" w:space="0" w:sz="4" w:val="single"/>
-          <w:insideH w:color="bfbfbf" w:space="0" w:sz="4" w:val="single"/>
-          <w:insideV w:color="bfbfbf" w:space="0" w:sz="4" w:val="single"/>
+          <w:top w:val="single" w:sz="4" w:space="0" w:color="BFBFBF"/>
+          <w:left w:val="single" w:sz="4" w:space="0" w:color="BFBFBF"/>
+          <w:bottom w:val="single" w:sz="4" w:space="0" w:color="BFBFBF"/>
+          <w:right w:val="single" w:sz="4" w:space="0" w:color="BFBFBF"/>
+          <w:insideH w:val="single" w:sz="4" w:space="0" w:color="BFBFBF"/>
+          <w:insideV w:val="single" w:sz="4" w:space="0" w:color="BFBFBF"/>
         </w:tblBorders>
         <w:tblLayout w:type="fixed"/>
-        <w:tblLook w:val="0400"/>
+        <w:tblLook w:val="0400" w:firstRow="0" w:lastRow="0" w:firstColumn="0" w:lastColumn="0" w:noHBand="0" w:noVBand="1"/>
       </w:tblPr>
       <w:tblGrid>
         <w:gridCol w:w="10076"/>
-        <w:tblGridChange w:id="0">
-          <w:tblGrid>
-            <w:gridCol w:w="10076"/>
-          </w:tblGrid>
-        </w:tblGridChange>
       </w:tblGrid>
       <w:tr>
         <w:trPr>
-          <w:cantSplit w:val="0"/>
-          <w:trHeight w:val="440" w:hRule="atLeast"/>
-          <w:tblHeader w:val="0"/>
+          <w:trHeight w:val="440"/>
         </w:trPr>
         <w:tc>
           <w:tcPr>
+            <w:tcW w:w="10076" w:type="dxa"/>
             <w:vAlign w:val="center"/>
           </w:tcPr>
           <w:p>
             <w:pPr>
               <w:rPr>
-                <w:b w:val="1"/>
-                <w:bCs w:val="1"/>
+                <w:b/>
+                <w:bCs/>
                 <w:color w:val="767171"/>
                 <w:sz w:val="24"/>
                 <w:szCs w:val="24"/>
@@ -288,27 +233,20 @@
               <w:rPr>
                 <w:sz w:val="24"/>
                 <w:szCs w:val="24"/>
-                <w:rtl w:val="0"/>
-              </w:rPr>
-              <w:t xml:space="preserve">1. Mira tu carta Gantt y reflexiona sobre los avances de tu Proyecto APT</w:t>
-            </w:r>
-            <w:r>
-              <w:rPr>
-                <w:rtl w:val="0"/>
-              </w:rPr>
+              </w:rPr>
+              <w:t>1. Mira tu carta Gantt y reflexiona sobre los avances de tu Proyecto APT</w:t>
             </w:r>
           </w:p>
         </w:tc>
       </w:tr>
       <w:tr>
         <w:trPr>
-          <w:cantSplit w:val="0"/>
-          <w:trHeight w:val="1639" w:hRule="atLeast"/>
-          <w:tblHeader w:val="0"/>
+          <w:trHeight w:val="1639"/>
         </w:trPr>
         <w:tc>
           <w:tcPr>
-            <w:shd w:fill="deeaf6" w:val="clear"/>
+            <w:tcW w:w="10076" w:type="dxa"/>
+            <w:shd w:val="clear" w:color="auto" w:fill="DEEAF6"/>
             <w:vAlign w:val="center"/>
           </w:tcPr>
           <w:p>
@@ -324,94 +262,63 @@
               <w:rPr>
                 <w:sz w:val="24"/>
                 <w:szCs w:val="24"/>
-                <w:rtl w:val="0"/>
-              </w:rPr>
-              <w:t xml:space="preserve">¿Has podido cumplir todas las actividades en los tiempos definidos? ¿Qué factores han facilitado o dificultado el desarrollo de las actividades de tu plan de trabajo?</w:t>
+              </w:rPr>
+              <w:t>¿Has podido cumplir todas las actividades en los tiempos definidos? ¿Qué factores han facilitado o dificultado el desarrollo de las actividades de tu plan de trabajo?</w:t>
             </w:r>
+          </w:p>
+          <w:p>
+            <w:pPr>
+              <w:jc w:val="both"/>
+              <w:rPr>
+                <w:color w:val="767171"/>
+                <w:sz w:val="24"/>
+                <w:szCs w:val="24"/>
+              </w:rPr>
+            </w:pPr>
             <w:r>
               <w:rPr>
-                <w:rtl w:val="0"/>
-              </w:rPr>
+                <w:sz w:val="24"/>
+                <w:szCs w:val="24"/>
+              </w:rPr>
+              <w:t>Se ha cumplido de manera parcial. Hemos avanzado en el desarrollo de la página y de los bots, aunque no siempre en el orden exacto que planteamos en la carta Gantt.</w:t>
             </w:r>
           </w:p>
           <w:p>
             <w:pPr>
               <w:jc w:val="both"/>
               <w:rPr>
-                <w:color w:val="767171"/>
-                <w:sz w:val="24"/>
-                <w:szCs w:val="24"/>
+                <w:b/>
+                <w:bCs/>
+                <w:color w:val="1F4E79"/>
               </w:rPr>
             </w:pPr>
             <w:r>
               <w:rPr>
                 <w:sz w:val="24"/>
                 <w:szCs w:val="24"/>
-                <w:rtl w:val="0"/>
-              </w:rPr>
-              <w:t xml:space="preserve">Se ha cumplido de manera parcial. Hemos avanzado en el desarrollo de la página y de los bots, aunque no siempre en el orden exacto que planteamos en la carta Gantt.</w:t>
+              </w:rPr>
+              <w:t>Lo que más me ha dificultado es el tiempo, ya que estoy haciendo mi práctica en jornada completa de lunes a viernes y me queda poco espacio para avanzar en el proyecto durante la semana. También ha influido que el cliente aún no nos envía las fotos de los productos y que hemos tenido que ajustar detalles como los colores de la página. Lo que ha facilitado el avance es que el grupo se conoce bien y cada uno tiene claras sus tareas.</w:t>
             </w:r>
-            <w:r>
-              <w:rPr>
-                <w:rtl w:val="0"/>
-              </w:rPr>
-            </w:r>
           </w:p>
           <w:p>
             <w:pPr>
               <w:jc w:val="both"/>
               <w:rPr>
-                <w:rFonts w:ascii="Calibri" w:cs="Calibri" w:eastAsia="Calibri" w:hAnsi="Calibri"/>
-                <w:b w:val="1"/>
-                <w:bCs w:val="1"/>
-                <w:color w:val="1f4e79"/>
-              </w:rPr>
-            </w:pPr>
-            <w:r>
-              <w:rPr>
-                <w:sz w:val="24"/>
-                <w:szCs w:val="24"/>
-                <w:rtl w:val="0"/>
-              </w:rPr>
-              <w:t xml:space="preserve">Lo que más me ha dificultado es el tiempo, ya que estoy haciendo mi práctica en jornada completa de lunes a viernes y me queda poco espacio para avanzar en el proyecto durante la semana. También ha influido que el cliente aún no nos envía las fotos de los productos y que hemos tenido que ajustar detalles como los colores de la página. Lo que ha facilitado el avance es que el grupo se conoce bien y cada uno tiene claras sus tareas.</w:t>
-            </w:r>
-            <w:r>
-              <w:rPr>
-                <w:rtl w:val="0"/>
-              </w:rPr>
-            </w:r>
+                <w:b/>
+                <w:bCs/>
+                <w:color w:val="1F4E79"/>
+              </w:rPr>
+            </w:pPr>
           </w:p>
           <w:p>
             <w:pPr>
               <w:jc w:val="both"/>
               <w:rPr>
-                <w:rFonts w:ascii="Calibri" w:cs="Calibri" w:eastAsia="Calibri" w:hAnsi="Calibri"/>
-                <w:b w:val="1"/>
-                <w:bCs w:val="1"/>
-                <w:color w:val="1f4e79"/>
-              </w:rPr>
-            </w:pPr>
-            <w:r>
-              <w:rPr>
-                <w:rtl w:val="0"/>
-              </w:rPr>
-            </w:r>
-          </w:p>
-          <w:p>
-            <w:pPr>
-              <w:jc w:val="both"/>
-              <w:rPr>
-                <w:rFonts w:ascii="Calibri" w:cs="Calibri" w:eastAsia="Calibri" w:hAnsi="Calibri"/>
-                <w:b w:val="1"/>
-                <w:bCs w:val="1"/>
-                <w:color w:val="1f4e79"/>
-              </w:rPr>
-            </w:pPr>
-            <w:r>
-              <w:rPr>
-                <w:rtl w:val="0"/>
-              </w:rPr>
-            </w:r>
+                <w:b/>
+                <w:bCs/>
+                <w:color w:val="1F4E79"/>
+              </w:rPr>
+            </w:pPr>
           </w:p>
         </w:tc>
       </w:tr>
@@ -426,51 +333,40 @@
           <w:szCs w:val="24"/>
         </w:rPr>
       </w:pPr>
-      <w:r>
-        <w:rPr>
-          <w:rtl w:val="0"/>
-        </w:rPr>
-      </w:r>
     </w:p>
     <w:tbl>
       <w:tblPr>
-        <w:tblStyle w:val="Table4"/>
-        <w:tblW w:w="10076.0" w:type="dxa"/>
-        <w:jc w:val="left"/>
+        <w:tblStyle w:val="a2"/>
+        <w:tblW w:w="10076" w:type="dxa"/>
+        <w:tblInd w:w="0" w:type="dxa"/>
         <w:tblBorders>
-          <w:top w:color="bfbfbf" w:space="0" w:sz="4" w:val="single"/>
-          <w:left w:color="bfbfbf" w:space="0" w:sz="4" w:val="single"/>
-          <w:bottom w:color="bfbfbf" w:space="0" w:sz="4" w:val="single"/>
-          <w:right w:color="bfbfbf" w:space="0" w:sz="4" w:val="single"/>
-          <w:insideH w:color="bfbfbf" w:space="0" w:sz="4" w:val="single"/>
-          <w:insideV w:color="bfbfbf" w:space="0" w:sz="4" w:val="single"/>
+          <w:top w:val="single" w:sz="4" w:space="0" w:color="BFBFBF"/>
+          <w:left w:val="single" w:sz="4" w:space="0" w:color="BFBFBF"/>
+          <w:bottom w:val="single" w:sz="4" w:space="0" w:color="BFBFBF"/>
+          <w:right w:val="single" w:sz="4" w:space="0" w:color="BFBFBF"/>
+          <w:insideH w:val="single" w:sz="4" w:space="0" w:color="BFBFBF"/>
+          <w:insideV w:val="single" w:sz="4" w:space="0" w:color="BFBFBF"/>
         </w:tblBorders>
         <w:tblLayout w:type="fixed"/>
-        <w:tblLook w:val="0400"/>
+        <w:tblLook w:val="0400" w:firstRow="0" w:lastRow="0" w:firstColumn="0" w:lastColumn="0" w:noHBand="0" w:noVBand="1"/>
       </w:tblPr>
       <w:tblGrid>
         <w:gridCol w:w="10076"/>
-        <w:tblGridChange w:id="0">
-          <w:tblGrid>
-            <w:gridCol w:w="10076"/>
-          </w:tblGrid>
-        </w:tblGridChange>
       </w:tblGrid>
       <w:tr>
         <w:trPr>
-          <w:cantSplit w:val="0"/>
-          <w:trHeight w:val="440" w:hRule="atLeast"/>
-          <w:tblHeader w:val="0"/>
+          <w:trHeight w:val="440"/>
         </w:trPr>
         <w:tc>
           <w:tcPr>
+            <w:tcW w:w="10076" w:type="dxa"/>
             <w:vAlign w:val="center"/>
           </w:tcPr>
           <w:p>
             <w:pPr>
               <w:rPr>
-                <w:b w:val="1"/>
-                <w:bCs w:val="1"/>
+                <w:b/>
+                <w:bCs/>
                 <w:color w:val="767171"/>
                 <w:sz w:val="24"/>
                 <w:szCs w:val="24"/>
@@ -480,27 +376,20 @@
               <w:rPr>
                 <w:sz w:val="24"/>
                 <w:szCs w:val="24"/>
-                <w:rtl w:val="0"/>
               </w:rPr>
               <w:t xml:space="preserve">2. </w:t>
-            </w:r>
-            <w:r>
-              <w:rPr>
-                <w:rtl w:val="0"/>
-              </w:rPr>
             </w:r>
           </w:p>
         </w:tc>
       </w:tr>
       <w:tr>
         <w:trPr>
-          <w:cantSplit w:val="0"/>
-          <w:trHeight w:val="1639" w:hRule="atLeast"/>
-          <w:tblHeader w:val="0"/>
+          <w:trHeight w:val="1639"/>
         </w:trPr>
         <w:tc>
           <w:tcPr>
-            <w:shd w:fill="deeaf6" w:val="clear"/>
+            <w:tcW w:w="10076" w:type="dxa"/>
+            <w:shd w:val="clear" w:color="auto" w:fill="DEEAF6"/>
             <w:vAlign w:val="center"/>
           </w:tcPr>
           <w:p>
@@ -516,87 +405,56 @@
               <w:rPr>
                 <w:sz w:val="24"/>
                 <w:szCs w:val="24"/>
-                <w:rtl w:val="0"/>
               </w:rPr>
               <w:t xml:space="preserve">¿De qué manera has enfrentado y/o planeas enfrentar las dificultades que han afectado el desarrollo de tu Proyecto APT? </w:t>
             </w:r>
+          </w:p>
+          <w:p>
+            <w:pPr>
+              <w:jc w:val="both"/>
+              <w:rPr>
+                <w:b/>
+                <w:bCs/>
+                <w:color w:val="1F4E79"/>
+              </w:rPr>
+            </w:pPr>
             <w:r>
               <w:rPr>
-                <w:rtl w:val="0"/>
-              </w:rPr>
+                <w:sz w:val="24"/>
+                <w:szCs w:val="24"/>
+              </w:rPr>
+              <w:t>Para el tema del tiempo, estoy organizando mejor mis horarios, dejando bloques fijos en las tardes y fines de semana para trabajar en los bots y en el frontend. En cuanto a lo del cliente, seguimos desarrollando con imágenes y productos de prueba para no atrasar el cronograma, y los colores y detalles visuales los vamos ajustando según lo que él nos vaya pidiendo.</w:t>
             </w:r>
           </w:p>
           <w:p>
             <w:pPr>
               <w:jc w:val="both"/>
               <w:rPr>
-                <w:rFonts w:ascii="Calibri" w:cs="Calibri" w:eastAsia="Calibri" w:hAnsi="Calibri"/>
-                <w:b w:val="1"/>
-                <w:bCs w:val="1"/>
-                <w:color w:val="1f4e79"/>
-              </w:rPr>
-            </w:pPr>
-            <w:r>
-              <w:rPr>
-                <w:sz w:val="24"/>
-                <w:szCs w:val="24"/>
-                <w:rtl w:val="0"/>
-              </w:rPr>
-              <w:t xml:space="preserve">Para el tema del tiempo, estoy organizando mejor mis horarios, dejando bloques fijos en las tardes y fines de semana para trabajar en los bots y en el frontend. En cuanto a lo del cliente, seguimos desarrollando con imágenes y productos de prueba para no atrasar el cronograma, y los colores y detalles visuales los vamos ajustando según lo que él nos vaya pidiendo.</w:t>
-            </w:r>
-            <w:r>
-              <w:rPr>
-                <w:rtl w:val="0"/>
-              </w:rPr>
-            </w:r>
+                <w:b/>
+                <w:bCs/>
+                <w:color w:val="1F4E79"/>
+              </w:rPr>
+            </w:pPr>
           </w:p>
           <w:p>
             <w:pPr>
               <w:jc w:val="both"/>
               <w:rPr>
-                <w:rFonts w:ascii="Calibri" w:cs="Calibri" w:eastAsia="Calibri" w:hAnsi="Calibri"/>
-                <w:b w:val="1"/>
-                <w:bCs w:val="1"/>
-                <w:color w:val="1f4e79"/>
-              </w:rPr>
-            </w:pPr>
-            <w:r>
-              <w:rPr>
-                <w:rtl w:val="0"/>
-              </w:rPr>
-            </w:r>
+                <w:b/>
+                <w:bCs/>
+                <w:color w:val="1F4E79"/>
+              </w:rPr>
+            </w:pPr>
           </w:p>
           <w:p>
             <w:pPr>
               <w:jc w:val="both"/>
               <w:rPr>
-                <w:rFonts w:ascii="Calibri" w:cs="Calibri" w:eastAsia="Calibri" w:hAnsi="Calibri"/>
-                <w:b w:val="1"/>
-                <w:bCs w:val="1"/>
-                <w:color w:val="1f4e79"/>
-              </w:rPr>
-            </w:pPr>
-            <w:r>
-              <w:rPr>
-                <w:rtl w:val="0"/>
-              </w:rPr>
-            </w:r>
-          </w:p>
-          <w:p>
-            <w:pPr>
-              <w:jc w:val="both"/>
-              <w:rPr>
-                <w:rFonts w:ascii="Calibri" w:cs="Calibri" w:eastAsia="Calibri" w:hAnsi="Calibri"/>
-                <w:b w:val="1"/>
-                <w:bCs w:val="1"/>
-                <w:color w:val="1f4e79"/>
-              </w:rPr>
-            </w:pPr>
-            <w:r>
-              <w:rPr>
-                <w:rtl w:val="0"/>
-              </w:rPr>
-            </w:r>
+                <w:b/>
+                <w:bCs/>
+                <w:color w:val="1F4E79"/>
+              </w:rPr>
+            </w:pPr>
           </w:p>
         </w:tc>
       </w:tr>
@@ -611,187 +469,136 @@
           <w:szCs w:val="24"/>
         </w:rPr>
       </w:pPr>
-      <w:r>
-        <w:rPr>
-          <w:rtl w:val="0"/>
-        </w:rPr>
-      </w:r>
     </w:p>
     <w:p>
       <w:pPr>
         <w:spacing w:after="0" w:line="360" w:lineRule="auto"/>
         <w:jc w:val="both"/>
         <w:rPr>
-          <w:b w:val="1"/>
-          <w:bCs w:val="1"/>
+          <w:b/>
+          <w:bCs/>
           <w:sz w:val="24"/>
           <w:szCs w:val="24"/>
         </w:rPr>
       </w:pPr>
-      <w:r>
-        <w:rPr>
-          <w:rtl w:val="0"/>
-        </w:rPr>
-      </w:r>
     </w:p>
     <w:p>
       <w:pPr>
         <w:spacing w:after="0" w:line="360" w:lineRule="auto"/>
         <w:jc w:val="both"/>
         <w:rPr>
-          <w:b w:val="1"/>
-          <w:bCs w:val="1"/>
+          <w:b/>
+          <w:bCs/>
           <w:sz w:val="24"/>
           <w:szCs w:val="24"/>
         </w:rPr>
       </w:pPr>
-      <w:r>
-        <w:rPr>
-          <w:rtl w:val="0"/>
-        </w:rPr>
-      </w:r>
     </w:p>
     <w:p>
       <w:pPr>
         <w:spacing w:after="0" w:line="360" w:lineRule="auto"/>
         <w:jc w:val="both"/>
         <w:rPr>
-          <w:b w:val="1"/>
-          <w:bCs w:val="1"/>
+          <w:b/>
+          <w:bCs/>
           <w:sz w:val="24"/>
           <w:szCs w:val="24"/>
         </w:rPr>
       </w:pPr>
-      <w:r>
-        <w:rPr>
-          <w:rtl w:val="0"/>
-        </w:rPr>
-      </w:r>
     </w:p>
     <w:p>
       <w:pPr>
         <w:spacing w:after="0" w:line="360" w:lineRule="auto"/>
         <w:jc w:val="both"/>
         <w:rPr>
-          <w:b w:val="1"/>
-          <w:bCs w:val="1"/>
+          <w:b/>
+          <w:bCs/>
           <w:sz w:val="24"/>
           <w:szCs w:val="24"/>
         </w:rPr>
       </w:pPr>
-      <w:r>
-        <w:rPr>
-          <w:rtl w:val="0"/>
-        </w:rPr>
-      </w:r>
     </w:p>
     <w:p>
       <w:pPr>
         <w:spacing w:after="0" w:line="360" w:lineRule="auto"/>
         <w:jc w:val="both"/>
         <w:rPr>
-          <w:b w:val="1"/>
-          <w:bCs w:val="1"/>
+          <w:b/>
+          <w:bCs/>
           <w:sz w:val="24"/>
           <w:szCs w:val="24"/>
         </w:rPr>
       </w:pPr>
-      <w:r>
-        <w:rPr>
-          <w:rtl w:val="0"/>
-        </w:rPr>
-      </w:r>
     </w:p>
     <w:p>
       <w:pPr>
         <w:spacing w:after="0" w:line="360" w:lineRule="auto"/>
         <w:jc w:val="both"/>
         <w:rPr>
-          <w:b w:val="1"/>
-          <w:bCs w:val="1"/>
+          <w:b/>
+          <w:bCs/>
           <w:sz w:val="24"/>
           <w:szCs w:val="24"/>
         </w:rPr>
       </w:pPr>
-      <w:r>
-        <w:rPr>
-          <w:rtl w:val="0"/>
-        </w:rPr>
-      </w:r>
     </w:p>
     <w:p>
       <w:pPr>
         <w:spacing w:after="0" w:line="360" w:lineRule="auto"/>
         <w:jc w:val="both"/>
         <w:rPr>
-          <w:b w:val="1"/>
-          <w:bCs w:val="1"/>
+          <w:b/>
+          <w:bCs/>
           <w:sz w:val="24"/>
           <w:szCs w:val="24"/>
         </w:rPr>
       </w:pPr>
-      <w:r>
-        <w:rPr>
-          <w:rtl w:val="0"/>
-        </w:rPr>
-      </w:r>
     </w:p>
     <w:p>
       <w:pPr>
         <w:spacing w:after="0" w:line="360" w:lineRule="auto"/>
         <w:jc w:val="both"/>
         <w:rPr>
-          <w:b w:val="1"/>
-          <w:bCs w:val="1"/>
+          <w:b/>
+          <w:bCs/>
           <w:sz w:val="24"/>
           <w:szCs w:val="24"/>
         </w:rPr>
       </w:pPr>
-      <w:r>
-        <w:rPr>
-          <w:rtl w:val="0"/>
-        </w:rPr>
-      </w:r>
     </w:p>
     <w:tbl>
       <w:tblPr>
-        <w:tblStyle w:val="Table5"/>
-        <w:tblW w:w="10076.0" w:type="dxa"/>
-        <w:jc w:val="left"/>
+        <w:tblStyle w:val="a3"/>
+        <w:tblW w:w="10076" w:type="dxa"/>
+        <w:tblInd w:w="-1" w:type="dxa"/>
         <w:tblBorders>
-          <w:top w:color="bfbfbf" w:space="0" w:sz="4" w:val="single"/>
-          <w:left w:color="bfbfbf" w:space="0" w:sz="4" w:val="single"/>
-          <w:bottom w:color="bfbfbf" w:space="0" w:sz="4" w:val="single"/>
-          <w:right w:color="bfbfbf" w:space="0" w:sz="4" w:val="single"/>
-          <w:insideH w:color="bfbfbf" w:space="0" w:sz="4" w:val="single"/>
-          <w:insideV w:color="bfbfbf" w:space="0" w:sz="4" w:val="single"/>
+          <w:top w:val="single" w:sz="4" w:space="0" w:color="BFBFBF"/>
+          <w:left w:val="single" w:sz="4" w:space="0" w:color="BFBFBF"/>
+          <w:bottom w:val="single" w:sz="4" w:space="0" w:color="BFBFBF"/>
+          <w:right w:val="single" w:sz="4" w:space="0" w:color="BFBFBF"/>
+          <w:insideH w:val="single" w:sz="4" w:space="0" w:color="BFBFBF"/>
+          <w:insideV w:val="single" w:sz="4" w:space="0" w:color="BFBFBF"/>
         </w:tblBorders>
         <w:tblLayout w:type="fixed"/>
-        <w:tblLook w:val="0400"/>
+        <w:tblLook w:val="0400" w:firstRow="0" w:lastRow="0" w:firstColumn="0" w:lastColumn="0" w:noHBand="0" w:noVBand="1"/>
       </w:tblPr>
       <w:tblGrid>
         <w:gridCol w:w="10076"/>
-        <w:tblGridChange w:id="0">
-          <w:tblGrid>
-            <w:gridCol w:w="10076"/>
-          </w:tblGrid>
-        </w:tblGridChange>
       </w:tblGrid>
       <w:tr>
         <w:trPr>
-          <w:cantSplit w:val="0"/>
-          <w:trHeight w:val="440" w:hRule="atLeast"/>
-          <w:tblHeader w:val="0"/>
+          <w:trHeight w:val="440"/>
         </w:trPr>
         <w:tc>
           <w:tcPr>
+            <w:tcW w:w="10076" w:type="dxa"/>
             <w:vAlign w:val="center"/>
           </w:tcPr>
           <w:p>
             <w:pPr>
               <w:rPr>
-                <w:b w:val="1"/>
-                <w:bCs w:val="1"/>
+                <w:b/>
+                <w:bCs/>
                 <w:color w:val="767171"/>
                 <w:sz w:val="24"/>
                 <w:szCs w:val="24"/>
@@ -801,27 +608,20 @@
               <w:rPr>
                 <w:sz w:val="24"/>
                 <w:szCs w:val="24"/>
-                <w:rtl w:val="0"/>
-              </w:rPr>
-              <w:t xml:space="preserve">3. Hasta el momento:</w:t>
-            </w:r>
-            <w:r>
-              <w:rPr>
-                <w:rtl w:val="0"/>
-              </w:rPr>
+              </w:rPr>
+              <w:t>3. Hasta el momento:</w:t>
             </w:r>
           </w:p>
         </w:tc>
       </w:tr>
       <w:tr>
         <w:trPr>
-          <w:cantSplit w:val="0"/>
-          <w:trHeight w:val="1624" w:hRule="atLeast"/>
-          <w:tblHeader w:val="0"/>
+          <w:trHeight w:val="1624"/>
         </w:trPr>
         <w:tc>
           <w:tcPr>
-            <w:shd w:fill="deeaf6" w:val="clear"/>
+            <w:tcW w:w="10076" w:type="dxa"/>
+            <w:shd w:val="clear" w:color="auto" w:fill="DEEAF6"/>
             <w:vAlign w:val="center"/>
           </w:tcPr>
           <w:p>
@@ -837,87 +637,56 @@
               <w:rPr>
                 <w:sz w:val="24"/>
                 <w:szCs w:val="24"/>
-                <w:rtl w:val="0"/>
               </w:rPr>
               <w:t xml:space="preserve">¿Cómo evalúas tu trabajo? ¿Qué destacas y qué podrías hacer para mejorar tu trabajo? </w:t>
             </w:r>
+          </w:p>
+          <w:p>
+            <w:pPr>
+              <w:jc w:val="both"/>
+              <w:rPr>
+                <w:b/>
+                <w:bCs/>
+                <w:color w:val="1F4E79"/>
+              </w:rPr>
+            </w:pPr>
             <w:r>
               <w:rPr>
-                <w:rtl w:val="0"/>
-              </w:rPr>
+                <w:sz w:val="24"/>
+                <w:szCs w:val="24"/>
+              </w:rPr>
+              <w:t>Evalúo mi trabajo como bueno. Destaco mi aporte en la parte de los bots y la automatización, y también en el frontend y diseño de la página, donde he propuesto mejoras. Para mejorar, podría ser más constante durante la semana y avisar con anticipación al grupo cuando la práctica no me deje avanzar, para que podamos reorganizarnos a tiempo.</w:t>
             </w:r>
           </w:p>
           <w:p>
             <w:pPr>
               <w:jc w:val="both"/>
               <w:rPr>
-                <w:rFonts w:ascii="Calibri" w:cs="Calibri" w:eastAsia="Calibri" w:hAnsi="Calibri"/>
-                <w:b w:val="1"/>
-                <w:bCs w:val="1"/>
-                <w:color w:val="1f4e79"/>
-              </w:rPr>
-            </w:pPr>
-            <w:r>
-              <w:rPr>
-                <w:sz w:val="24"/>
-                <w:szCs w:val="24"/>
-                <w:rtl w:val="0"/>
-              </w:rPr>
-              <w:t xml:space="preserve">Evalúo mi trabajo como bueno. Destaco mi aporte en la parte de los bots y la automatización, y también en el frontend y diseño de la página, donde he propuesto mejoras. Para mejorar, podría ser más constante durante la semana y avisar con anticipación al grupo cuando la práctica no me deje avanzar, para que podamos reorganizarnos a tiempo.</w:t>
-            </w:r>
-            <w:r>
-              <w:rPr>
-                <w:rtl w:val="0"/>
-              </w:rPr>
-            </w:r>
+                <w:b/>
+                <w:bCs/>
+                <w:color w:val="1F4E79"/>
+              </w:rPr>
+            </w:pPr>
           </w:p>
           <w:p>
             <w:pPr>
               <w:jc w:val="both"/>
               <w:rPr>
-                <w:rFonts w:ascii="Calibri" w:cs="Calibri" w:eastAsia="Calibri" w:hAnsi="Calibri"/>
-                <w:b w:val="1"/>
-                <w:bCs w:val="1"/>
-                <w:color w:val="1f4e79"/>
-              </w:rPr>
-            </w:pPr>
-            <w:r>
-              <w:rPr>
-                <w:rtl w:val="0"/>
-              </w:rPr>
-            </w:r>
+                <w:b/>
+                <w:bCs/>
+                <w:color w:val="1F4E79"/>
+              </w:rPr>
+            </w:pPr>
           </w:p>
           <w:p>
             <w:pPr>
               <w:jc w:val="both"/>
               <w:rPr>
-                <w:rFonts w:ascii="Calibri" w:cs="Calibri" w:eastAsia="Calibri" w:hAnsi="Calibri"/>
-                <w:b w:val="1"/>
-                <w:bCs w:val="1"/>
-                <w:color w:val="1f4e79"/>
-              </w:rPr>
-            </w:pPr>
-            <w:r>
-              <w:rPr>
-                <w:rtl w:val="0"/>
-              </w:rPr>
-            </w:r>
-          </w:p>
-          <w:p>
-            <w:pPr>
-              <w:jc w:val="both"/>
-              <w:rPr>
-                <w:rFonts w:ascii="Calibri" w:cs="Calibri" w:eastAsia="Calibri" w:hAnsi="Calibri"/>
-                <w:b w:val="1"/>
-                <w:bCs w:val="1"/>
-                <w:color w:val="1f4e79"/>
-              </w:rPr>
-            </w:pPr>
-            <w:r>
-              <w:rPr>
-                <w:rtl w:val="0"/>
-              </w:rPr>
-            </w:r>
+                <w:b/>
+                <w:bCs/>
+                <w:color w:val="1F4E79"/>
+              </w:rPr>
+            </w:pPr>
           </w:p>
         </w:tc>
       </w:tr>
@@ -932,61 +701,41 @@
           <w:szCs w:val="24"/>
         </w:rPr>
       </w:pPr>
-      <w:r>
-        <w:rPr>
-          <w:rtl w:val="0"/>
-        </w:rPr>
-      </w:r>
     </w:p>
-    <w:p>
-      <w:pPr>
-        <w:rPr/>
-      </w:pPr>
-      <w:r>
-        <w:rPr>
-          <w:rtl w:val="0"/>
-        </w:rPr>
-      </w:r>
-    </w:p>
+    <w:p/>
     <w:tbl>
       <w:tblPr>
-        <w:tblStyle w:val="Table6"/>
-        <w:tblW w:w="10076.0" w:type="dxa"/>
-        <w:jc w:val="left"/>
+        <w:tblStyle w:val="a4"/>
+        <w:tblW w:w="10076" w:type="dxa"/>
+        <w:tblInd w:w="-1" w:type="dxa"/>
         <w:tblBorders>
-          <w:top w:color="bfbfbf" w:space="0" w:sz="4" w:val="single"/>
-          <w:left w:color="bfbfbf" w:space="0" w:sz="4" w:val="single"/>
-          <w:bottom w:color="bfbfbf" w:space="0" w:sz="4" w:val="single"/>
-          <w:right w:color="bfbfbf" w:space="0" w:sz="4" w:val="single"/>
-          <w:insideH w:color="bfbfbf" w:space="0" w:sz="4" w:val="single"/>
-          <w:insideV w:color="bfbfbf" w:space="0" w:sz="4" w:val="single"/>
+          <w:top w:val="single" w:sz="4" w:space="0" w:color="BFBFBF"/>
+          <w:left w:val="single" w:sz="4" w:space="0" w:color="BFBFBF"/>
+          <w:bottom w:val="single" w:sz="4" w:space="0" w:color="BFBFBF"/>
+          <w:right w:val="single" w:sz="4" w:space="0" w:color="BFBFBF"/>
+          <w:insideH w:val="single" w:sz="4" w:space="0" w:color="BFBFBF"/>
+          <w:insideV w:val="single" w:sz="4" w:space="0" w:color="BFBFBF"/>
         </w:tblBorders>
         <w:tblLayout w:type="fixed"/>
-        <w:tblLook w:val="0400"/>
+        <w:tblLook w:val="0400" w:firstRow="0" w:lastRow="0" w:firstColumn="0" w:lastColumn="0" w:noHBand="0" w:noVBand="1"/>
       </w:tblPr>
       <w:tblGrid>
         <w:gridCol w:w="10076"/>
-        <w:tblGridChange w:id="0">
-          <w:tblGrid>
-            <w:gridCol w:w="10076"/>
-          </w:tblGrid>
-        </w:tblGridChange>
       </w:tblGrid>
       <w:tr>
         <w:trPr>
-          <w:cantSplit w:val="0"/>
-          <w:trHeight w:val="440" w:hRule="atLeast"/>
-          <w:tblHeader w:val="0"/>
+          <w:trHeight w:val="440"/>
         </w:trPr>
         <w:tc>
           <w:tcPr>
+            <w:tcW w:w="10076" w:type="dxa"/>
             <w:vAlign w:val="center"/>
           </w:tcPr>
           <w:p>
             <w:pPr>
               <w:rPr>
-                <w:b w:val="1"/>
-                <w:bCs w:val="1"/>
+                <w:b/>
+                <w:bCs/>
                 <w:color w:val="767171"/>
                 <w:sz w:val="24"/>
                 <w:szCs w:val="24"/>
@@ -996,27 +745,20 @@
               <w:rPr>
                 <w:sz w:val="24"/>
                 <w:szCs w:val="24"/>
-                <w:rtl w:val="0"/>
-              </w:rPr>
-              <w:t xml:space="preserve">4. Después de reflexionar sobre el avance de tu Proyecto APT</w:t>
-            </w:r>
-            <w:r>
-              <w:rPr>
-                <w:rtl w:val="0"/>
-              </w:rPr>
+              </w:rPr>
+              <w:t>4. Después de reflexionar sobre el avance de tu Proyecto APT</w:t>
             </w:r>
           </w:p>
         </w:tc>
       </w:tr>
       <w:tr>
         <w:trPr>
-          <w:cantSplit w:val="0"/>
-          <w:trHeight w:val="1639" w:hRule="atLeast"/>
-          <w:tblHeader w:val="0"/>
+          <w:trHeight w:val="1639"/>
         </w:trPr>
         <w:tc>
           <w:tcPr>
-            <w:shd w:fill="deeaf6" w:val="clear"/>
+            <w:tcW w:w="10076" w:type="dxa"/>
+            <w:shd w:val="clear" w:color="auto" w:fill="DEEAF6"/>
             <w:vAlign w:val="center"/>
           </w:tcPr>
           <w:p>
@@ -1032,103 +774,66 @@
               <w:rPr>
                 <w:sz w:val="24"/>
                 <w:szCs w:val="24"/>
-                <w:rtl w:val="0"/>
-              </w:rPr>
-              <w:t xml:space="preserve">¿Qué inquietudes te quedan sobre cómo proceder? ¿Qué pregunta te gustaría hacerle a tu docente o a tus pares?</w:t>
+              </w:rPr>
+              <w:t>¿Qué inquietudes te quedan sobre cómo proceder? ¿Qué pregunta te gustaría hacerle a tu docente o a tus pares?</w:t>
             </w:r>
+          </w:p>
+          <w:p>
+            <w:pPr>
+              <w:jc w:val="both"/>
+              <w:rPr>
+                <w:b/>
+                <w:bCs/>
+                <w:color w:val="1F4E79"/>
+              </w:rPr>
+            </w:pPr>
             <w:r>
               <w:rPr>
-                <w:rtl w:val="0"/>
-              </w:rPr>
+                <w:sz w:val="24"/>
+                <w:szCs w:val="24"/>
+              </w:rPr>
+              <w:t>Me quedan algunas dudas sobre cómo proceder. Al docente le preguntaría si el cambio de alcance (quitar la implementación de Power BI porque el cliente no quiere una página tan enfocada al e-commerce) afecta la evaluación, cómo debe ser el formato de la entrega final (qué se presenta y de qué forma) y cuáles son las fechas de evaluación que vienen.</w:t>
             </w:r>
           </w:p>
           <w:p>
             <w:pPr>
               <w:jc w:val="both"/>
               <w:rPr>
-                <w:rFonts w:ascii="Calibri" w:cs="Calibri" w:eastAsia="Calibri" w:hAnsi="Calibri"/>
-                <w:b w:val="1"/>
-                <w:bCs w:val="1"/>
-                <w:color w:val="1f4e79"/>
-              </w:rPr>
-            </w:pPr>
-            <w:r>
-              <w:rPr>
-                <w:sz w:val="24"/>
-                <w:szCs w:val="24"/>
-                <w:rtl w:val="0"/>
-              </w:rPr>
-              <w:t xml:space="preserve">Me quedan algunas dudas sobre cómo proceder. Al docente le preguntaría si el cambio de alcance (quitar la implementación de Power BI porque el cliente no quiere una página tan enfocada al e-commerce) afecta la evaluación, cómo debe ser el formato de la entrega final (qué se presenta y de qué forma) y cuáles son las fechas de evaluación que vienen.</w:t>
-            </w:r>
-            <w:r>
-              <w:rPr>
-                <w:rtl w:val="0"/>
-              </w:rPr>
-            </w:r>
+                <w:b/>
+                <w:bCs/>
+                <w:color w:val="1F4E79"/>
+              </w:rPr>
+            </w:pPr>
           </w:p>
           <w:p>
             <w:pPr>
               <w:jc w:val="both"/>
               <w:rPr>
-                <w:rFonts w:ascii="Calibri" w:cs="Calibri" w:eastAsia="Calibri" w:hAnsi="Calibri"/>
-                <w:b w:val="1"/>
-                <w:bCs w:val="1"/>
-                <w:color w:val="1f4e79"/>
-              </w:rPr>
-            </w:pPr>
-            <w:r>
-              <w:rPr>
-                <w:rtl w:val="0"/>
-              </w:rPr>
-            </w:r>
+                <w:b/>
+                <w:bCs/>
+                <w:color w:val="1F4E79"/>
+              </w:rPr>
+            </w:pPr>
           </w:p>
           <w:p>
             <w:pPr>
               <w:jc w:val="both"/>
               <w:rPr>
-                <w:rFonts w:ascii="Calibri" w:cs="Calibri" w:eastAsia="Calibri" w:hAnsi="Calibri"/>
-                <w:b w:val="1"/>
-                <w:bCs w:val="1"/>
-                <w:color w:val="1f4e79"/>
-              </w:rPr>
-            </w:pPr>
-            <w:r>
-              <w:rPr>
-                <w:rtl w:val="0"/>
-              </w:rPr>
-            </w:r>
+                <w:b/>
+                <w:bCs/>
+                <w:color w:val="1F4E79"/>
+              </w:rPr>
+            </w:pPr>
           </w:p>
           <w:p>
             <w:pPr>
               <w:jc w:val="both"/>
               <w:rPr>
-                <w:rFonts w:ascii="Calibri" w:cs="Calibri" w:eastAsia="Calibri" w:hAnsi="Calibri"/>
-                <w:b w:val="1"/>
-                <w:bCs w:val="1"/>
-                <w:color w:val="1f4e79"/>
-              </w:rPr>
-            </w:pPr>
-            <w:r>
-              <w:rPr>
-                <w:rtl w:val="0"/>
-              </w:rPr>
-            </w:r>
-          </w:p>
-          <w:p>
-            <w:pPr>
-              <w:jc w:val="both"/>
-              <w:rPr>
-                <w:rFonts w:ascii="Calibri" w:cs="Calibri" w:eastAsia="Calibri" w:hAnsi="Calibri"/>
-                <w:b w:val="1"/>
-                <w:bCs w:val="1"/>
-                <w:color w:val="1f4e79"/>
-              </w:rPr>
-            </w:pPr>
-            <w:r>
-              <w:rPr>
-                <w:rtl w:val="0"/>
-              </w:rPr>
-            </w:r>
+                <w:b/>
+                <w:bCs/>
+                <w:color w:val="1F4E79"/>
+              </w:rPr>
+            </w:pPr>
           </w:p>
         </w:tc>
       </w:tr>
@@ -1143,68 +848,52 @@
           <w:szCs w:val="24"/>
         </w:rPr>
       </w:pPr>
-      <w:r>
-        <w:rPr>
-          <w:rtl w:val="0"/>
-        </w:rPr>
-      </w:r>
     </w:p>
     <w:p>
       <w:pPr>
         <w:spacing w:after="0" w:line="360" w:lineRule="auto"/>
         <w:jc w:val="both"/>
         <w:rPr>
-          <w:b w:val="1"/>
-          <w:bCs w:val="1"/>
+          <w:b/>
+          <w:bCs/>
           <w:sz w:val="24"/>
           <w:szCs w:val="24"/>
         </w:rPr>
       </w:pPr>
-      <w:r>
-        <w:rPr>
-          <w:rtl w:val="0"/>
-        </w:rPr>
-      </w:r>
     </w:p>
     <w:tbl>
       <w:tblPr>
-        <w:tblStyle w:val="Table7"/>
-        <w:tblW w:w="10076.0" w:type="dxa"/>
-        <w:jc w:val="left"/>
+        <w:tblStyle w:val="a5"/>
+        <w:tblW w:w="10076" w:type="dxa"/>
+        <w:tblInd w:w="-1" w:type="dxa"/>
         <w:tblBorders>
-          <w:top w:color="bfbfbf" w:space="0" w:sz="4" w:val="single"/>
-          <w:left w:color="bfbfbf" w:space="0" w:sz="4" w:val="single"/>
-          <w:bottom w:color="bfbfbf" w:space="0" w:sz="4" w:val="single"/>
-          <w:right w:color="bfbfbf" w:space="0" w:sz="4" w:val="single"/>
-          <w:insideH w:color="bfbfbf" w:space="0" w:sz="4" w:val="single"/>
-          <w:insideV w:color="bfbfbf" w:space="0" w:sz="4" w:val="single"/>
+          <w:top w:val="single" w:sz="4" w:space="0" w:color="BFBFBF"/>
+          <w:left w:val="single" w:sz="4" w:space="0" w:color="BFBFBF"/>
+          <w:bottom w:val="single" w:sz="4" w:space="0" w:color="BFBFBF"/>
+          <w:right w:val="single" w:sz="4" w:space="0" w:color="BFBFBF"/>
+          <w:insideH w:val="single" w:sz="4" w:space="0" w:color="BFBFBF"/>
+          <w:insideV w:val="single" w:sz="4" w:space="0" w:color="BFBFBF"/>
         </w:tblBorders>
         <w:tblLayout w:type="fixed"/>
-        <w:tblLook w:val="0400"/>
+        <w:tblLook w:val="0400" w:firstRow="0" w:lastRow="0" w:firstColumn="0" w:lastColumn="0" w:noHBand="0" w:noVBand="1"/>
       </w:tblPr>
       <w:tblGrid>
         <w:gridCol w:w="10076"/>
-        <w:tblGridChange w:id="0">
-          <w:tblGrid>
-            <w:gridCol w:w="10076"/>
-          </w:tblGrid>
-        </w:tblGridChange>
       </w:tblGrid>
       <w:tr>
         <w:trPr>
-          <w:cantSplit w:val="0"/>
-          <w:trHeight w:val="440" w:hRule="atLeast"/>
-          <w:tblHeader w:val="0"/>
+          <w:trHeight w:val="440"/>
         </w:trPr>
         <w:tc>
           <w:tcPr>
+            <w:tcW w:w="10076" w:type="dxa"/>
             <w:vAlign w:val="center"/>
           </w:tcPr>
           <w:p>
             <w:pPr>
               <w:rPr>
-                <w:b w:val="1"/>
-                <w:bCs w:val="1"/>
+                <w:b/>
+                <w:bCs/>
                 <w:color w:val="767171"/>
                 <w:sz w:val="24"/>
                 <w:szCs w:val="24"/>
@@ -1214,27 +903,20 @@
               <w:rPr>
                 <w:sz w:val="24"/>
                 <w:szCs w:val="24"/>
-                <w:rtl w:val="0"/>
-              </w:rPr>
-              <w:t xml:space="preserve">5. A partir de esta instancia de monitoreo de su Proyecto APT</w:t>
-            </w:r>
-            <w:r>
-              <w:rPr>
-                <w:rtl w:val="0"/>
-              </w:rPr>
+              </w:rPr>
+              <w:t>5. A partir de esta instancia de monitoreo de su Proyecto APT</w:t>
             </w:r>
           </w:p>
         </w:tc>
       </w:tr>
       <w:tr>
         <w:trPr>
-          <w:cantSplit w:val="0"/>
-          <w:trHeight w:val="1639" w:hRule="atLeast"/>
-          <w:tblHeader w:val="0"/>
+          <w:trHeight w:val="1639"/>
         </w:trPr>
         <w:tc>
           <w:tcPr>
-            <w:shd w:fill="deeaf6" w:val="clear"/>
+            <w:tcW w:w="10076" w:type="dxa"/>
+            <w:shd w:val="clear" w:color="auto" w:fill="DEEAF6"/>
             <w:vAlign w:val="center"/>
           </w:tcPr>
           <w:p>
@@ -1250,14 +932,25 @@
               <w:rPr>
                 <w:sz w:val="24"/>
                 <w:szCs w:val="24"/>
-                <w:rtl w:val="0"/>
-              </w:rPr>
-              <w:t xml:space="preserve">¿Consideran que las actividades deben ser redistribuidas entre los miembros del grupo? ¿Hay nuevas actividades que deban ser asignadas a algún miembro del grupo?</w:t>
+              </w:rPr>
+              <w:t>¿Consideran que las actividades deben ser redistribuidas entre los miembros del grupo? ¿Hay nuevas actividades que deban ser asignadas a algún miembro del grupo?</w:t>
             </w:r>
+          </w:p>
+          <w:p>
+            <w:pPr>
+              <w:jc w:val="both"/>
+              <w:rPr>
+                <w:color w:val="767171"/>
+                <w:sz w:val="24"/>
+                <w:szCs w:val="24"/>
+              </w:rPr>
+            </w:pPr>
             <w:r>
               <w:rPr>
-                <w:rtl w:val="0"/>
-              </w:rPr>
+                <w:sz w:val="24"/>
+                <w:szCs w:val="24"/>
+              </w:rPr>
+              <w:t>No creo que sea necesario redistribuir las actividades, ya que en la carta Gantt quedaron bien asignadas y yo sigo a cargo de los bots y parte del frontend. No hay nuevas actividades; al contrario, se retira la implementación de Power BI para los dashboards de ganancias, porque el cliente prefiere que la página no esté tan enfocada al e-commerce.</w:t>
             </w:r>
           </w:p>
           <w:p>
@@ -1269,19 +962,6 @@
                 <w:szCs w:val="24"/>
               </w:rPr>
             </w:pPr>
-            <w:r>
-              <w:rPr>
-                <w:sz w:val="24"/>
-                <w:szCs w:val="24"/>
-                <w:rtl w:val="0"/>
-              </w:rPr>
-              <w:t xml:space="preserve">No creo que sea necesario redistribuir las actividades, ya que en la carta Gantt quedaron bien asignadas y yo sigo a cargo de los bots y parte del frontend. No hay nuevas actividades; al contrario, se retira la implementación de Power BI para los dashboards de ganancias, porque el cliente prefiere que la página no esté tan enfocada al e-commerce.</w:t>
-            </w:r>
-            <w:r>
-              <w:rPr>
-                <w:rtl w:val="0"/>
-              </w:rPr>
-            </w:r>
           </w:p>
           <w:p>
             <w:pPr>
@@ -1292,42 +972,16 @@
                 <w:szCs w:val="24"/>
               </w:rPr>
             </w:pPr>
-            <w:r>
-              <w:rPr>
-                <w:rtl w:val="0"/>
-              </w:rPr>
-            </w:r>
           </w:p>
           <w:p>
             <w:pPr>
               <w:jc w:val="both"/>
               <w:rPr>
-                <w:color w:val="767171"/>
-                <w:sz w:val="24"/>
-                <w:szCs w:val="24"/>
-              </w:rPr>
-            </w:pPr>
-            <w:r>
-              <w:rPr>
-                <w:rtl w:val="0"/>
-              </w:rPr>
-            </w:r>
-          </w:p>
-          <w:p>
-            <w:pPr>
-              <w:jc w:val="both"/>
-              <w:rPr>
-                <w:rFonts w:ascii="Calibri" w:cs="Calibri" w:eastAsia="Calibri" w:hAnsi="Calibri"/>
-                <w:b w:val="1"/>
-                <w:bCs w:val="1"/>
-                <w:color w:val="1f4e79"/>
-              </w:rPr>
-            </w:pPr>
-            <w:r>
-              <w:rPr>
-                <w:rtl w:val="0"/>
-              </w:rPr>
-            </w:r>
+                <w:b/>
+                <w:bCs/>
+                <w:color w:val="1F4E79"/>
+              </w:rPr>
+            </w:pPr>
           </w:p>
         </w:tc>
       </w:tr>
@@ -1342,100 +996,77 @@
           <w:szCs w:val="24"/>
         </w:rPr>
       </w:pPr>
-      <w:r>
-        <w:rPr>
-          <w:rtl w:val="0"/>
-        </w:rPr>
-      </w:r>
     </w:p>
     <w:p>
       <w:pPr>
         <w:spacing w:after="0" w:line="360" w:lineRule="auto"/>
         <w:jc w:val="both"/>
         <w:rPr>
-          <w:b w:val="1"/>
-          <w:bCs w:val="1"/>
+          <w:b/>
+          <w:bCs/>
           <w:sz w:val="24"/>
           <w:szCs w:val="24"/>
         </w:rPr>
       </w:pPr>
-      <w:r>
-        <w:rPr>
-          <w:rtl w:val="0"/>
-        </w:rPr>
-      </w:r>
     </w:p>
     <w:tbl>
       <w:tblPr>
-        <w:tblStyle w:val="Table8"/>
-        <w:tblW w:w="10076.0" w:type="dxa"/>
-        <w:jc w:val="left"/>
+        <w:tblStyle w:val="a6"/>
+        <w:tblW w:w="10076" w:type="dxa"/>
+        <w:tblInd w:w="0" w:type="dxa"/>
         <w:tblBorders>
-          <w:top w:color="bfbfbf" w:space="0" w:sz="4" w:val="single"/>
-          <w:left w:color="bfbfbf" w:space="0" w:sz="4" w:val="single"/>
-          <w:bottom w:color="bfbfbf" w:space="0" w:sz="4" w:val="single"/>
-          <w:right w:color="bfbfbf" w:space="0" w:sz="4" w:val="single"/>
-          <w:insideH w:color="bfbfbf" w:space="0" w:sz="4" w:val="single"/>
-          <w:insideV w:color="bfbfbf" w:space="0" w:sz="4" w:val="single"/>
+          <w:top w:val="single" w:sz="4" w:space="0" w:color="BFBFBF"/>
+          <w:left w:val="single" w:sz="4" w:space="0" w:color="BFBFBF"/>
+          <w:bottom w:val="single" w:sz="4" w:space="0" w:color="BFBFBF"/>
+          <w:right w:val="single" w:sz="4" w:space="0" w:color="BFBFBF"/>
+          <w:insideH w:val="single" w:sz="4" w:space="0" w:color="BFBFBF"/>
+          <w:insideV w:val="single" w:sz="4" w:space="0" w:color="BFBFBF"/>
         </w:tblBorders>
         <w:tblLayout w:type="fixed"/>
-        <w:tblLook w:val="0400"/>
+        <w:tblLook w:val="0400" w:firstRow="0" w:lastRow="0" w:firstColumn="0" w:lastColumn="0" w:noHBand="0" w:noVBand="1"/>
       </w:tblPr>
       <w:tblGrid>
         <w:gridCol w:w="10076"/>
-        <w:tblGridChange w:id="0">
-          <w:tblGrid>
-            <w:gridCol w:w="10076"/>
-          </w:tblGrid>
-        </w:tblGridChange>
       </w:tblGrid>
       <w:tr>
         <w:trPr>
-          <w:cantSplit w:val="0"/>
-          <w:trHeight w:val="440" w:hRule="atLeast"/>
-          <w:tblHeader w:val="0"/>
+          <w:trHeight w:val="440"/>
         </w:trPr>
         <w:tc>
           <w:tcPr>
+            <w:tcW w:w="10076" w:type="dxa"/>
             <w:vAlign w:val="center"/>
           </w:tcPr>
           <w:p>
             <w:pPr>
               <w:rPr>
-                <w:b w:val="1"/>
-                <w:bCs w:val="1"/>
+                <w:b/>
+                <w:bCs/>
                 <w:color w:val="767171"/>
                 <w:sz w:val="24"/>
                 <w:szCs w:val="24"/>
               </w:rPr>
             </w:pPr>
-            <w:bookmarkStart w:colFirst="0" w:colLast="0" w:name="_heading=h.hi4klhq56d6v" w:id="0"/>
+            <w:bookmarkStart w:id="0" w:name="_heading=h.hi4klhq56d6v" w:colFirst="0" w:colLast="0"/>
             <w:bookmarkEnd w:id="0"/>
             <w:r>
               <w:rPr>
                 <w:sz w:val="24"/>
                 <w:szCs w:val="24"/>
-                <w:rtl w:val="0"/>
-              </w:rPr>
-              <w:t xml:space="preserve">6. APT  grupal</w:t>
-            </w:r>
-            <w:r>
-              <w:rPr>
-                <w:rtl w:val="0"/>
-              </w:rPr>
+              </w:rPr>
+              <w:t>6. APT  grupal</w:t>
             </w:r>
           </w:p>
         </w:tc>
       </w:tr>
       <w:tr>
         <w:trPr>
-          <w:cantSplit w:val="0"/>
-          <w:trHeight w:val="1639" w:hRule="atLeast"/>
-          <w:tblHeader w:val="0"/>
+          <w:trHeight w:val="1639"/>
         </w:trPr>
         <w:tc>
           <w:tcPr>
-            <w:shd w:fill="deeaf6" w:val="clear"/>
+            <w:tcW w:w="10076" w:type="dxa"/>
+            <w:shd w:val="clear" w:color="auto" w:fill="DEEAF6"/>
             <w:vAlign w:val="center"/>
           </w:tcPr>
           <w:p>
@@ -1451,37 +1082,39 @@
               <w:rPr>
                 <w:sz w:val="24"/>
                 <w:szCs w:val="24"/>
-                <w:rtl w:val="0"/>
-              </w:rPr>
-              <w:t xml:space="preserve">¿Cómo evalúan el trabajo en grupo? ¿Qué aspectos positivos destacan? ¿Qué aspectos podrían mejorar?</w:t>
+              </w:rPr>
+              <w:t>¿Cómo evalúan el trabajo en grupo? ¿Qué aspectos positivos destacan? ¿Qué aspectos podrían mejorar?</w:t>
+            </w:r>
+          </w:p>
+          <w:p>
+            <w:pPr>
+              <w:jc w:val="both"/>
+              <w:rPr>
+                <w:color w:val="767171"/>
+                <w:sz w:val="24"/>
+                <w:szCs w:val="24"/>
+              </w:rPr>
+            </w:pPr>
+            <w:r>
+              <w:rPr>
+                <w:sz w:val="24"/>
+                <w:szCs w:val="24"/>
+              </w:rPr>
+              <w:t xml:space="preserve">Evalúo el trabajo en grupo de forma muy positiva. </w:t>
             </w:r>
             <w:r>
               <w:rPr>
-                <w:rtl w:val="0"/>
-              </w:rPr>
-            </w:r>
-          </w:p>
-          <w:p>
-            <w:pPr>
-              <w:jc w:val="both"/>
-              <w:rPr>
-                <w:color w:val="767171"/>
-                <w:sz w:val="24"/>
-                <w:szCs w:val="24"/>
-              </w:rPr>
-            </w:pPr>
-            <w:r>
-              <w:rPr>
-                <w:sz w:val="24"/>
-                <w:szCs w:val="24"/>
-                <w:rtl w:val="0"/>
-              </w:rPr>
-              <w:t xml:space="preserve">Evalúo el trabajo en grupo de forma muy positiva. Destacó la responsabilidad y disposición de mis compañeros, considerando que todos estamos haciendo la práctica al mismo tiempo. Lo que podríamos mejorar es la comunicación, ya que hay días en que no hablamos del proyecto; sería bueno definir una reunión corta semanal para revisar avances.</w:t>
+                <w:sz w:val="24"/>
+                <w:szCs w:val="24"/>
+              </w:rPr>
+              <w:t>Destaco la responsabilidad</w:t>
             </w:r>
             <w:r>
               <w:rPr>
-                <w:rtl w:val="0"/>
-              </w:rPr>
+                <w:sz w:val="24"/>
+                <w:szCs w:val="24"/>
+              </w:rPr>
+              <w:t xml:space="preserve"> y disposición de mis compañeros, considerando que todos estamos haciendo la práctica al mismo tiempo. Lo que podríamos mejorar es la comunicación, ya que hay días en que no hablamos del proyecto; sería bueno definir una reunión corta semanal para revisar avances.</w:t>
             </w:r>
           </w:p>
           <w:p>
@@ -1493,11 +1126,6 @@
                 <w:szCs w:val="24"/>
               </w:rPr>
             </w:pPr>
-            <w:r>
-              <w:rPr>
-                <w:rtl w:val="0"/>
-              </w:rPr>
-            </w:r>
           </w:p>
           <w:p>
             <w:pPr>
@@ -1508,11 +1136,6 @@
                 <w:szCs w:val="24"/>
               </w:rPr>
             </w:pPr>
-            <w:r>
-              <w:rPr>
-                <w:rtl w:val="0"/>
-              </w:rPr>
-            </w:r>
           </w:p>
           <w:p>
             <w:pPr>
@@ -1523,27 +1146,16 @@
                 <w:szCs w:val="24"/>
               </w:rPr>
             </w:pPr>
-            <w:r>
-              <w:rPr>
-                <w:rtl w:val="0"/>
-              </w:rPr>
-            </w:r>
           </w:p>
           <w:p>
             <w:pPr>
               <w:jc w:val="both"/>
               <w:rPr>
-                <w:rFonts w:ascii="Calibri" w:cs="Calibri" w:eastAsia="Calibri" w:hAnsi="Calibri"/>
-                <w:b w:val="1"/>
-                <w:bCs w:val="1"/>
-                <w:color w:val="1f4e79"/>
-              </w:rPr>
-            </w:pPr>
-            <w:r>
-              <w:rPr>
-                <w:rtl w:val="0"/>
-              </w:rPr>
-            </w:r>
+                <w:b/>
+                <w:bCs/>
+                <w:color w:val="1F4E79"/>
+              </w:rPr>
+            </w:pPr>
           </w:p>
         </w:tc>
       </w:tr>
@@ -1558,90 +1170,85 @@
           <w:szCs w:val="24"/>
         </w:rPr>
       </w:pPr>
-      <w:r>
-        <w:rPr>
-          <w:rtl w:val="0"/>
-        </w:rPr>
-      </w:r>
     </w:p>
     <w:p>
       <w:pPr>
         <w:spacing w:after="0" w:line="360" w:lineRule="auto"/>
         <w:jc w:val="both"/>
         <w:rPr>
-          <w:b w:val="1"/>
-          <w:bCs w:val="1"/>
+          <w:b/>
+          <w:bCs/>
           <w:sz w:val="24"/>
           <w:szCs w:val="24"/>
         </w:rPr>
       </w:pPr>
-      <w:r>
-        <w:rPr>
-          <w:rtl w:val="0"/>
-        </w:rPr>
-      </w:r>
     </w:p>
     <w:sectPr>
-      <w:headerReference r:id="rId8" w:type="default"/>
-      <w:headerReference r:id="rId9" w:type="first"/>
-      <w:footerReference r:id="rId10" w:type="default"/>
-      <w:pgSz w:h="15840" w:w="12240" w:orient="portrait"/>
-      <w:pgMar w:bottom="1134" w:top="1440" w:left="1077" w:right="1077" w:header="567" w:footer="465"/>
+      <w:headerReference w:type="default" r:id="rId8"/>
+      <w:footerReference w:type="default" r:id="rId9"/>
+      <w:headerReference w:type="first" r:id="rId10"/>
+      <w:pgSz w:w="12240" w:h="15840"/>
+      <w:pgMar w:top="1440" w:right="1077" w:bottom="1134" w:left="1077" w:header="567" w:footer="465" w:gutter="0"/>
       <w:pgNumType w:start="0"/>
+      <w:cols w:space="720"/>
     </w:sectPr>
   </w:body>
 </w:document>
 </file>
 
+<file path=word/endnotes.xml><?xml version="1.0" encoding="utf-8"?>
+<w:endnotes xmlns:wpc="http://schemas.microsoft.com/office/word/2010/wordprocessingCanvas" xmlns:cx="http://schemas.microsoft.com/office/drawing/2014/chartex" xmlns:cx1="http://schemas.microsoft.com/office/drawing/2015/9/8/chartex" xmlns:cx2="http://schemas.microsoft.com/office/drawing/2015/10/21/chartex" xmlns:cx3="http://schemas.microsoft.com/office/drawing/2016/5/9/chartex" xmlns:cx4="http://schemas.microsoft.com/office/drawing/2016/5/10/chartex" xmlns:cx5="http://schemas.microsoft.com/office/drawing/2016/5/11/chartex" xmlns:cx6="http://schemas.microsoft.com/office/drawing/2016/5/12/chartex" xmlns:cx7="http://schemas.microsoft.com/office/drawing/2016/5/13/chartex" xmlns:cx8="http://schemas.microsoft.com/office/drawing/2016/5/14/chartex" xmlns:mc="http://schemas.openxmlformats.org/markup-compatibility/2006" xmlns:aink="http://schemas.microsoft.com/office/drawing/2016/ink" xmlns:am3d="http://schemas.microsoft.com/office/drawing/2017/model3d" xmlns:o="urn:schemas-microsoft-com:office:office" xmlns:oel="http://schemas.microsoft.com/office/2019/extlst" xmlns:r="http://schemas.openxmlformats.org/officeDocument/2006/relationships" xmlns:m="http://schemas.openxmlformats.org/officeDocument/2006/math" xmlns:v="urn:schemas-microsoft-com:vml" xmlns:wp14="http://schemas.microsoft.com/office/word/2010/wordprocessingDrawing" xmlns:wp="http://schemas.openxmlformats.org/drawingml/2006/wordprocessingDrawing" xmlns:w10="urn:schemas-microsoft-com:office:word" xmlns:w="http://schemas.openxmlformats.org/wordprocessingml/2006/main" xmlns:w14="http://schemas.microsoft.com/office/word/2010/wordml" xmlns:w15="http://schemas.microsoft.com/office/word/2012/wordml" xmlns:w16cex="http://schemas.microsoft.com/office/word/2018/wordml/cex" xmlns:w16cid="http://schemas.microsoft.com/office/word/2016/wordml/cid" xmlns:w16="http://schemas.microsoft.com/office/word/2018/wordml" xmlns:w16du="http://schemas.microsoft.com/office/word/2023/wordml/word16du" xmlns:w16sdtdh="http://schemas.microsoft.com/office/word/2020/wordml/sdtdatahash" xmlns:w16sdtfl="http://schemas.microsoft.com/office/word/2024/wordml/sdtformatlock" xmlns:w16se="http://schemas.microsoft.com/office/word/2015/wordml/symex" xmlns:wpg="http://schemas.microsoft.com/office/word/2010/wordprocessingGroup" xmlns:wpi="http://schemas.microsoft.com/office/word/2010/wordprocessingInk" xmlns:wne="http://schemas.microsoft.com/office/word/2006/wordml" xmlns:wps="http://schemas.microsoft.com/office/word/2010/wordprocessingShape" mc:Ignorable="w14 w15 w16se w16cid w16 w16cex w16sdtdh w16sdtfl w16du wp14">
+  <w:endnote w:type="separator" w:id="-1">
+    <w:p>
+      <w:pPr>
+        <w:spacing w:after="0" w:line="240" w:lineRule="auto"/>
+      </w:pPr>
+      <w:r>
+        <w:separator/>
+      </w:r>
+    </w:p>
+  </w:endnote>
+  <w:endnote w:type="continuationSeparator" w:id="0">
+    <w:p>
+      <w:pPr>
+        <w:spacing w:after="0" w:line="240" w:lineRule="auto"/>
+      </w:pPr>
+      <w:r>
+        <w:continuationSeparator/>
+      </w:r>
+    </w:p>
+  </w:endnote>
+</w:endnotes>
+</file>
+
 <file path=word/footer1.xml><?xml version="1.0" encoding="utf-8"?>
-<w:ftr xmlns:mc="http://schemas.openxmlformats.org/markup-compatibility/2006" xmlns:o="urn:schemas-microsoft-com:office:office" xmlns:r="http://schemas.openxmlformats.org/officeDocument/2006/relationships" xmlns:m="http://schemas.openxmlformats.org/officeDocument/2006/math" xmlns:v="urn:schemas-microsoft-com:vml" xmlns:wp="http://schemas.openxmlformats.org/drawingml/2006/wordprocessingDrawing" xmlns:w10="urn:schemas-microsoft-com:office:word" xmlns:w="http://schemas.openxmlformats.org/wordprocessingml/2006/main" xmlns:wne="http://schemas.microsoft.com/office/word/2006/wordml" xmlns:sl="http://schemas.openxmlformats.org/schemaLibrary/2006/main" xmlns:a="http://schemas.openxmlformats.org/drawingml/2006/main" xmlns:pic="http://schemas.openxmlformats.org/drawingml/2006/picture" xmlns:c="http://schemas.openxmlformats.org/drawingml/2006/chart" xmlns:lc="http://schemas.openxmlformats.org/drawingml/2006/lockedCanvas" xmlns:dgm="http://schemas.openxmlformats.org/drawingml/2006/diagram" xmlns:wps="http://schemas.microsoft.com/office/word/2010/wordprocessingShape" xmlns:wpg="http://schemas.microsoft.com/office/word/2010/wordprocessingGroup" xmlns:w14="http://schemas.microsoft.com/office/word/2010/wordml" xmlns:w15="http://schemas.microsoft.com/office/word/2012/wordml" xmlns:w16="http://schemas.microsoft.com/office/word/2018/wordml" xmlns:w16cex="http://schemas.microsoft.com/office/word/2018/wordml/cex" xmlns:w16cid="http://schemas.microsoft.com/office/word/2016/wordml/cid" xmlns="http://schemas.microsoft.com/office/tasks/2019/documenttasks" xmlns:cr="http://schemas.microsoft.com/office/comments/2020/reactions">
+<w:ftr xmlns:wpc="http://schemas.microsoft.com/office/word/2010/wordprocessingCanvas" xmlns:cx="http://schemas.microsoft.com/office/drawing/2014/chartex" xmlns:cx1="http://schemas.microsoft.com/office/drawing/2015/9/8/chartex" xmlns:cx2="http://schemas.microsoft.com/office/drawing/2015/10/21/chartex" xmlns:cx3="http://schemas.microsoft.com/office/drawing/2016/5/9/chartex" xmlns:cx4="http://schemas.microsoft.com/office/drawing/2016/5/10/chartex" xmlns:cx5="http://schemas.microsoft.com/office/drawing/2016/5/11/chartex" xmlns:cx6="http://schemas.microsoft.com/office/drawing/2016/5/12/chartex" xmlns:cx7="http://schemas.microsoft.com/office/drawing/2016/5/13/chartex" xmlns:cx8="http://schemas.microsoft.com/office/drawing/2016/5/14/chartex" xmlns:mc="http://schemas.openxmlformats.org/markup-compatibility/2006" xmlns:aink="http://schemas.microsoft.com/office/drawing/2016/ink" xmlns:am3d="http://schemas.microsoft.com/office/drawing/2017/model3d" xmlns:o="urn:schemas-microsoft-com:office:office" xmlns:oel="http://schemas.microsoft.com/office/2019/extlst" xmlns:r="http://schemas.openxmlformats.org/officeDocument/2006/relationships" xmlns:m="http://schemas.openxmlformats.org/officeDocument/2006/math" xmlns:v="urn:schemas-microsoft-com:vml" xmlns:wp14="http://schemas.microsoft.com/office/word/2010/wordprocessingDrawing" xmlns:wp="http://schemas.openxmlformats.org/drawingml/2006/wordprocessingDrawing" xmlns:w10="urn:schemas-microsoft-com:office:word" xmlns:w="http://schemas.openxmlformats.org/wordprocessingml/2006/main" xmlns:w14="http://schemas.microsoft.com/office/word/2010/wordml" xmlns:w15="http://schemas.microsoft.com/office/word/2012/wordml" xmlns:w16cex="http://schemas.microsoft.com/office/word/2018/wordml/cex" xmlns:w16cid="http://schemas.microsoft.com/office/word/2016/wordml/cid" xmlns:w16="http://schemas.microsoft.com/office/word/2018/wordml" xmlns:w16du="http://schemas.microsoft.com/office/word/2023/wordml/word16du" xmlns:w16sdtdh="http://schemas.microsoft.com/office/word/2020/wordml/sdtdatahash" xmlns:w16sdtfl="http://schemas.microsoft.com/office/word/2024/wordml/sdtformatlock" xmlns:w16se="http://schemas.microsoft.com/office/word/2015/wordml/symex" xmlns:wpg="http://schemas.microsoft.com/office/word/2010/wordprocessingGroup" xmlns:wpi="http://schemas.microsoft.com/office/word/2010/wordprocessingInk" xmlns:wne="http://schemas.microsoft.com/office/word/2006/wordml" xmlns:wps="http://schemas.microsoft.com/office/word/2010/wordprocessingShape" mc:Ignorable="w14 w15 w16se w16cid w16 w16cex w16sdtdh w16sdtfl w16du wp14">
   <w:p>
     <w:pPr>
-      <w:keepNext w:val="0"/>
-      <w:keepLines w:val="0"/>
-      <w:pageBreakBefore w:val="0"/>
-      <w:widowControl w:val="1"/>
       <w:pBdr>
-        <w:top w:space="0" w:sz="0" w:val="nil"/>
-        <w:left w:space="0" w:sz="0" w:val="nil"/>
-        <w:bottom w:space="0" w:sz="0" w:val="nil"/>
-        <w:right w:space="0" w:sz="0" w:val="nil"/>
-        <w:between w:space="0" w:sz="0" w:val="nil"/>
+        <w:top w:val="nil"/>
+        <w:left w:val="nil"/>
+        <w:bottom w:val="nil"/>
+        <w:right w:val="nil"/>
+        <w:between w:val="nil"/>
       </w:pBdr>
-      <w:shd w:fill="auto" w:val="clear"/>
       <w:tabs>
-        <w:tab w:val="center" w:leader="none" w:pos="4419"/>
-        <w:tab w:val="right" w:leader="none" w:pos="8838"/>
+        <w:tab w:val="center" w:pos="4419"/>
+        <w:tab w:val="right" w:pos="8838"/>
       </w:tabs>
-      <w:spacing w:after="0" w:before="0" w:line="240" w:lineRule="auto"/>
-      <w:ind w:left="0" w:right="0" w:firstLine="0"/>
-      <w:jc w:val="left"/>
+      <w:spacing w:after="0" w:line="240" w:lineRule="auto"/>
       <w:rPr>
-        <w:rFonts w:ascii="Calibri" w:cs="Calibri" w:eastAsia="Calibri" w:hAnsi="Calibri"/>
-        <w:b w:val="0"/>
-        <w:bCs w:val="0"/>
-        <w:i w:val="0"/>
-        <w:iCs w:val="0"/>
-        <w:smallCaps w:val="0"/>
-        <w:strike w:val="0"/>
         <w:color w:val="000000"/>
-        <w:sz w:val="22"/>
-        <w:szCs w:val="22"/>
-        <w:u w:val="none"/>
-        <w:shd w:fill="auto" w:val="clear"/>
-        <w:vertAlign w:val="baseline"/>
       </w:rPr>
     </w:pPr>
     <w:r>
       <w:rPr>
-        <w:rtl w:val="0"/>
+        <w:noProof/>
       </w:rPr>
-    </w:r>
-    <w:r>
       <mc:AlternateContent>
         <mc:Choice Requires="wpg">
           <w:drawing>
-            <wp:anchor allowOverlap="1" behindDoc="0" distB="0" distT="0" distL="114300" distR="114300" hidden="0" layoutInCell="1" locked="0" relativeHeight="0" simplePos="0">
+            <wp:anchor distT="0" distB="0" distL="114300" distR="114300" simplePos="0" relativeHeight="251658240" behindDoc="0" locked="0" layoutInCell="1" hidden="0" allowOverlap="1" wp14:anchorId="07B15757" wp14:editId="397066FE">
               <wp:simplePos x="0" y="0"/>
               <wp:positionH relativeFrom="column">
                 <wp:posOffset>-683894</wp:posOffset>
@@ -1650,22 +1257,24 @@
                 <wp:posOffset>0</wp:posOffset>
               </wp:positionV>
               <wp:extent cx="7753350" cy="190500"/>
-              <wp:effectExtent b="0" l="0" r="0" t="0"/>
+              <wp:effectExtent l="0" t="0" r="0" b="0"/>
               <wp:wrapNone/>
-              <wp:docPr id="17579" name=""/>
-              <a:graphic>
+              <wp:docPr id="17579" name="Grupo 17579"/>
+              <wp:cNvGraphicFramePr/>
+              <a:graphic xmlns:a="http://schemas.openxmlformats.org/drawingml/2006/main">
                 <a:graphicData uri="http://schemas.microsoft.com/office/word/2010/wordprocessingGroup">
                   <wpg:wgp>
                     <wpg:cNvGrpSpPr/>
                     <wpg:grpSpPr>
                       <a:xfrm>
-                        <a:off x="1469325" y="3679975"/>
+                        <a:off x="0" y="0"/>
                         <a:ext cx="7753350" cy="190500"/>
                         <a:chOff x="1469325" y="3679975"/>
                         <a:chExt cx="7753375" cy="195275"/>
                       </a:xfrm>
                     </wpg:grpSpPr>
                     <wpg:grpSp>
+                      <wpg:cNvPr id="1073959444" name="Grupo 1073959444"/>
                       <wpg:cNvGrpSpPr/>
                       <wpg:grpSpPr>
                         <a:xfrm>
@@ -1676,8 +1285,8 @@
                         </a:xfrm>
                       </wpg:grpSpPr>
                       <wps:wsp>
+                        <wps:cNvPr id="632777510" name="Rectángulo 632777510"/>
                         <wps:cNvSpPr/>
-                        <wps:cNvPr id="3" name="Shape 3"/>
                         <wps:spPr>
                           <a:xfrm>
                             <a:off x="0" y="14970"/>
@@ -1695,21 +1304,19 @@
                           <w:txbxContent>
                             <w:p>
                               <w:pPr>
-                                <w:spacing w:after="0" w:before="0" w:line="240"/>
-                                <w:ind w:left="0" w:right="0" w:firstLine="0"/>
-                                <w:jc w:val="left"/>
+                                <w:spacing w:after="0" w:line="240" w:lineRule="auto"/>
                                 <w:textDirection w:val="btLr"/>
                               </w:pPr>
                             </w:p>
                           </w:txbxContent>
                         </wps:txbx>
-                        <wps:bodyPr anchorCtr="0" anchor="ctr" bIns="91425" lIns="91425" spcFirstLastPara="1" rIns="91425" wrap="square" tIns="91425">
+                        <wps:bodyPr spcFirstLastPara="1" wrap="square" lIns="91425" tIns="91425" rIns="91425" bIns="91425" anchor="ctr" anchorCtr="0">
                           <a:noAutofit/>
                         </wps:bodyPr>
                       </wps:wsp>
                       <wps:wsp>
+                        <wps:cNvPr id="374770398" name="Rectángulo 374770398"/>
                         <wps:cNvSpPr/>
-                        <wps:cNvPr id="4" name="Shape 4"/>
                         <wps:spPr>
                           <a:xfrm>
                             <a:off x="10803" y="14982"/>
@@ -1727,32 +1334,25 @@
                           <w:txbxContent>
                             <w:p>
                               <w:pPr>
-                                <w:spacing w:after="160" w:before="0" w:line="258.99999618530273"/>
-                                <w:ind w:left="0" w:right="0" w:firstLine="0"/>
+                                <w:spacing w:line="258" w:lineRule="auto"/>
                                 <w:jc w:val="center"/>
                                 <w:textDirection w:val="btLr"/>
                               </w:pPr>
                               <w:r>
                                 <w:rPr>
-                                  <w:rFonts w:ascii="Calibri" w:cs="Calibri" w:eastAsia="Calibri" w:hAnsi="Calibri"/>
-                                  <w:b w:val="0"/>
-                                  <w:i w:val="0"/>
-                                  <w:smallCaps w:val="0"/>
-                                  <w:strike w:val="0"/>
-                                  <w:color w:val="8c8c8c"/>
-                                  <w:sz w:val="22"/>
-                                  <w:vertAlign w:val="baseline"/>
+                                  <w:color w:val="8C8C8C"/>
                                 </w:rPr>
-                                <w:t xml:space="preserve">0</w:t>
+                                <w:t>0</w:t>
                               </w:r>
                             </w:p>
                           </w:txbxContent>
                         </wps:txbx>
-                        <wps:bodyPr anchorCtr="0" anchor="t" bIns="0" lIns="0" spcFirstLastPara="1" rIns="0" wrap="square" tIns="0">
+                        <wps:bodyPr spcFirstLastPara="1" wrap="square" lIns="0" tIns="0" rIns="0" bIns="0" anchor="t" anchorCtr="0">
                           <a:noAutofit/>
                         </wps:bodyPr>
                       </wps:wsp>
                       <wpg:grpSp>
+                        <wpg:cNvPr id="63395177" name="Grupo 63395177"/>
                         <wpg:cNvGrpSpPr/>
                         <wpg:grpSpPr>
                           <a:xfrm flipH="1">
@@ -1763,33 +1363,33 @@
                           </a:xfrm>
                         </wpg:grpSpPr>
                         <wps:wsp>
+                          <wps:cNvPr id="751281504" name="Conector: angular 751281504"/>
                           <wps:cNvCnPr/>
                           <wps:spPr>
-                            <a:xfrm flipH="1" rot="10800000">
+                            <a:xfrm rot="10800000" flipH="1">
                               <a:off x="-8" y="14978"/>
                               <a:ext cx="1260" cy="230"/>
                             </a:xfrm>
                             <a:prstGeom prst="bentConnector3">
                               <a:avLst>
-                                <a:gd fmla="val 923254" name="adj1"/>
+                                <a:gd name="adj1" fmla="val 923254"/>
                               </a:avLst>
                             </a:prstGeom>
                             <a:noFill/>
-                            <a:ln cap="flat" cmpd="sng" w="9525">
+                            <a:ln w="9525" cap="flat" cmpd="sng">
                               <a:solidFill>
                                 <a:srgbClr val="A5A5A5"/>
                               </a:solidFill>
                               <a:prstDash val="solid"/>
                               <a:miter lim="8000"/>
-                              <a:headEnd len="med" w="med" type="none"/>
-                              <a:tailEnd len="med" w="med" type="none"/>
+                              <a:headEnd type="none" w="med" len="med"/>
+                              <a:tailEnd type="none" w="med" len="med"/>
                             </a:ln>
                           </wps:spPr>
-                          <wps:bodyPr anchorCtr="0" anchor="ctr" bIns="91425" lIns="91425" spcFirstLastPara="1" rIns="91425" wrap="square" tIns="91425">
-                            <a:noAutofit/>
-                          </wps:bodyPr>
+                          <wps:bodyPr/>
                         </wps:wsp>
                         <wps:wsp>
+                          <wps:cNvPr id="2069827438" name="Conector: angular 2069827438"/>
                           <wps:cNvCnPr/>
                           <wps:spPr>
                             <a:xfrm rot="10800000">
@@ -1798,23 +1398,21 @@
                             </a:xfrm>
                             <a:prstGeom prst="bentConnector3">
                               <a:avLst>
-                                <a:gd fmla="val 14609" name="adj1"/>
+                                <a:gd name="adj1" fmla="val 14609"/>
                               </a:avLst>
                             </a:prstGeom>
                             <a:noFill/>
-                            <a:ln cap="flat" cmpd="sng" w="9525">
+                            <a:ln w="9525" cap="flat" cmpd="sng">
                               <a:solidFill>
                                 <a:srgbClr val="A5A5A5"/>
                               </a:solidFill>
                               <a:prstDash val="solid"/>
                               <a:miter lim="8000"/>
-                              <a:headEnd len="med" w="med" type="none"/>
-                              <a:tailEnd len="med" w="med" type="none"/>
+                              <a:headEnd type="none" w="med" len="med"/>
+                              <a:tailEnd type="none" w="med" len="med"/>
                             </a:ln>
                           </wps:spPr>
-                          <wps:bodyPr anchorCtr="0" anchor="ctr" bIns="91425" lIns="91425" spcFirstLastPara="1" rIns="91425" wrap="square" tIns="91425">
-                            <a:noAutofit/>
-                          </wps:bodyPr>
+                          <wps:bodyPr/>
                         </wps:wsp>
                       </wpg:grpSp>
                     </wpg:grpSp>
@@ -1824,7 +1422,7 @@
             </wp:anchor>
           </w:drawing>
         </mc:Choice>
-        <mc:Fallback>
+        <mc:Fallback xmlns:cr="http://schemas.microsoft.com/office/comments/2020/reactions" xmlns="http://schemas.microsoft.com/office/tasks/2019/documenttasks" xmlns:dgm="http://schemas.openxmlformats.org/drawingml/2006/diagram" xmlns:lc="http://schemas.openxmlformats.org/drawingml/2006/lockedCanvas" xmlns:c="http://schemas.openxmlformats.org/drawingml/2006/chart" xmlns:pic="http://schemas.openxmlformats.org/drawingml/2006/picture" xmlns:a="http://schemas.openxmlformats.org/drawingml/2006/main" xmlns:sl="http://schemas.openxmlformats.org/schemaLibrary/2006/main">
           <w:drawing>
             <wp:anchor allowOverlap="1" behindDoc="0" distB="0" distT="0" distL="114300" distR="114300" hidden="0" layoutInCell="1" locked="0" relativeHeight="0" simplePos="0">
               <wp:simplePos x="0" y="0"/>
@@ -1872,179 +1470,183 @@
 </w:ftr>
 </file>
 
+<file path=word/footnotes.xml><?xml version="1.0" encoding="utf-8"?>
+<w:footnotes xmlns:wpc="http://schemas.microsoft.com/office/word/2010/wordprocessingCanvas" xmlns:cx="http://schemas.microsoft.com/office/drawing/2014/chartex" xmlns:cx1="http://schemas.microsoft.com/office/drawing/2015/9/8/chartex" xmlns:cx2="http://schemas.microsoft.com/office/drawing/2015/10/21/chartex" xmlns:cx3="http://schemas.microsoft.com/office/drawing/2016/5/9/chartex" xmlns:cx4="http://schemas.microsoft.com/office/drawing/2016/5/10/chartex" xmlns:cx5="http://schemas.microsoft.com/office/drawing/2016/5/11/chartex" xmlns:cx6="http://schemas.microsoft.com/office/drawing/2016/5/12/chartex" xmlns:cx7="http://schemas.microsoft.com/office/drawing/2016/5/13/chartex" xmlns:cx8="http://schemas.microsoft.com/office/drawing/2016/5/14/chartex" xmlns:mc="http://schemas.openxmlformats.org/markup-compatibility/2006" xmlns:aink="http://schemas.microsoft.com/office/drawing/2016/ink" xmlns:am3d="http://schemas.microsoft.com/office/drawing/2017/model3d" xmlns:o="urn:schemas-microsoft-com:office:office" xmlns:oel="http://schemas.microsoft.com/office/2019/extlst" xmlns:r="http://schemas.openxmlformats.org/officeDocument/2006/relationships" xmlns:m="http://schemas.openxmlformats.org/officeDocument/2006/math" xmlns:v="urn:schemas-microsoft-com:vml" xmlns:wp14="http://schemas.microsoft.com/office/word/2010/wordprocessingDrawing" xmlns:wp="http://schemas.openxmlformats.org/drawingml/2006/wordprocessingDrawing" xmlns:w10="urn:schemas-microsoft-com:office:word" xmlns:w="http://schemas.openxmlformats.org/wordprocessingml/2006/main" xmlns:w14="http://schemas.microsoft.com/office/word/2010/wordml" xmlns:w15="http://schemas.microsoft.com/office/word/2012/wordml" xmlns:w16cex="http://schemas.microsoft.com/office/word/2018/wordml/cex" xmlns:w16cid="http://schemas.microsoft.com/office/word/2016/wordml/cid" xmlns:w16="http://schemas.microsoft.com/office/word/2018/wordml" xmlns:w16du="http://schemas.microsoft.com/office/word/2023/wordml/word16du" xmlns:w16sdtdh="http://schemas.microsoft.com/office/word/2020/wordml/sdtdatahash" xmlns:w16sdtfl="http://schemas.microsoft.com/office/word/2024/wordml/sdtformatlock" xmlns:w16se="http://schemas.microsoft.com/office/word/2015/wordml/symex" xmlns:wpg="http://schemas.microsoft.com/office/word/2010/wordprocessingGroup" xmlns:wpi="http://schemas.microsoft.com/office/word/2010/wordprocessingInk" xmlns:wne="http://schemas.microsoft.com/office/word/2006/wordml" xmlns:wps="http://schemas.microsoft.com/office/word/2010/wordprocessingShape" mc:Ignorable="w14 w15 w16se w16cid w16 w16cex w16sdtdh w16sdtfl w16du wp14">
+  <w:footnote w:type="separator" w:id="-1">
+    <w:p>
+      <w:pPr>
+        <w:spacing w:after="0" w:line="240" w:lineRule="auto"/>
+      </w:pPr>
+      <w:r>
+        <w:separator/>
+      </w:r>
+    </w:p>
+  </w:footnote>
+  <w:footnote w:type="continuationSeparator" w:id="0">
+    <w:p>
+      <w:pPr>
+        <w:spacing w:after="0" w:line="240" w:lineRule="auto"/>
+      </w:pPr>
+      <w:r>
+        <w:continuationSeparator/>
+      </w:r>
+    </w:p>
+  </w:footnote>
+</w:footnotes>
+</file>
+
 <file path=word/header1.xml><?xml version="1.0" encoding="utf-8"?>
-<w:hdr xmlns:mc="http://schemas.openxmlformats.org/markup-compatibility/2006" xmlns:o="urn:schemas-microsoft-com:office:office" xmlns:r="http://schemas.openxmlformats.org/officeDocument/2006/relationships" xmlns:m="http://schemas.openxmlformats.org/officeDocument/2006/math" xmlns:v="urn:schemas-microsoft-com:vml" xmlns:wp="http://schemas.openxmlformats.org/drawingml/2006/wordprocessingDrawing" xmlns:w10="urn:schemas-microsoft-com:office:word" xmlns:w="http://schemas.openxmlformats.org/wordprocessingml/2006/main" xmlns:wne="http://schemas.microsoft.com/office/word/2006/wordml" xmlns:sl="http://schemas.openxmlformats.org/schemaLibrary/2006/main" xmlns:a="http://schemas.openxmlformats.org/drawingml/2006/main" xmlns:pic="http://schemas.openxmlformats.org/drawingml/2006/picture" xmlns:c="http://schemas.openxmlformats.org/drawingml/2006/chart" xmlns:lc="http://schemas.openxmlformats.org/drawingml/2006/lockedCanvas" xmlns:dgm="http://schemas.openxmlformats.org/drawingml/2006/diagram" xmlns:wps="http://schemas.microsoft.com/office/word/2010/wordprocessingShape" xmlns:wpg="http://schemas.microsoft.com/office/word/2010/wordprocessingGroup" xmlns:w14="http://schemas.microsoft.com/office/word/2010/wordml" xmlns:w15="http://schemas.microsoft.com/office/word/2012/wordml" xmlns:w16="http://schemas.microsoft.com/office/word/2018/wordml" xmlns:w16cex="http://schemas.microsoft.com/office/word/2018/wordml/cex" xmlns:w16cid="http://schemas.microsoft.com/office/word/2016/wordml/cid" xmlns="http://schemas.microsoft.com/office/tasks/2019/documenttasks" xmlns:cr="http://schemas.microsoft.com/office/comments/2020/reactions">
+<w:hdr xmlns:wpc="http://schemas.microsoft.com/office/word/2010/wordprocessingCanvas" xmlns:cx="http://schemas.microsoft.com/office/drawing/2014/chartex" xmlns:cx1="http://schemas.microsoft.com/office/drawing/2015/9/8/chartex" xmlns:cx2="http://schemas.microsoft.com/office/drawing/2015/10/21/chartex" xmlns:cx3="http://schemas.microsoft.com/office/drawing/2016/5/9/chartex" xmlns:cx4="http://schemas.microsoft.com/office/drawing/2016/5/10/chartex" xmlns:cx5="http://schemas.microsoft.com/office/drawing/2016/5/11/chartex" xmlns:cx6="http://schemas.microsoft.com/office/drawing/2016/5/12/chartex" xmlns:cx7="http://schemas.microsoft.com/office/drawing/2016/5/13/chartex" xmlns:cx8="http://schemas.microsoft.com/office/drawing/2016/5/14/chartex" xmlns:mc="http://schemas.openxmlformats.org/markup-compatibility/2006" xmlns:aink="http://schemas.microsoft.com/office/drawing/2016/ink" xmlns:am3d="http://schemas.microsoft.com/office/drawing/2017/model3d" xmlns:o="urn:schemas-microsoft-com:office:office" xmlns:oel="http://schemas.microsoft.com/office/2019/extlst" xmlns:r="http://schemas.openxmlformats.org/officeDocument/2006/relationships" xmlns:m="http://schemas.openxmlformats.org/officeDocument/2006/math" xmlns:v="urn:schemas-microsoft-com:vml" xmlns:wp14="http://schemas.microsoft.com/office/word/2010/wordprocessingDrawing" xmlns:wp="http://schemas.openxmlformats.org/drawingml/2006/wordprocessingDrawing" xmlns:w10="urn:schemas-microsoft-com:office:word" xmlns:w="http://schemas.openxmlformats.org/wordprocessingml/2006/main" xmlns:w14="http://schemas.microsoft.com/office/word/2010/wordml" xmlns:w15="http://schemas.microsoft.com/office/word/2012/wordml" xmlns:w16cex="http://schemas.microsoft.com/office/word/2018/wordml/cex" xmlns:w16cid="http://schemas.microsoft.com/office/word/2016/wordml/cid" xmlns:w16="http://schemas.microsoft.com/office/word/2018/wordml" xmlns:w16du="http://schemas.microsoft.com/office/word/2023/wordml/word16du" xmlns:w16sdtdh="http://schemas.microsoft.com/office/word/2020/wordml/sdtdatahash" xmlns:w16sdtfl="http://schemas.microsoft.com/office/word/2024/wordml/sdtformatlock" xmlns:w16se="http://schemas.microsoft.com/office/word/2015/wordml/symex" xmlns:wpg="http://schemas.microsoft.com/office/word/2010/wordprocessingGroup" xmlns:wpi="http://schemas.microsoft.com/office/word/2010/wordprocessingInk" xmlns:wne="http://schemas.microsoft.com/office/word/2006/wordml" xmlns:wps="http://schemas.microsoft.com/office/word/2010/wordprocessingShape" mc:Ignorable="w14 w15 w16se w16cid w16 w16cex w16sdtdh w16sdtfl w16du wp14">
   <w:p>
     <w:pPr>
-      <w:keepNext w:val="0"/>
-      <w:keepLines w:val="0"/>
-      <w:pageBreakBefore w:val="0"/>
       <w:widowControl w:val="0"/>
       <w:pBdr>
-        <w:top w:space="0" w:sz="0" w:val="nil"/>
-        <w:left w:space="0" w:sz="0" w:val="nil"/>
-        <w:bottom w:space="0" w:sz="0" w:val="nil"/>
-        <w:right w:space="0" w:sz="0" w:val="nil"/>
-        <w:between w:space="0" w:sz="0" w:val="nil"/>
+        <w:top w:val="nil"/>
+        <w:left w:val="nil"/>
+        <w:bottom w:val="nil"/>
+        <w:right w:val="nil"/>
+        <w:between w:val="nil"/>
       </w:pBdr>
-      <w:shd w:fill="auto" w:val="clear"/>
-      <w:spacing w:after="0" w:before="0" w:line="276" w:lineRule="auto"/>
-      <w:ind w:left="0" w:right="0" w:firstLine="0"/>
-      <w:jc w:val="left"/>
+      <w:spacing w:after="0" w:line="276" w:lineRule="auto"/>
       <w:rPr>
-        <w:b w:val="1"/>
-        <w:bCs w:val="1"/>
+        <w:b/>
+        <w:bCs/>
         <w:sz w:val="24"/>
         <w:szCs w:val="24"/>
       </w:rPr>
     </w:pPr>
-    <w:r>
-      <w:rPr>
-        <w:rtl w:val="0"/>
-      </w:rPr>
-    </w:r>
   </w:p>
   <w:tbl>
     <w:tblPr>
-      <w:tblStyle w:val="Table9"/>
-      <w:tblW w:w="9923.0" w:type="dxa"/>
-      <w:jc w:val="left"/>
+      <w:tblStyle w:val="a7"/>
+      <w:tblW w:w="9923" w:type="dxa"/>
+      <w:tblInd w:w="0" w:type="dxa"/>
       <w:tblBorders>
-        <w:top w:color="000000" w:space="0" w:sz="4" w:val="single"/>
-        <w:left w:color="000000" w:space="0" w:sz="4" w:val="single"/>
-        <w:bottom w:color="000000" w:space="0" w:sz="4" w:val="single"/>
-        <w:right w:color="000000" w:space="0" w:sz="4" w:val="single"/>
-        <w:insideH w:color="000000" w:space="0" w:sz="4" w:val="single"/>
-        <w:insideV w:color="000000" w:space="0" w:sz="4" w:val="single"/>
+        <w:top w:val="single" w:sz="4" w:space="0" w:color="000000"/>
+        <w:left w:val="single" w:sz="4" w:space="0" w:color="000000"/>
+        <w:bottom w:val="single" w:sz="4" w:space="0" w:color="000000"/>
+        <w:right w:val="single" w:sz="4" w:space="0" w:color="000000"/>
+        <w:insideH w:val="single" w:sz="4" w:space="0" w:color="000000"/>
+        <w:insideV w:val="single" w:sz="4" w:space="0" w:color="000000"/>
       </w:tblBorders>
       <w:tblLayout w:type="fixed"/>
-      <w:tblLook w:val="0400"/>
+      <w:tblLook w:val="0400" w:firstRow="0" w:lastRow="0" w:firstColumn="0" w:lastColumn="0" w:noHBand="0" w:noVBand="1"/>
     </w:tblPr>
     <w:tblGrid>
       <w:gridCol w:w="5707"/>
       <w:gridCol w:w="4216"/>
-      <w:tblGridChange w:id="0">
-        <w:tblGrid>
-          <w:gridCol w:w="5707"/>
-          <w:gridCol w:w="4216"/>
-        </w:tblGrid>
-      </w:tblGridChange>
     </w:tblGrid>
     <w:tr>
       <w:trPr>
-        <w:cantSplit w:val="0"/>
-        <w:trHeight w:val="697" w:hRule="atLeast"/>
-        <w:tblHeader w:val="0"/>
+        <w:trHeight w:val="697"/>
       </w:trPr>
       <w:tc>
         <w:tcPr>
+          <w:tcW w:w="5707" w:type="dxa"/>
           <w:tcBorders>
-            <w:top w:color="000000" w:space="0" w:sz="0" w:val="nil"/>
-            <w:left w:color="000000" w:space="0" w:sz="0" w:val="nil"/>
-            <w:bottom w:color="000000" w:space="0" w:sz="0" w:val="nil"/>
-            <w:right w:color="000000" w:space="0" w:sz="0" w:val="nil"/>
+            <w:top w:val="nil"/>
+            <w:left w:val="nil"/>
+            <w:bottom w:val="nil"/>
+            <w:right w:val="nil"/>
           </w:tcBorders>
         </w:tcPr>
         <w:p>
           <w:pPr>
             <w:rPr>
-              <w:rFonts w:ascii="Century Gothic" w:cs="Century Gothic" w:eastAsia="Century Gothic" w:hAnsi="Century Gothic"/>
-              <w:b w:val="1"/>
-              <w:bCs w:val="1"/>
-              <w:color w:val="1d2763"/>
+              <w:rFonts w:ascii="Century Gothic" w:eastAsia="Century Gothic" w:hAnsi="Century Gothic" w:cs="Century Gothic"/>
+              <w:b/>
+              <w:bCs/>
+              <w:color w:val="1D2763"/>
               <w:sz w:val="24"/>
               <w:szCs w:val="24"/>
             </w:rPr>
           </w:pPr>
           <w:r>
             <w:rPr>
-              <w:rFonts w:ascii="Century Gothic" w:cs="Century Gothic" w:eastAsia="Century Gothic" w:hAnsi="Century Gothic"/>
-              <w:b w:val="1"/>
-              <w:bCs w:val="1"/>
-              <w:color w:val="1d2763"/>
+              <w:rFonts w:ascii="Century Gothic" w:eastAsia="Century Gothic" w:hAnsi="Century Gothic" w:cs="Century Gothic"/>
+              <w:b/>
+              <w:bCs/>
+              <w:color w:val="1D2763"/>
               <w:sz w:val="24"/>
               <w:szCs w:val="24"/>
-              <w:rtl w:val="0"/>
             </w:rPr>
-            <w:t xml:space="preserve">Diario de Reflexión</w:t>
+            <w:t>Diario de Reflexión</w:t>
           </w:r>
         </w:p>
         <w:p>
           <w:pPr>
             <w:rPr>
-              <w:rFonts w:ascii="Century Gothic" w:cs="Century Gothic" w:eastAsia="Century Gothic" w:hAnsi="Century Gothic"/>
-              <w:b w:val="1"/>
-              <w:bCs w:val="1"/>
-              <w:color w:val="1d2763"/>
+              <w:rFonts w:ascii="Century Gothic" w:eastAsia="Century Gothic" w:hAnsi="Century Gothic" w:cs="Century Gothic"/>
+              <w:b/>
+              <w:bCs/>
+              <w:color w:val="1D2763"/>
               <w:sz w:val="24"/>
               <w:szCs w:val="24"/>
             </w:rPr>
           </w:pPr>
           <w:r>
             <w:rPr>
-              <w:rFonts w:ascii="Century Gothic" w:cs="Century Gothic" w:eastAsia="Century Gothic" w:hAnsi="Century Gothic"/>
-              <w:b w:val="1"/>
-              <w:bCs w:val="1"/>
-              <w:color w:val="1d2763"/>
+              <w:rFonts w:ascii="Century Gothic" w:eastAsia="Century Gothic" w:hAnsi="Century Gothic" w:cs="Century Gothic"/>
+              <w:b/>
+              <w:bCs/>
+              <w:color w:val="1D2763"/>
               <w:sz w:val="24"/>
               <w:szCs w:val="24"/>
-              <w:rtl w:val="0"/>
             </w:rPr>
-            <w:t xml:space="preserve">Fase 2</w:t>
+            <w:t>Fase 2</w:t>
           </w:r>
         </w:p>
         <w:p>
           <w:pPr>
             <w:rPr>
-              <w:rFonts w:ascii="Century Gothic" w:cs="Century Gothic" w:eastAsia="Century Gothic" w:hAnsi="Century Gothic"/>
+              <w:rFonts w:ascii="Century Gothic" w:eastAsia="Century Gothic" w:hAnsi="Century Gothic" w:cs="Century Gothic"/>
               <w:sz w:val="2"/>
               <w:szCs w:val="2"/>
             </w:rPr>
           </w:pPr>
-          <w:r>
-            <w:rPr>
-              <w:rtl w:val="0"/>
-            </w:rPr>
-          </w:r>
         </w:p>
       </w:tc>
       <w:tc>
         <w:tcPr>
+          <w:tcW w:w="4216" w:type="dxa"/>
           <w:tcBorders>
-            <w:top w:color="000000" w:space="0" w:sz="0" w:val="nil"/>
-            <w:left w:color="000000" w:space="0" w:sz="0" w:val="nil"/>
-            <w:bottom w:color="000000" w:space="0" w:sz="0" w:val="nil"/>
-            <w:right w:color="000000" w:space="0" w:sz="0" w:val="nil"/>
+            <w:top w:val="nil"/>
+            <w:left w:val="nil"/>
+            <w:bottom w:val="nil"/>
+            <w:right w:val="nil"/>
           </w:tcBorders>
         </w:tcPr>
         <w:p>
           <w:pPr>
             <w:jc w:val="right"/>
             <w:rPr>
-              <w:rFonts w:ascii="Century Gothic" w:cs="Century Gothic" w:eastAsia="Century Gothic" w:hAnsi="Century Gothic"/>
-              <w:b w:val="1"/>
-              <w:bCs w:val="1"/>
+              <w:rFonts w:ascii="Century Gothic" w:eastAsia="Century Gothic" w:hAnsi="Century Gothic" w:cs="Century Gothic"/>
+              <w:b/>
+              <w:bCs/>
               <w:sz w:val="30"/>
               <w:szCs w:val="30"/>
             </w:rPr>
           </w:pPr>
           <w:r>
-            <w:rPr/>
+            <w:rPr>
+              <w:noProof/>
+            </w:rPr>
             <w:drawing>
-              <wp:inline distB="0" distT="0" distL="0" distR="0">
+              <wp:inline distT="0" distB="0" distL="0" distR="0" wp14:anchorId="1FA61746" wp14:editId="41D79D10">
                 <wp:extent cx="1996440" cy="428625"/>
-                <wp:effectExtent b="0" l="0" r="0" t="0"/>
-                <wp:docPr descr="http://www.duoc.cl/normasgraficas/normasgraficas/marca-duoc/6logo-fondo-transparente/fondo-transparente.png" id="17582" name="image2.png"/>
-                <a:graphic>
+                <wp:effectExtent l="0" t="0" r="0" b="0"/>
+                <wp:docPr id="17582" name="image2.png" descr="http://www.duoc.cl/normasgraficas/normasgraficas/marca-duoc/6logo-fondo-transparente/fondo-transparente.png"/>
+                <wp:cNvGraphicFramePr/>
+                <a:graphic xmlns:a="http://schemas.openxmlformats.org/drawingml/2006/main">
                   <a:graphicData uri="http://schemas.openxmlformats.org/drawingml/2006/picture">
-                    <pic:pic>
+                    <pic:pic xmlns:pic="http://schemas.openxmlformats.org/drawingml/2006/picture">
                       <pic:nvPicPr>
-                        <pic:cNvPr descr="http://www.duoc.cl/normasgraficas/normasgraficas/marca-duoc/6logo-fondo-transparente/fondo-transparente.png" id="0" name="image2.png"/>
+                        <pic:cNvPr id="0" name="image2.png" descr="http://www.duoc.cl/normasgraficas/normasgraficas/marca-duoc/6logo-fondo-transparente/fondo-transparente.png"/>
                         <pic:cNvPicPr preferRelativeResize="0"/>
                       </pic:nvPicPr>
                       <pic:blipFill>
                         <a:blip r:embed="rId1"/>
-                        <a:srcRect b="0" l="0" r="0" t="0"/>
+                        <a:srcRect/>
                         <a:stretch>
                           <a:fillRect/>
                         </a:stretch>
@@ -2054,7 +1656,9 @@
                           <a:off x="0" y="0"/>
                           <a:ext cx="1996440" cy="428625"/>
                         </a:xfrm>
-                        <a:prstGeom prst="rect"/>
+                        <a:prstGeom prst="rect">
+                          <a:avLst/>
+                        </a:prstGeom>
                         <a:ln/>
                       </pic:spPr>
                     </pic:pic>
@@ -2063,179 +1667,121 @@
               </wp:inline>
             </w:drawing>
           </w:r>
-          <w:r>
-            <w:rPr>
-              <w:rtl w:val="0"/>
-            </w:rPr>
-          </w:r>
         </w:p>
       </w:tc>
     </w:tr>
   </w:tbl>
   <w:p>
     <w:pPr>
-      <w:keepNext w:val="0"/>
-      <w:keepLines w:val="0"/>
-      <w:pageBreakBefore w:val="0"/>
-      <w:widowControl w:val="1"/>
       <w:pBdr>
-        <w:top w:space="0" w:sz="0" w:val="nil"/>
-        <w:left w:space="0" w:sz="0" w:val="nil"/>
-        <w:bottom w:space="0" w:sz="0" w:val="nil"/>
-        <w:right w:space="0" w:sz="0" w:val="nil"/>
-        <w:between w:space="0" w:sz="0" w:val="nil"/>
+        <w:top w:val="nil"/>
+        <w:left w:val="nil"/>
+        <w:bottom w:val="nil"/>
+        <w:right w:val="nil"/>
+        <w:between w:val="nil"/>
       </w:pBdr>
-      <w:shd w:fill="auto" w:val="clear"/>
       <w:tabs>
-        <w:tab w:val="center" w:leader="none" w:pos="4419"/>
-        <w:tab w:val="right" w:leader="none" w:pos="8838"/>
-        <w:tab w:val="left" w:leader="none" w:pos="8122"/>
+        <w:tab w:val="center" w:pos="4419"/>
+        <w:tab w:val="right" w:pos="8838"/>
+        <w:tab w:val="left" w:pos="8122"/>
       </w:tabs>
-      <w:spacing w:after="0" w:before="0" w:line="240" w:lineRule="auto"/>
-      <w:ind w:left="0" w:right="0" w:firstLine="0"/>
-      <w:jc w:val="left"/>
+      <w:spacing w:after="0" w:line="240" w:lineRule="auto"/>
       <w:rPr>
-        <w:rFonts w:ascii="Calibri" w:cs="Calibri" w:eastAsia="Calibri" w:hAnsi="Calibri"/>
-        <w:b w:val="0"/>
-        <w:bCs w:val="0"/>
-        <w:i w:val="0"/>
-        <w:iCs w:val="0"/>
-        <w:smallCaps w:val="0"/>
-        <w:strike w:val="0"/>
-        <w:color w:val="1f4e79"/>
-        <w:sz w:val="22"/>
-        <w:szCs w:val="22"/>
-        <w:u w:val="none"/>
-        <w:shd w:fill="auto" w:val="clear"/>
-        <w:vertAlign w:val="baseline"/>
+        <w:color w:val="1F4E79"/>
       </w:rPr>
     </w:pPr>
-    <w:r>
-      <w:rPr>
-        <w:rtl w:val="0"/>
-      </w:rPr>
-    </w:r>
   </w:p>
 </w:hdr>
 </file>
 
 <file path=word/header2.xml><?xml version="1.0" encoding="utf-8"?>
-<w:hdr xmlns:mc="http://schemas.openxmlformats.org/markup-compatibility/2006" xmlns:o="urn:schemas-microsoft-com:office:office" xmlns:r="http://schemas.openxmlformats.org/officeDocument/2006/relationships" xmlns:m="http://schemas.openxmlformats.org/officeDocument/2006/math" xmlns:v="urn:schemas-microsoft-com:vml" xmlns:wp="http://schemas.openxmlformats.org/drawingml/2006/wordprocessingDrawing" xmlns:w10="urn:schemas-microsoft-com:office:word" xmlns:w="http://schemas.openxmlformats.org/wordprocessingml/2006/main" xmlns:wne="http://schemas.microsoft.com/office/word/2006/wordml" xmlns:sl="http://schemas.openxmlformats.org/schemaLibrary/2006/main" xmlns:a="http://schemas.openxmlformats.org/drawingml/2006/main" xmlns:pic="http://schemas.openxmlformats.org/drawingml/2006/picture" xmlns:c="http://schemas.openxmlformats.org/drawingml/2006/chart" xmlns:lc="http://schemas.openxmlformats.org/drawingml/2006/lockedCanvas" xmlns:dgm="http://schemas.openxmlformats.org/drawingml/2006/diagram" xmlns:wps="http://schemas.microsoft.com/office/word/2010/wordprocessingShape" xmlns:wpg="http://schemas.microsoft.com/office/word/2010/wordprocessingGroup" xmlns:w14="http://schemas.microsoft.com/office/word/2010/wordml" xmlns:w15="http://schemas.microsoft.com/office/word/2012/wordml" xmlns:w16="http://schemas.microsoft.com/office/word/2018/wordml" xmlns:w16cex="http://schemas.microsoft.com/office/word/2018/wordml/cex" xmlns:w16cid="http://schemas.microsoft.com/office/word/2016/wordml/cid" xmlns="http://schemas.microsoft.com/office/tasks/2019/documenttasks" xmlns:cr="http://schemas.microsoft.com/office/comments/2020/reactions">
+<w:hdr xmlns:wpc="http://schemas.microsoft.com/office/word/2010/wordprocessingCanvas" xmlns:cx="http://schemas.microsoft.com/office/drawing/2014/chartex" xmlns:cx1="http://schemas.microsoft.com/office/drawing/2015/9/8/chartex" xmlns:cx2="http://schemas.microsoft.com/office/drawing/2015/10/21/chartex" xmlns:cx3="http://schemas.microsoft.com/office/drawing/2016/5/9/chartex" xmlns:cx4="http://schemas.microsoft.com/office/drawing/2016/5/10/chartex" xmlns:cx5="http://schemas.microsoft.com/office/drawing/2016/5/11/chartex" xmlns:cx6="http://schemas.microsoft.com/office/drawing/2016/5/12/chartex" xmlns:cx7="http://schemas.microsoft.com/office/drawing/2016/5/13/chartex" xmlns:cx8="http://schemas.microsoft.com/office/drawing/2016/5/14/chartex" xmlns:mc="http://schemas.openxmlformats.org/markup-compatibility/2006" xmlns:aink="http://schemas.microsoft.com/office/drawing/2016/ink" xmlns:am3d="http://schemas.microsoft.com/office/drawing/2017/model3d" xmlns:o="urn:schemas-microsoft-com:office:office" xmlns:oel="http://schemas.microsoft.com/office/2019/extlst" xmlns:r="http://schemas.openxmlformats.org/officeDocument/2006/relationships" xmlns:m="http://schemas.openxmlformats.org/officeDocument/2006/math" xmlns:v="urn:schemas-microsoft-com:vml" xmlns:wp14="http://schemas.microsoft.com/office/word/2010/wordprocessingDrawing" xmlns:wp="http://schemas.openxmlformats.org/drawingml/2006/wordprocessingDrawing" xmlns:w10="urn:schemas-microsoft-com:office:word" xmlns:w="http://schemas.openxmlformats.org/wordprocessingml/2006/main" xmlns:w14="http://schemas.microsoft.com/office/word/2010/wordml" xmlns:w15="http://schemas.microsoft.com/office/word/2012/wordml" xmlns:w16cex="http://schemas.microsoft.com/office/word/2018/wordml/cex" xmlns:w16cid="http://schemas.microsoft.com/office/word/2016/wordml/cid" xmlns:w16="http://schemas.microsoft.com/office/word/2018/wordml" xmlns:w16du="http://schemas.microsoft.com/office/word/2023/wordml/word16du" xmlns:w16sdtdh="http://schemas.microsoft.com/office/word/2020/wordml/sdtdatahash" xmlns:w16sdtfl="http://schemas.microsoft.com/office/word/2024/wordml/sdtformatlock" xmlns:w16se="http://schemas.microsoft.com/office/word/2015/wordml/symex" xmlns:wpg="http://schemas.microsoft.com/office/word/2010/wordprocessingGroup" xmlns:wpi="http://schemas.microsoft.com/office/word/2010/wordprocessingInk" xmlns:wne="http://schemas.microsoft.com/office/word/2006/wordml" xmlns:wps="http://schemas.microsoft.com/office/word/2010/wordprocessingShape" mc:Ignorable="w14 w15 w16se w16cid w16 w16cex w16sdtdh w16sdtfl w16du wp14">
   <w:p>
     <w:pPr>
-      <w:keepNext w:val="0"/>
-      <w:keepLines w:val="0"/>
-      <w:pageBreakBefore w:val="0"/>
       <w:widowControl w:val="0"/>
       <w:pBdr>
-        <w:top w:space="0" w:sz="0" w:val="nil"/>
-        <w:left w:space="0" w:sz="0" w:val="nil"/>
-        <w:bottom w:space="0" w:sz="0" w:val="nil"/>
-        <w:right w:space="0" w:sz="0" w:val="nil"/>
-        <w:between w:space="0" w:sz="0" w:val="nil"/>
+        <w:top w:val="nil"/>
+        <w:left w:val="nil"/>
+        <w:bottom w:val="nil"/>
+        <w:right w:val="nil"/>
+        <w:between w:val="nil"/>
       </w:pBdr>
-      <w:shd w:fill="auto" w:val="clear"/>
-      <w:spacing w:after="0" w:before="0" w:line="276" w:lineRule="auto"/>
-      <w:ind w:left="0" w:right="0" w:firstLine="0"/>
-      <w:jc w:val="left"/>
+      <w:spacing w:after="0" w:line="276" w:lineRule="auto"/>
       <w:rPr>
-        <w:rFonts w:ascii="Calibri" w:cs="Calibri" w:eastAsia="Calibri" w:hAnsi="Calibri"/>
-        <w:b w:val="0"/>
-        <w:bCs w:val="0"/>
-        <w:i w:val="0"/>
-        <w:iCs w:val="0"/>
-        <w:smallCaps w:val="0"/>
-        <w:strike w:val="0"/>
-        <w:color w:val="1f4e79"/>
-        <w:sz w:val="22"/>
-        <w:szCs w:val="22"/>
-        <w:u w:val="none"/>
-        <w:shd w:fill="auto" w:val="clear"/>
-        <w:vertAlign w:val="baseline"/>
+        <w:color w:val="1F4E79"/>
       </w:rPr>
     </w:pPr>
-    <w:r>
-      <w:rPr>
-        <w:rtl w:val="0"/>
-      </w:rPr>
-    </w:r>
   </w:p>
   <w:tbl>
     <w:tblPr>
-      <w:tblStyle w:val="Table10"/>
-      <w:tblW w:w="10086.0" w:type="dxa"/>
-      <w:jc w:val="left"/>
+      <w:tblStyle w:val="a8"/>
+      <w:tblW w:w="10086" w:type="dxa"/>
+      <w:tblInd w:w="0" w:type="dxa"/>
       <w:tblBorders>
-        <w:top w:color="000000" w:space="0" w:sz="4" w:val="single"/>
-        <w:left w:color="000000" w:space="0" w:sz="4" w:val="single"/>
-        <w:bottom w:color="000000" w:space="0" w:sz="4" w:val="single"/>
-        <w:right w:color="000000" w:space="0" w:sz="4" w:val="single"/>
-        <w:insideH w:color="000000" w:space="0" w:sz="4" w:val="single"/>
-        <w:insideV w:color="000000" w:space="0" w:sz="4" w:val="single"/>
+        <w:top w:val="single" w:sz="4" w:space="0" w:color="000000"/>
+        <w:left w:val="single" w:sz="4" w:space="0" w:color="000000"/>
+        <w:bottom w:val="single" w:sz="4" w:space="0" w:color="000000"/>
+        <w:right w:val="single" w:sz="4" w:space="0" w:color="000000"/>
+        <w:insideH w:val="single" w:sz="4" w:space="0" w:color="000000"/>
+        <w:insideV w:val="single" w:sz="4" w:space="0" w:color="000000"/>
       </w:tblBorders>
       <w:tblLayout w:type="fixed"/>
-      <w:tblLook w:val="0400"/>
+      <w:tblLook w:val="0400" w:firstRow="0" w:lastRow="0" w:firstColumn="0" w:lastColumn="0" w:noHBand="0" w:noVBand="1"/>
     </w:tblPr>
     <w:tblGrid>
       <w:gridCol w:w="786"/>
       <w:gridCol w:w="5918"/>
       <w:gridCol w:w="3382"/>
-      <w:tblGridChange w:id="0">
-        <w:tblGrid>
-          <w:gridCol w:w="786"/>
-          <w:gridCol w:w="5918"/>
-          <w:gridCol w:w="3382"/>
-        </w:tblGrid>
-      </w:tblGridChange>
     </w:tblGrid>
     <w:tr>
       <w:trPr>
-        <w:cantSplit w:val="0"/>
-        <w:trHeight w:val="1091" w:hRule="atLeast"/>
-        <w:tblHeader w:val="0"/>
+        <w:trHeight w:val="1091"/>
       </w:trPr>
       <w:tc>
         <w:tcPr>
+          <w:tcW w:w="786" w:type="dxa"/>
           <w:tcBorders>
-            <w:top w:color="000000" w:space="0" w:sz="0" w:val="nil"/>
-            <w:left w:color="000000" w:space="0" w:sz="0" w:val="nil"/>
-            <w:bottom w:color="000000" w:space="0" w:sz="0" w:val="nil"/>
-            <w:right w:color="000000" w:space="0" w:sz="0" w:val="nil"/>
+            <w:top w:val="nil"/>
+            <w:left w:val="nil"/>
+            <w:bottom w:val="nil"/>
+            <w:right w:val="nil"/>
           </w:tcBorders>
         </w:tcPr>
         <w:p>
           <w:pPr>
             <w:rPr>
-              <w:rFonts w:ascii="Century Gothic" w:cs="Century Gothic" w:eastAsia="Century Gothic" w:hAnsi="Century Gothic"/>
-              <w:b w:val="1"/>
-              <w:bCs w:val="1"/>
+              <w:rFonts w:ascii="Century Gothic" w:eastAsia="Century Gothic" w:hAnsi="Century Gothic" w:cs="Century Gothic"/>
+              <w:b/>
+              <w:bCs/>
               <w:sz w:val="30"/>
               <w:szCs w:val="30"/>
             </w:rPr>
           </w:pPr>
           <w:r>
             <w:rPr>
-              <w:rFonts w:ascii="Century Gothic" w:cs="Century Gothic" w:eastAsia="Century Gothic" w:hAnsi="Century Gothic"/>
-              <w:b w:val="1"/>
-              <w:bCs w:val="1"/>
+              <w:rFonts w:ascii="Century Gothic" w:eastAsia="Century Gothic" w:hAnsi="Century Gothic" w:cs="Century Gothic"/>
+              <w:b/>
+              <w:bCs/>
+              <w:noProof/>
               <w:sz w:val="30"/>
               <w:szCs w:val="30"/>
             </w:rPr>
             <w:drawing>
-              <wp:inline distB="0" distT="0" distL="0" distR="0">
+              <wp:inline distT="0" distB="0" distL="0" distR="0" wp14:anchorId="282BF591" wp14:editId="3978869B">
                 <wp:extent cx="361950" cy="581025"/>
-                <wp:effectExtent b="0" l="0" r="0" t="0"/>
+                <wp:effectExtent l="0" t="0" r="0" b="0"/>
                 <wp:docPr id="17581" name="image4.png"/>
-                <a:graphic>
+                <wp:cNvGraphicFramePr/>
+                <a:graphic xmlns:a="http://schemas.openxmlformats.org/drawingml/2006/main">
                   <a:graphicData uri="http://schemas.openxmlformats.org/drawingml/2006/picture">
-                    <pic:pic>
+                    <pic:pic xmlns:pic="http://schemas.openxmlformats.org/drawingml/2006/picture">
                       <pic:nvPicPr>
                         <pic:cNvPr id="0" name="image4.png"/>
                         <pic:cNvPicPr preferRelativeResize="0"/>
                       </pic:nvPicPr>
                       <pic:blipFill>
                         <a:blip r:embed="rId1"/>
-                        <a:srcRect b="0" l="0" r="0" t="0"/>
+                        <a:srcRect/>
                         <a:stretch>
                           <a:fillRect/>
                         </a:stretch>
@@ -2245,7 +1791,9 @@
                           <a:off x="0" y="0"/>
                           <a:ext cx="361950" cy="581025"/>
                         </a:xfrm>
-                        <a:prstGeom prst="rect"/>
+                        <a:prstGeom prst="rect">
+                          <a:avLst/>
+                        </a:prstGeom>
                         <a:ln/>
                       </pic:spPr>
                     </pic:pic>
@@ -2254,144 +1802,135 @@
               </wp:inline>
             </w:drawing>
           </w:r>
-          <w:r>
-            <w:rPr>
-              <w:rtl w:val="0"/>
-            </w:rPr>
-          </w:r>
         </w:p>
       </w:tc>
       <w:tc>
         <w:tcPr>
+          <w:tcW w:w="5918" w:type="dxa"/>
           <w:tcBorders>
-            <w:top w:color="000000" w:space="0" w:sz="0" w:val="nil"/>
-            <w:left w:color="000000" w:space="0" w:sz="0" w:val="nil"/>
-            <w:bottom w:color="000000" w:space="0" w:sz="0" w:val="nil"/>
-            <w:right w:color="000000" w:space="0" w:sz="0" w:val="nil"/>
+            <w:top w:val="nil"/>
+            <w:left w:val="nil"/>
+            <w:bottom w:val="nil"/>
+            <w:right w:val="nil"/>
           </w:tcBorders>
         </w:tcPr>
         <w:p>
           <w:pPr>
             <w:rPr>
-              <w:rFonts w:ascii="Century Gothic" w:cs="Century Gothic" w:eastAsia="Century Gothic" w:hAnsi="Century Gothic"/>
-              <w:b w:val="1"/>
-              <w:bCs w:val="1"/>
-              <w:color w:val="1d2763"/>
+              <w:rFonts w:ascii="Century Gothic" w:eastAsia="Century Gothic" w:hAnsi="Century Gothic" w:cs="Century Gothic"/>
+              <w:b/>
+              <w:bCs/>
+              <w:color w:val="1D2763"/>
               <w:sz w:val="24"/>
               <w:szCs w:val="24"/>
             </w:rPr>
           </w:pPr>
           <w:r>
             <w:rPr>
-              <w:rFonts w:ascii="Century Gothic" w:cs="Century Gothic" w:eastAsia="Century Gothic" w:hAnsi="Century Gothic"/>
-              <w:b w:val="1"/>
-              <w:bCs w:val="1"/>
-              <w:color w:val="1d2763"/>
+              <w:rFonts w:ascii="Century Gothic" w:eastAsia="Century Gothic" w:hAnsi="Century Gothic" w:cs="Century Gothic"/>
+              <w:b/>
+              <w:bCs/>
+              <w:color w:val="1D2763"/>
               <w:sz w:val="24"/>
               <w:szCs w:val="24"/>
-              <w:rtl w:val="0"/>
             </w:rPr>
-            <w:t xml:space="preserve">PTR7862</w:t>
+            <w:t>PTR7862</w:t>
           </w:r>
         </w:p>
         <w:p>
           <w:pPr>
             <w:rPr>
-              <w:rFonts w:ascii="Century Gothic" w:cs="Century Gothic" w:eastAsia="Century Gothic" w:hAnsi="Century Gothic"/>
-              <w:color w:val="1d2763"/>
+              <w:rFonts w:ascii="Century Gothic" w:eastAsia="Century Gothic" w:hAnsi="Century Gothic" w:cs="Century Gothic"/>
+              <w:color w:val="1D2763"/>
               <w:sz w:val="24"/>
               <w:szCs w:val="24"/>
             </w:rPr>
           </w:pPr>
           <w:r>
             <w:rPr>
-              <w:rFonts w:ascii="Century Gothic" w:cs="Century Gothic" w:eastAsia="Century Gothic" w:hAnsi="Century Gothic"/>
-              <w:color w:val="1d2763"/>
+              <w:rFonts w:ascii="Century Gothic" w:eastAsia="Century Gothic" w:hAnsi="Century Gothic" w:cs="Century Gothic"/>
+              <w:color w:val="1D2763"/>
               <w:sz w:val="24"/>
               <w:szCs w:val="24"/>
-              <w:rtl w:val="0"/>
             </w:rPr>
-            <w:t xml:space="preserve">Técnico en Geomática</w:t>
+            <w:t>Técnico en Geomática</w:t>
           </w:r>
         </w:p>
         <w:p>
           <w:pPr>
             <w:rPr>
-              <w:rFonts w:ascii="Century Gothic" w:cs="Century Gothic" w:eastAsia="Century Gothic" w:hAnsi="Century Gothic"/>
-              <w:color w:val="1d2763"/>
+              <w:rFonts w:ascii="Century Gothic" w:eastAsia="Century Gothic" w:hAnsi="Century Gothic" w:cs="Century Gothic"/>
+              <w:color w:val="1D2763"/>
               <w:sz w:val="24"/>
               <w:szCs w:val="24"/>
             </w:rPr>
           </w:pPr>
           <w:r>
             <w:rPr>
-              <w:rFonts w:ascii="Century Gothic" w:cs="Century Gothic" w:eastAsia="Century Gothic" w:hAnsi="Century Gothic"/>
-              <w:color w:val="1d2763"/>
+              <w:rFonts w:ascii="Century Gothic" w:eastAsia="Century Gothic" w:hAnsi="Century Gothic" w:cs="Century Gothic"/>
+              <w:color w:val="1D2763"/>
               <w:sz w:val="24"/>
               <w:szCs w:val="24"/>
-              <w:rtl w:val="0"/>
             </w:rPr>
-            <w:t xml:space="preserve">Diario de Reflexión – Fase 2</w:t>
+            <w:t>Diario de Reflexión – Fase 2</w:t>
           </w:r>
         </w:p>
         <w:p>
           <w:pPr>
             <w:rPr>
-              <w:rFonts w:ascii="Century Gothic" w:cs="Century Gothic" w:eastAsia="Century Gothic" w:hAnsi="Century Gothic"/>
+              <w:rFonts w:ascii="Century Gothic" w:eastAsia="Century Gothic" w:hAnsi="Century Gothic" w:cs="Century Gothic"/>
               <w:sz w:val="2"/>
               <w:szCs w:val="2"/>
             </w:rPr>
           </w:pPr>
-          <w:r>
-            <w:rPr>
-              <w:rtl w:val="0"/>
-            </w:rPr>
-          </w:r>
         </w:p>
       </w:tc>
       <w:tc>
         <w:tcPr>
+          <w:tcW w:w="3382" w:type="dxa"/>
           <w:tcBorders>
-            <w:top w:color="000000" w:space="0" w:sz="0" w:val="nil"/>
-            <w:left w:color="000000" w:space="0" w:sz="0" w:val="nil"/>
-            <w:bottom w:color="000000" w:space="0" w:sz="0" w:val="nil"/>
-            <w:right w:color="000000" w:space="0" w:sz="0" w:val="nil"/>
+            <w:top w:val="nil"/>
+            <w:left w:val="nil"/>
+            <w:bottom w:val="nil"/>
+            <w:right w:val="nil"/>
           </w:tcBorders>
         </w:tcPr>
         <w:p>
           <w:pPr>
             <w:jc w:val="right"/>
             <w:rPr>
-              <w:rFonts w:ascii="Century Gothic" w:cs="Century Gothic" w:eastAsia="Century Gothic" w:hAnsi="Century Gothic"/>
-              <w:b w:val="1"/>
-              <w:bCs w:val="1"/>
+              <w:rFonts w:ascii="Century Gothic" w:eastAsia="Century Gothic" w:hAnsi="Century Gothic" w:cs="Century Gothic"/>
+              <w:b/>
+              <w:bCs/>
               <w:sz w:val="30"/>
               <w:szCs w:val="30"/>
             </w:rPr>
           </w:pPr>
           <w:r>
             <w:rPr>
-              <w:rFonts w:ascii="Century Gothic" w:cs="Century Gothic" w:eastAsia="Century Gothic" w:hAnsi="Century Gothic"/>
-              <w:b w:val="1"/>
-              <w:bCs w:val="1"/>
+              <w:rFonts w:ascii="Century Gothic" w:eastAsia="Century Gothic" w:hAnsi="Century Gothic" w:cs="Century Gothic"/>
+              <w:b/>
+              <w:bCs/>
+              <w:noProof/>
               <w:sz w:val="30"/>
               <w:szCs w:val="30"/>
             </w:rPr>
             <w:drawing>
-              <wp:inline distB="0" distT="0" distL="0" distR="0">
+              <wp:inline distT="0" distB="0" distL="0" distR="0" wp14:anchorId="5FD0B45C" wp14:editId="64A41545">
                 <wp:extent cx="1895475" cy="466725"/>
-                <wp:effectExtent b="0" l="0" r="0" t="0"/>
+                <wp:effectExtent l="0" t="0" r="0" b="0"/>
                 <wp:docPr id="17583" name="image3.png"/>
-                <a:graphic>
+                <wp:cNvGraphicFramePr/>
+                <a:graphic xmlns:a="http://schemas.openxmlformats.org/drawingml/2006/main">
                   <a:graphicData uri="http://schemas.openxmlformats.org/drawingml/2006/picture">
-                    <pic:pic>
+                    <pic:pic xmlns:pic="http://schemas.openxmlformats.org/drawingml/2006/picture">
                       <pic:nvPicPr>
                         <pic:cNvPr id="0" name="image3.png"/>
                         <pic:cNvPicPr preferRelativeResize="0"/>
                       </pic:nvPicPr>
                       <pic:blipFill>
                         <a:blip r:embed="rId2"/>
-                        <a:srcRect b="0" l="0" r="0" t="0"/>
+                        <a:srcRect/>
                         <a:stretch>
                           <a:fillRect/>
                         </a:stretch>
@@ -2401,7 +1940,9 @@
                           <a:off x="0" y="0"/>
                           <a:ext cx="1895475" cy="466725"/>
                         </a:xfrm>
-                        <a:prstGeom prst="rect"/>
+                        <a:prstGeom prst="rect">
+                          <a:avLst/>
+                        </a:prstGeom>
                         <a:ln/>
                       </pic:spPr>
                     </pic:pic>
@@ -2410,74 +1951,42 @@
               </wp:inline>
             </w:drawing>
           </w:r>
-          <w:r>
-            <w:rPr>
-              <w:rtl w:val="0"/>
-            </w:rPr>
-          </w:r>
         </w:p>
       </w:tc>
     </w:tr>
   </w:tbl>
   <w:p>
     <w:pPr>
-      <w:keepNext w:val="0"/>
-      <w:keepLines w:val="0"/>
-      <w:pageBreakBefore w:val="0"/>
-      <w:widowControl w:val="1"/>
       <w:pBdr>
-        <w:top w:space="0" w:sz="0" w:val="nil"/>
-        <w:left w:space="0" w:sz="0" w:val="nil"/>
-        <w:bottom w:space="0" w:sz="0" w:val="nil"/>
-        <w:right w:space="0" w:sz="0" w:val="nil"/>
-        <w:between w:space="0" w:sz="0" w:val="nil"/>
+        <w:top w:val="nil"/>
+        <w:left w:val="nil"/>
+        <w:bottom w:val="nil"/>
+        <w:right w:val="nil"/>
+        <w:between w:val="nil"/>
       </w:pBdr>
-      <w:shd w:fill="auto" w:val="clear"/>
       <w:tabs>
-        <w:tab w:val="center" w:leader="none" w:pos="4419"/>
-        <w:tab w:val="right" w:leader="none" w:pos="8838"/>
+        <w:tab w:val="center" w:pos="4419"/>
+        <w:tab w:val="right" w:pos="8838"/>
       </w:tabs>
-      <w:spacing w:after="0" w:before="0" w:line="240" w:lineRule="auto"/>
-      <w:ind w:left="0" w:right="0" w:firstLine="0"/>
+      <w:spacing w:after="0" w:line="240" w:lineRule="auto"/>
       <w:jc w:val="right"/>
       <w:rPr>
-        <w:rFonts w:ascii="Calibri" w:cs="Calibri" w:eastAsia="Calibri" w:hAnsi="Calibri"/>
-        <w:b w:val="0"/>
-        <w:bCs w:val="0"/>
-        <w:i w:val="0"/>
-        <w:iCs w:val="0"/>
-        <w:smallCaps w:val="0"/>
-        <w:strike w:val="0"/>
         <w:color w:val="000000"/>
-        <w:sz w:val="22"/>
-        <w:szCs w:val="22"/>
-        <w:u w:val="none"/>
-        <w:shd w:fill="auto" w:val="clear"/>
-        <w:vertAlign w:val="baseline"/>
       </w:rPr>
     </w:pPr>
-    <w:r>
-      <w:rPr>
-        <w:rtl w:val="0"/>
-      </w:rPr>
-    </w:r>
   </w:p>
 </w:hdr>
 </file>
 
-<file path=word/numbering.xml><?xml version="1.0" encoding="utf-8"?>
-<w:numbering xmlns:mc="http://schemas.openxmlformats.org/markup-compatibility/2006" xmlns:o="urn:schemas-microsoft-com:office:office" xmlns:r="http://schemas.openxmlformats.org/officeDocument/2006/relationships" xmlns:m="http://schemas.openxmlformats.org/officeDocument/2006/math" xmlns:v="urn:schemas-microsoft-com:vml" xmlns:wp="http://schemas.openxmlformats.org/drawingml/2006/wordprocessingDrawing" xmlns:w10="urn:schemas-microsoft-com:office:word" xmlns:w="http://schemas.openxmlformats.org/wordprocessingml/2006/main" xmlns:wne="http://schemas.microsoft.com/office/word/2006/wordml" xmlns:sl="http://schemas.openxmlformats.org/schemaLibrary/2006/main" xmlns:a="http://schemas.openxmlformats.org/drawingml/2006/main" xmlns:pic="http://schemas.openxmlformats.org/drawingml/2006/picture" xmlns:c="http://schemas.openxmlformats.org/drawingml/2006/chart" xmlns:lc="http://schemas.openxmlformats.org/drawingml/2006/lockedCanvas" xmlns:dgm="http://schemas.openxmlformats.org/drawingml/2006/diagram" xmlns:wps="http://schemas.microsoft.com/office/word/2010/wordprocessingShape" xmlns:wpg="http://schemas.microsoft.com/office/word/2010/wordprocessingGroup" xmlns:w14="http://schemas.microsoft.com/office/word/2010/wordml" xmlns:w15="http://schemas.microsoft.com/office/word/2012/wordml" xmlns:w16="http://schemas.microsoft.com/office/word/2018/wordml" xmlns:w16cex="http://schemas.microsoft.com/office/word/2018/wordml/cex" xmlns:w16cid="http://schemas.microsoft.com/office/word/2016/wordml/cid" xmlns="http://schemas.microsoft.com/office/tasks/2019/documenttasks" xmlns:cr="http://schemas.microsoft.com/office/comments/2020/reactions"/>
-</file>
-
 <file path=word/styles.xml><?xml version="1.0" encoding="utf-8"?>
-<w:styles xmlns:mc="http://schemas.openxmlformats.org/markup-compatibility/2006" xmlns:o="urn:schemas-microsoft-com:office:office" xmlns:r="http://schemas.openxmlformats.org/officeDocument/2006/relationships" xmlns:m="http://schemas.openxmlformats.org/officeDocument/2006/math" xmlns:v="urn:schemas-microsoft-com:vml" xmlns:wp="http://schemas.openxmlformats.org/drawingml/2006/wordprocessingDrawing" xmlns:w10="urn:schemas-microsoft-com:office:word" xmlns:w="http://schemas.openxmlformats.org/wordprocessingml/2006/main" xmlns:wne="http://schemas.microsoft.com/office/word/2006/wordml" xmlns:sl="http://schemas.openxmlformats.org/schemaLibrary/2006/main" xmlns:a="http://schemas.openxmlformats.org/drawingml/2006/main" xmlns:pic="http://schemas.openxmlformats.org/drawingml/2006/picture" xmlns:c="http://schemas.openxmlformats.org/drawingml/2006/chart" xmlns:lc="http://schemas.openxmlformats.org/drawingml/2006/lockedCanvas" xmlns:dgm="http://schemas.openxmlformats.org/drawingml/2006/diagram" xmlns:wps="http://schemas.microsoft.com/office/word/2010/wordprocessingShape" xmlns:wpg="http://schemas.microsoft.com/office/word/2010/wordprocessingGroup" xmlns:w14="http://schemas.microsoft.com/office/word/2010/wordml" xmlns:w15="http://schemas.microsoft.com/office/word/2012/wordml" xmlns:w16="http://schemas.microsoft.com/office/word/2018/wordml" xmlns:w16cex="http://schemas.microsoft.com/office/word/2018/wordml/cex" xmlns:w16cid="http://schemas.microsoft.com/office/word/2016/wordml/cid" xmlns="http://schemas.microsoft.com/office/tasks/2019/documenttasks" xmlns:cr="http://schemas.microsoft.com/office/comments/2020/reactions">
+<w:styles xmlns:mc="http://schemas.openxmlformats.org/markup-compatibility/2006" xmlns:r="http://schemas.openxmlformats.org/officeDocument/2006/relationships" xmlns:w="http://schemas.openxmlformats.org/wordprocessingml/2006/main" xmlns:w14="http://schemas.microsoft.com/office/word/2010/wordml" xmlns:w15="http://schemas.microsoft.com/office/word/2012/wordml" xmlns:w16cex="http://schemas.microsoft.com/office/word/2018/wordml/cex" xmlns:w16cid="http://schemas.microsoft.com/office/word/2016/wordml/cid" xmlns:w16="http://schemas.microsoft.com/office/word/2018/wordml" xmlns:w16du="http://schemas.microsoft.com/office/word/2023/wordml/word16du" xmlns:w16sdtdh="http://schemas.microsoft.com/office/word/2020/wordml/sdtdatahash" xmlns:w16sdtfl="http://schemas.microsoft.com/office/word/2024/wordml/sdtformatlock" xmlns:w16se="http://schemas.microsoft.com/office/word/2015/wordml/symex" mc:Ignorable="w14 w15 w16se w16cid w16 w16cex w16sdtdh w16sdtfl w16du">
   <w:docDefaults>
     <w:rPrDefault>
       <w:rPr>
-        <w:rFonts w:ascii="Calibri" w:cs="Calibri" w:eastAsia="Calibri" w:hAnsi="Calibri"/>
+        <w:rFonts w:ascii="Calibri" w:eastAsia="Calibri" w:hAnsi="Calibri" w:cs="Calibri"/>
         <w:sz w:val="22"/>
         <w:szCs w:val="22"/>
-        <w:lang w:val="es-CL"/>
+        <w:lang w:val="es-CL" w:eastAsia="es-CL" w:bidi="ar-SA"/>
       </w:rPr>
     </w:rPrDefault>
     <w:pPrDefault>
@@ -2486,174 +1995,573 @@
       </w:pPr>
     </w:pPrDefault>
   </w:docDefaults>
-  <w:style w:type="table" w:styleId="TableNormal" w:default="1">
+  <w:latentStyles w:defLockedState="0" w:defUIPriority="99" w:defSemiHidden="0" w:defUnhideWhenUsed="0" w:defQFormat="0" w:count="376">
+    <w:lsdException w:name="Normal" w:uiPriority="0" w:qFormat="1"/>
+    <w:lsdException w:name="heading 1" w:uiPriority="9" w:qFormat="1"/>
+    <w:lsdException w:name="heading 2" w:semiHidden="1" w:uiPriority="9" w:unhideWhenUsed="1" w:qFormat="1"/>
+    <w:lsdException w:name="heading 3" w:semiHidden="1" w:uiPriority="9" w:unhideWhenUsed="1" w:qFormat="1"/>
+    <w:lsdException w:name="heading 4" w:semiHidden="1" w:uiPriority="9" w:unhideWhenUsed="1" w:qFormat="1"/>
+    <w:lsdException w:name="heading 5" w:semiHidden="1" w:uiPriority="9" w:unhideWhenUsed="1" w:qFormat="1"/>
+    <w:lsdException w:name="heading 6" w:semiHidden="1" w:uiPriority="9" w:unhideWhenUsed="1" w:qFormat="1"/>
+    <w:lsdException w:name="heading 7" w:semiHidden="1" w:uiPriority="9" w:unhideWhenUsed="1" w:qFormat="1"/>
+    <w:lsdException w:name="heading 8" w:semiHidden="1" w:uiPriority="9" w:unhideWhenUsed="1" w:qFormat="1"/>
+    <w:lsdException w:name="heading 9" w:semiHidden="1" w:uiPriority="9" w:unhideWhenUsed="1" w:qFormat="1"/>
+    <w:lsdException w:name="index 1" w:semiHidden="1" w:unhideWhenUsed="1"/>
+    <w:lsdException w:name="index 2" w:semiHidden="1" w:unhideWhenUsed="1"/>
+    <w:lsdException w:name="index 3" w:semiHidden="1" w:unhideWhenUsed="1"/>
+    <w:lsdException w:name="index 4" w:semiHidden="1" w:unhideWhenUsed="1"/>
+    <w:lsdException w:name="index 5" w:semiHidden="1" w:unhideWhenUsed="1"/>
+    <w:lsdException w:name="index 6" w:semiHidden="1" w:unhideWhenUsed="1"/>
+    <w:lsdException w:name="index 7" w:semiHidden="1" w:unhideWhenUsed="1"/>
+    <w:lsdException w:name="index 8" w:semiHidden="1" w:unhideWhenUsed="1"/>
+    <w:lsdException w:name="index 9" w:semiHidden="1" w:unhideWhenUsed="1"/>
+    <w:lsdException w:name="toc 1" w:semiHidden="1" w:uiPriority="39" w:unhideWhenUsed="1"/>
+    <w:lsdException w:name="toc 2" w:semiHidden="1" w:uiPriority="39" w:unhideWhenUsed="1"/>
+    <w:lsdException w:name="toc 3" w:semiHidden="1" w:uiPriority="39" w:unhideWhenUsed="1"/>
+    <w:lsdException w:name="toc 4" w:semiHidden="1" w:uiPriority="39" w:unhideWhenUsed="1"/>
+    <w:lsdException w:name="toc 5" w:semiHidden="1" w:uiPriority="39" w:unhideWhenUsed="1"/>
+    <w:lsdException w:name="toc 6" w:semiHidden="1" w:uiPriority="39" w:unhideWhenUsed="1"/>
+    <w:lsdException w:name="toc 7" w:semiHidden="1" w:uiPriority="39" w:unhideWhenUsed="1"/>
+    <w:lsdException w:name="toc 8" w:semiHidden="1" w:uiPriority="39" w:unhideWhenUsed="1"/>
+    <w:lsdException w:name="toc 9" w:semiHidden="1" w:uiPriority="39" w:unhideWhenUsed="1"/>
+    <w:lsdException w:name="Normal Indent" w:semiHidden="1" w:unhideWhenUsed="1"/>
+    <w:lsdException w:name="footnote text" w:semiHidden="1" w:unhideWhenUsed="1"/>
+    <w:lsdException w:name="annotation text" w:semiHidden="1" w:unhideWhenUsed="1"/>
+    <w:lsdException w:name="header" w:semiHidden="1" w:unhideWhenUsed="1"/>
+    <w:lsdException w:name="footer" w:semiHidden="1" w:unhideWhenUsed="1"/>
+    <w:lsdException w:name="index heading" w:semiHidden="1" w:unhideWhenUsed="1"/>
+    <w:lsdException w:name="caption" w:semiHidden="1" w:uiPriority="35" w:unhideWhenUsed="1" w:qFormat="1"/>
+    <w:lsdException w:name="table of figures" w:semiHidden="1" w:unhideWhenUsed="1"/>
+    <w:lsdException w:name="envelope address" w:semiHidden="1" w:unhideWhenUsed="1"/>
+    <w:lsdException w:name="envelope return" w:semiHidden="1" w:unhideWhenUsed="1"/>
+    <w:lsdException w:name="footnote reference" w:semiHidden="1" w:unhideWhenUsed="1"/>
+    <w:lsdException w:name="annotation reference" w:semiHidden="1" w:unhideWhenUsed="1"/>
+    <w:lsdException w:name="line number" w:semiHidden="1" w:unhideWhenUsed="1"/>
+    <w:lsdException w:name="page number" w:semiHidden="1" w:unhideWhenUsed="1"/>
+    <w:lsdException w:name="endnote reference" w:semiHidden="1" w:unhideWhenUsed="1"/>
+    <w:lsdException w:name="endnote text" w:semiHidden="1" w:unhideWhenUsed="1"/>
+    <w:lsdException w:name="table of authorities" w:semiHidden="1" w:unhideWhenUsed="1"/>
+    <w:lsdException w:name="macro" w:semiHidden="1" w:unhideWhenUsed="1"/>
+    <w:lsdException w:name="toa heading" w:semiHidden="1" w:unhideWhenUsed="1"/>
+    <w:lsdException w:name="List" w:semiHidden="1" w:unhideWhenUsed="1"/>
+    <w:lsdException w:name="List Bullet" w:semiHidden="1" w:unhideWhenUsed="1"/>
+    <w:lsdException w:name="List Number" w:semiHidden="1" w:unhideWhenUsed="1"/>
+    <w:lsdException w:name="List 2" w:semiHidden="1" w:unhideWhenUsed="1"/>
+    <w:lsdException w:name="List 3" w:semiHidden="1" w:unhideWhenUsed="1"/>
+    <w:lsdException w:name="List 4" w:semiHidden="1" w:unhideWhenUsed="1"/>
+    <w:lsdException w:name="List 5" w:semiHidden="1" w:unhideWhenUsed="1"/>
+    <w:lsdException w:name="List Bullet 2" w:semiHidden="1" w:unhideWhenUsed="1"/>
+    <w:lsdException w:name="List Bullet 3" w:semiHidden="1" w:unhideWhenUsed="1"/>
+    <w:lsdException w:name="List Bullet 4" w:semiHidden="1" w:unhideWhenUsed="1"/>
+    <w:lsdException w:name="List Bullet 5" w:semiHidden="1" w:unhideWhenUsed="1"/>
+    <w:lsdException w:name="List Number 2" w:semiHidden="1" w:unhideWhenUsed="1"/>
+    <w:lsdException w:name="List Number 3" w:semiHidden="1" w:unhideWhenUsed="1"/>
+    <w:lsdException w:name="List Number 4" w:semiHidden="1" w:unhideWhenUsed="1"/>
+    <w:lsdException w:name="List Number 5" w:semiHidden="1" w:unhideWhenUsed="1"/>
+    <w:lsdException w:name="Title" w:uiPriority="10" w:qFormat="1"/>
+    <w:lsdException w:name="Closing" w:semiHidden="1" w:unhideWhenUsed="1"/>
+    <w:lsdException w:name="Signature" w:semiHidden="1" w:unhideWhenUsed="1"/>
+    <w:lsdException w:name="Default Paragraph Font" w:semiHidden="1" w:uiPriority="1" w:unhideWhenUsed="1"/>
+    <w:lsdException w:name="Body Text" w:semiHidden="1" w:unhideWhenUsed="1"/>
+    <w:lsdException w:name="Body Text Indent" w:semiHidden="1" w:unhideWhenUsed="1"/>
+    <w:lsdException w:name="List Continue" w:semiHidden="1" w:unhideWhenUsed="1"/>
+    <w:lsdException w:name="List Continue 2" w:semiHidden="1" w:unhideWhenUsed="1"/>
+    <w:lsdException w:name="List Continue 3" w:semiHidden="1" w:unhideWhenUsed="1"/>
+    <w:lsdException w:name="List Continue 4" w:semiHidden="1" w:unhideWhenUsed="1"/>
+    <w:lsdException w:name="List Continue 5" w:semiHidden="1" w:unhideWhenUsed="1"/>
+    <w:lsdException w:name="Message Header" w:semiHidden="1" w:unhideWhenUsed="1"/>
+    <w:lsdException w:name="Subtitle" w:uiPriority="11" w:qFormat="1"/>
+    <w:lsdException w:name="Salutation" w:semiHidden="1" w:unhideWhenUsed="1"/>
+    <w:lsdException w:name="Date" w:semiHidden="1" w:unhideWhenUsed="1"/>
+    <w:lsdException w:name="Body Text First Indent" w:semiHidden="1" w:unhideWhenUsed="1"/>
+    <w:lsdException w:name="Body Text First Indent 2" w:semiHidden="1" w:unhideWhenUsed="1"/>
+    <w:lsdException w:name="Note Heading" w:semiHidden="1" w:unhideWhenUsed="1"/>
+    <w:lsdException w:name="Body Text 2" w:semiHidden="1" w:unhideWhenUsed="1"/>
+    <w:lsdException w:name="Body Text 3" w:semiHidden="1" w:unhideWhenUsed="1"/>
+    <w:lsdException w:name="Body Text Indent 2" w:semiHidden="1" w:unhideWhenUsed="1"/>
+    <w:lsdException w:name="Body Text Indent 3" w:semiHidden="1" w:unhideWhenUsed="1"/>
+    <w:lsdException w:name="Block Text" w:semiHidden="1" w:unhideWhenUsed="1"/>
+    <w:lsdException w:name="Hyperlink" w:semiHidden="1" w:unhideWhenUsed="1"/>
+    <w:lsdException w:name="FollowedHyperlink" w:semiHidden="1" w:unhideWhenUsed="1"/>
+    <w:lsdException w:name="Strong" w:uiPriority="22" w:qFormat="1"/>
+    <w:lsdException w:name="Emphasis" w:uiPriority="20" w:qFormat="1"/>
+    <w:lsdException w:name="Document Map" w:semiHidden="1" w:unhideWhenUsed="1"/>
+    <w:lsdException w:name="Plain Text" w:semiHidden="1" w:unhideWhenUsed="1"/>
+    <w:lsdException w:name="E-mail Signature" w:semiHidden="1" w:unhideWhenUsed="1"/>
+    <w:lsdException w:name="HTML Top of Form" w:semiHidden="1" w:unhideWhenUsed="1"/>
+    <w:lsdException w:name="HTML Bottom of Form" w:semiHidden="1" w:unhideWhenUsed="1"/>
+    <w:lsdException w:name="Normal (Web)" w:semiHidden="1" w:unhideWhenUsed="1"/>
+    <w:lsdException w:name="HTML Acronym" w:semiHidden="1" w:unhideWhenUsed="1"/>
+    <w:lsdException w:name="HTML Address" w:semiHidden="1" w:unhideWhenUsed="1"/>
+    <w:lsdException w:name="HTML Cite" w:semiHidden="1" w:unhideWhenUsed="1"/>
+    <w:lsdException w:name="HTML Code" w:semiHidden="1" w:unhideWhenUsed="1"/>
+    <w:lsdException w:name="HTML Definition" w:semiHidden="1" w:unhideWhenUsed="1"/>
+    <w:lsdException w:name="HTML Keyboard" w:semiHidden="1" w:unhideWhenUsed="1"/>
+    <w:lsdException w:name="HTML Preformatted" w:semiHidden="1" w:unhideWhenUsed="1"/>
+    <w:lsdException w:name="HTML Sample" w:semiHidden="1" w:unhideWhenUsed="1"/>
+    <w:lsdException w:name="HTML Typewriter" w:semiHidden="1" w:unhideWhenUsed="1"/>
+    <w:lsdException w:name="HTML Variable" w:semiHidden="1" w:unhideWhenUsed="1"/>
+    <w:lsdException w:name="Normal Table" w:semiHidden="1" w:unhideWhenUsed="1"/>
+    <w:lsdException w:name="annotation subject" w:semiHidden="1" w:unhideWhenUsed="1"/>
+    <w:lsdException w:name="No List" w:semiHidden="1" w:unhideWhenUsed="1"/>
+    <w:lsdException w:name="Outline List 1" w:semiHidden="1" w:unhideWhenUsed="1"/>
+    <w:lsdException w:name="Outline List 2" w:semiHidden="1" w:unhideWhenUsed="1"/>
+    <w:lsdException w:name="Outline List 3" w:semiHidden="1" w:unhideWhenUsed="1"/>
+    <w:lsdException w:name="Table Simple 1" w:semiHidden="1" w:unhideWhenUsed="1"/>
+    <w:lsdException w:name="Table Simple 2" w:semiHidden="1" w:unhideWhenUsed="1"/>
+    <w:lsdException w:name="Table Simple 3" w:semiHidden="1" w:unhideWhenUsed="1"/>
+    <w:lsdException w:name="Table Classic 1" w:semiHidden="1" w:unhideWhenUsed="1"/>
+    <w:lsdException w:name="Table Classic 2" w:semiHidden="1" w:unhideWhenUsed="1"/>
+    <w:lsdException w:name="Table Classic 3" w:semiHidden="1" w:unhideWhenUsed="1"/>
+    <w:lsdException w:name="Table Classic 4" w:semiHidden="1" w:unhideWhenUsed="1"/>
+    <w:lsdException w:name="Table Colorful 1" w:semiHidden="1" w:unhideWhenUsed="1"/>
+    <w:lsdException w:name="Table Colorful 2" w:semiHidden="1" w:unhideWhenUsed="1"/>
+    <w:lsdException w:name="Table Colorful 3" w:semiHidden="1" w:unhideWhenUsed="1"/>
+    <w:lsdException w:name="Table Columns 1" w:semiHidden="1" w:unhideWhenUsed="1"/>
+    <w:lsdException w:name="Table Columns 2" w:semiHidden="1" w:unhideWhenUsed="1"/>
+    <w:lsdException w:name="Table Columns 3" w:semiHidden="1" w:unhideWhenUsed="1"/>
+    <w:lsdException w:name="Table Columns 4" w:semiHidden="1" w:unhideWhenUsed="1"/>
+    <w:lsdException w:name="Table Columns 5" w:semiHidden="1" w:unhideWhenUsed="1"/>
+    <w:lsdException w:name="Table Grid 1" w:semiHidden="1" w:unhideWhenUsed="1"/>
+    <w:lsdException w:name="Table Grid 2" w:semiHidden="1" w:unhideWhenUsed="1"/>
+    <w:lsdException w:name="Table Grid 3" w:semiHidden="1" w:unhideWhenUsed="1"/>
+    <w:lsdException w:name="Table Grid 4" w:semiHidden="1" w:unhideWhenUsed="1"/>
+    <w:lsdException w:name="Table Grid 5" w:semiHidden="1" w:unhideWhenUsed="1"/>
+    <w:lsdException w:name="Table Grid 6" w:semiHidden="1" w:unhideWhenUsed="1"/>
+    <w:lsdException w:name="Table Grid 7" w:semiHidden="1" w:unhideWhenUsed="1"/>
+    <w:lsdException w:name="Table Grid 8" w:semiHidden="1" w:unhideWhenUsed="1"/>
+    <w:lsdException w:name="Table List 1" w:semiHidden="1" w:unhideWhenUsed="1"/>
+    <w:lsdException w:name="Table List 2" w:semiHidden="1" w:unhideWhenUsed="1"/>
+    <w:lsdException w:name="Table List 3" w:semiHidden="1" w:unhideWhenUsed="1"/>
+    <w:lsdException w:name="Table List 4" w:semiHidden="1" w:unhideWhenUsed="1"/>
+    <w:lsdException w:name="Table List 5" w:semiHidden="1" w:unhideWhenUsed="1"/>
+    <w:lsdException w:name="Table List 6" w:semiHidden="1" w:unhideWhenUsed="1"/>
+    <w:lsdException w:name="Table List 7" w:semiHidden="1" w:unhideWhenUsed="1"/>
+    <w:lsdException w:name="Table List 8" w:semiHidden="1" w:unhideWhenUsed="1"/>
+    <w:lsdException w:name="Table 3D effects 1" w:semiHidden="1" w:unhideWhenUsed="1"/>
+    <w:lsdException w:name="Table 3D effects 2" w:semiHidden="1" w:unhideWhenUsed="1"/>
+    <w:lsdException w:name="Table 3D effects 3" w:semiHidden="1" w:unhideWhenUsed="1"/>
+    <w:lsdException w:name="Table Contemporary" w:semiHidden="1" w:unhideWhenUsed="1"/>
+    <w:lsdException w:name="Table Elegant" w:semiHidden="1" w:unhideWhenUsed="1"/>
+    <w:lsdException w:name="Table Professional" w:semiHidden="1" w:unhideWhenUsed="1"/>
+    <w:lsdException w:name="Table Subtle 1" w:semiHidden="1" w:unhideWhenUsed="1"/>
+    <w:lsdException w:name="Table Subtle 2" w:semiHidden="1" w:unhideWhenUsed="1"/>
+    <w:lsdException w:name="Table Web 1" w:semiHidden="1" w:unhideWhenUsed="1"/>
+    <w:lsdException w:name="Table Web 2" w:semiHidden="1" w:unhideWhenUsed="1"/>
+    <w:lsdException w:name="Table Web 3" w:semiHidden="1" w:unhideWhenUsed="1"/>
+    <w:lsdException w:name="Balloon Text" w:semiHidden="1" w:unhideWhenUsed="1"/>
+    <w:lsdException w:name="Table Grid" w:uiPriority="39"/>
+    <w:lsdException w:name="Table Theme" w:semiHidden="1" w:unhideWhenUsed="1"/>
+    <w:lsdException w:name="Placeholder Text" w:semiHidden="1"/>
+    <w:lsdException w:name="No Spacing" w:uiPriority="1" w:qFormat="1"/>
+    <w:lsdException w:name="Light Shading" w:uiPriority="60"/>
+    <w:lsdException w:name="Light List" w:uiPriority="61"/>
+    <w:lsdException w:name="Light Grid" w:uiPriority="62"/>
+    <w:lsdException w:name="Medium Shading 1" w:uiPriority="63"/>
+    <w:lsdException w:name="Medium Shading 2" w:uiPriority="64"/>
+    <w:lsdException w:name="Medium List 1" w:uiPriority="65"/>
+    <w:lsdException w:name="Medium List 2" w:uiPriority="66"/>
+    <w:lsdException w:name="Medium Grid 1" w:uiPriority="67"/>
+    <w:lsdException w:name="Medium Grid 2" w:uiPriority="68"/>
+    <w:lsdException w:name="Medium Grid 3" w:uiPriority="69"/>
+    <w:lsdException w:name="Dark List" w:uiPriority="70"/>
+    <w:lsdException w:name="Colorful Shading" w:uiPriority="71"/>
+    <w:lsdException w:name="Colorful List" w:uiPriority="72"/>
+    <w:lsdException w:name="Colorful Grid" w:uiPriority="73"/>
+    <w:lsdException w:name="Light Shading Accent 1" w:uiPriority="60"/>
+    <w:lsdException w:name="Light List Accent 1" w:uiPriority="61"/>
+    <w:lsdException w:name="Light Grid Accent 1" w:uiPriority="62"/>
+    <w:lsdException w:name="Medium Shading 1 Accent 1" w:uiPriority="63"/>
+    <w:lsdException w:name="Medium Shading 2 Accent 1" w:uiPriority="64"/>
+    <w:lsdException w:name="Medium List 1 Accent 1" w:uiPriority="65"/>
+    <w:lsdException w:name="Revision" w:semiHidden="1"/>
+    <w:lsdException w:name="List Paragraph" w:uiPriority="34" w:qFormat="1"/>
+    <w:lsdException w:name="Quote" w:uiPriority="29" w:qFormat="1"/>
+    <w:lsdException w:name="Intense Quote" w:uiPriority="30" w:qFormat="1"/>
+    <w:lsdException w:name="Medium List 2 Accent 1" w:uiPriority="66"/>
+    <w:lsdException w:name="Medium Grid 1 Accent 1" w:uiPriority="67"/>
+    <w:lsdException w:name="Medium Grid 2 Accent 1" w:uiPriority="68"/>
+    <w:lsdException w:name="Medium Grid 3 Accent 1" w:uiPriority="69"/>
+    <w:lsdException w:name="Dark List Accent 1" w:uiPriority="70"/>
+    <w:lsdException w:name="Colorful Shading Accent 1" w:uiPriority="71"/>
+    <w:lsdException w:name="Colorful List Accent 1" w:uiPriority="72"/>
+    <w:lsdException w:name="Colorful Grid Accent 1" w:uiPriority="73"/>
+    <w:lsdException w:name="Light Shading Accent 2" w:uiPriority="60"/>
+    <w:lsdException w:name="Light List Accent 2" w:uiPriority="61"/>
+    <w:lsdException w:name="Light Grid Accent 2" w:uiPriority="62"/>
+    <w:lsdException w:name="Medium Shading 1 Accent 2" w:uiPriority="63"/>
+    <w:lsdException w:name="Medium Shading 2 Accent 2" w:uiPriority="64"/>
+    <w:lsdException w:name="Medium List 1 Accent 2" w:uiPriority="65"/>
+    <w:lsdException w:name="Medium List 2 Accent 2" w:uiPriority="66"/>
+    <w:lsdException w:name="Medium Grid 1 Accent 2" w:uiPriority="67"/>
+    <w:lsdException w:name="Medium Grid 2 Accent 2" w:uiPriority="68"/>
+    <w:lsdException w:name="Medium Grid 3 Accent 2" w:uiPriority="69"/>
+    <w:lsdException w:name="Dark List Accent 2" w:uiPriority="70"/>
+    <w:lsdException w:name="Colorful Shading Accent 2" w:uiPriority="71"/>
+    <w:lsdException w:name="Colorful List Accent 2" w:uiPriority="72"/>
+    <w:lsdException w:name="Colorful Grid Accent 2" w:uiPriority="73"/>
+    <w:lsdException w:name="Light Shading Accent 3" w:uiPriority="60"/>
+    <w:lsdException w:name="Light List Accent 3" w:uiPriority="61"/>
+    <w:lsdException w:name="Light Grid Accent 3" w:uiPriority="62"/>
+    <w:lsdException w:name="Medium Shading 1 Accent 3" w:uiPriority="63"/>
+    <w:lsdException w:name="Medium Shading 2 Accent 3" w:uiPriority="64"/>
+    <w:lsdException w:name="Medium List 1 Accent 3" w:uiPriority="65"/>
+    <w:lsdException w:name="Medium List 2 Accent 3" w:uiPriority="66"/>
+    <w:lsdException w:name="Medium Grid 1 Accent 3" w:uiPriority="67"/>
+    <w:lsdException w:name="Medium Grid 2 Accent 3" w:uiPriority="68"/>
+    <w:lsdException w:name="Medium Grid 3 Accent 3" w:uiPriority="69"/>
+    <w:lsdException w:name="Dark List Accent 3" w:uiPriority="70"/>
+    <w:lsdException w:name="Colorful Shading Accent 3" w:uiPriority="71"/>
+    <w:lsdException w:name="Colorful List Accent 3" w:uiPriority="72"/>
+    <w:lsdException w:name="Colorful Grid Accent 3" w:uiPriority="73"/>
+    <w:lsdException w:name="Light Shading Accent 4" w:uiPriority="60"/>
+    <w:lsdException w:name="Light List Accent 4" w:uiPriority="61"/>
+    <w:lsdException w:name="Light Grid Accent 4" w:uiPriority="62"/>
+    <w:lsdException w:name="Medium Shading 1 Accent 4" w:uiPriority="63"/>
+    <w:lsdException w:name="Medium Shading 2 Accent 4" w:uiPriority="64"/>
+    <w:lsdException w:name="Medium List 1 Accent 4" w:uiPriority="65"/>
+    <w:lsdException w:name="Medium List 2 Accent 4" w:uiPriority="66"/>
+    <w:lsdException w:name="Medium Grid 1 Accent 4" w:uiPriority="67"/>
+    <w:lsdException w:name="Medium Grid 2 Accent 4" w:uiPriority="68"/>
+    <w:lsdException w:name="Medium Grid 3 Accent 4" w:uiPriority="69"/>
+    <w:lsdException w:name="Dark List Accent 4" w:uiPriority="70"/>
+    <w:lsdException w:name="Colorful Shading Accent 4" w:uiPriority="71"/>
+    <w:lsdException w:name="Colorful List Accent 4" w:uiPriority="72"/>
+    <w:lsdException w:name="Colorful Grid Accent 4" w:uiPriority="73"/>
+    <w:lsdException w:name="Light Shading Accent 5" w:uiPriority="60"/>
+    <w:lsdException w:name="Light List Accent 5" w:uiPriority="61"/>
+    <w:lsdException w:name="Light Grid Accent 5" w:uiPriority="62"/>
+    <w:lsdException w:name="Medium Shading 1 Accent 5" w:uiPriority="63"/>
+    <w:lsdException w:name="Medium Shading 2 Accent 5" w:uiPriority="64"/>
+    <w:lsdException w:name="Medium List 1 Accent 5" w:uiPriority="65"/>
+    <w:lsdException w:name="Medium List 2 Accent 5" w:uiPriority="66"/>
+    <w:lsdException w:name="Medium Grid 1 Accent 5" w:uiPriority="67"/>
+    <w:lsdException w:name="Medium Grid 2 Accent 5" w:uiPriority="68"/>
+    <w:lsdException w:name="Medium Grid 3 Accent 5" w:uiPriority="69"/>
+    <w:lsdException w:name="Dark List Accent 5" w:uiPriority="70"/>
+    <w:lsdException w:name="Colorful Shading Accent 5" w:uiPriority="71"/>
+    <w:lsdException w:name="Colorful List Accent 5" w:uiPriority="72"/>
+    <w:lsdException w:name="Colorful Grid Accent 5" w:uiPriority="73"/>
+    <w:lsdException w:name="Light Shading Accent 6" w:uiPriority="60"/>
+    <w:lsdException w:name="Light List Accent 6" w:uiPriority="61"/>
+    <w:lsdException w:name="Light Grid Accent 6" w:uiPriority="62"/>
+    <w:lsdException w:name="Medium Shading 1 Accent 6" w:uiPriority="63"/>
+    <w:lsdException w:name="Medium Shading 2 Accent 6" w:uiPriority="64"/>
+    <w:lsdException w:name="Medium List 1 Accent 6" w:uiPriority="65"/>
+    <w:lsdException w:name="Medium List 2 Accent 6" w:uiPriority="66"/>
+    <w:lsdException w:name="Medium Grid 1 Accent 6" w:uiPriority="67"/>
+    <w:lsdException w:name="Medium Grid 2 Accent 6" w:uiPriority="68"/>
+    <w:lsdException w:name="Medium Grid 3 Accent 6" w:uiPriority="69"/>
+    <w:lsdException w:name="Dark List Accent 6" w:uiPriority="70"/>
+    <w:lsdException w:name="Colorful Shading Accent 6" w:uiPriority="71"/>
+    <w:lsdException w:name="Colorful List Accent 6" w:uiPriority="72"/>
+    <w:lsdException w:name="Colorful Grid Accent 6" w:uiPriority="73"/>
+    <w:lsdException w:name="Subtle Emphasis" w:uiPriority="19" w:qFormat="1"/>
+    <w:lsdException w:name="Intense Emphasis" w:uiPriority="21" w:qFormat="1"/>
+    <w:lsdException w:name="Subtle Reference" w:uiPriority="31" w:qFormat="1"/>
+    <w:lsdException w:name="Intense Reference" w:uiPriority="32" w:qFormat="1"/>
+    <w:lsdException w:name="Book Title" w:uiPriority="33" w:qFormat="1"/>
+    <w:lsdException w:name="Bibliography" w:semiHidden="1" w:uiPriority="37" w:unhideWhenUsed="1"/>
+    <w:lsdException w:name="TOC Heading" w:semiHidden="1" w:uiPriority="39" w:unhideWhenUsed="1" w:qFormat="1"/>
+    <w:lsdException w:name="Plain Table 1" w:uiPriority="41"/>
+    <w:lsdException w:name="Plain Table 2" w:uiPriority="42"/>
+    <w:lsdException w:name="Plain Table 3" w:uiPriority="43"/>
+    <w:lsdException w:name="Plain Table 4" w:uiPriority="44"/>
+    <w:lsdException w:name="Plain Table 5" w:uiPriority="45"/>
+    <w:lsdException w:name="Grid Table Light" w:uiPriority="40"/>
+    <w:lsdException w:name="Grid Table 1 Light" w:uiPriority="46"/>
+    <w:lsdException w:name="Grid Table 2" w:uiPriority="47"/>
+    <w:lsdException w:name="Grid Table 3" w:uiPriority="48"/>
+    <w:lsdException w:name="Grid Table 4" w:uiPriority="49"/>
+    <w:lsdException w:name="Grid Table 5 Dark" w:uiPriority="50"/>
+    <w:lsdException w:name="Grid Table 6 Colorful" w:uiPriority="51"/>
+    <w:lsdException w:name="Grid Table 7 Colorful" w:uiPriority="52"/>
+    <w:lsdException w:name="Grid Table 1 Light Accent 1" w:uiPriority="46"/>
+    <w:lsdException w:name="Grid Table 2 Accent 1" w:uiPriority="47"/>
+    <w:lsdException w:name="Grid Table 3 Accent 1" w:uiPriority="48"/>
+    <w:lsdException w:name="Grid Table 4 Accent 1" w:uiPriority="49"/>
+    <w:lsdException w:name="Grid Table 5 Dark Accent 1" w:uiPriority="50"/>
+    <w:lsdException w:name="Grid Table 6 Colorful Accent 1" w:uiPriority="51"/>
+    <w:lsdException w:name="Grid Table 7 Colorful Accent 1" w:uiPriority="52"/>
+    <w:lsdException w:name="Grid Table 1 Light Accent 2" w:uiPriority="46"/>
+    <w:lsdException w:name="Grid Table 2 Accent 2" w:uiPriority="47"/>
+    <w:lsdException w:name="Grid Table 3 Accent 2" w:uiPriority="48"/>
+    <w:lsdException w:name="Grid Table 4 Accent 2" w:uiPriority="49"/>
+    <w:lsdException w:name="Grid Table 5 Dark Accent 2" w:uiPriority="50"/>
+    <w:lsdException w:name="Grid Table 6 Colorful Accent 2" w:uiPriority="51"/>
+    <w:lsdException w:name="Grid Table 7 Colorful Accent 2" w:uiPriority="52"/>
+    <w:lsdException w:name="Grid Table 1 Light Accent 3" w:uiPriority="46"/>
+    <w:lsdException w:name="Grid Table 2 Accent 3" w:uiPriority="47"/>
+    <w:lsdException w:name="Grid Table 3 Accent 3" w:uiPriority="48"/>
+    <w:lsdException w:name="Grid Table 4 Accent 3" w:uiPriority="49"/>
+    <w:lsdException w:name="Grid Table 5 Dark Accent 3" w:uiPriority="50"/>
+    <w:lsdException w:name="Grid Table 6 Colorful Accent 3" w:uiPriority="51"/>
+    <w:lsdException w:name="Grid Table 7 Colorful Accent 3" w:uiPriority="52"/>
+    <w:lsdException w:name="Grid Table 1 Light Accent 4" w:uiPriority="46"/>
+    <w:lsdException w:name="Grid Table 2 Accent 4" w:uiPriority="47"/>
+    <w:lsdException w:name="Grid Table 3 Accent 4" w:uiPriority="48"/>
+    <w:lsdException w:name="Grid Table 4 Accent 4" w:uiPriority="49"/>
+    <w:lsdException w:name="Grid Table 5 Dark Accent 4" w:uiPriority="50"/>
+    <w:lsdException w:name="Grid Table 6 Colorful Accent 4" w:uiPriority="51"/>
+    <w:lsdException w:name="Grid Table 7 Colorful Accent 4" w:uiPriority="52"/>
+    <w:lsdException w:name="Grid Table 1 Light Accent 5" w:uiPriority="46"/>
+    <w:lsdException w:name="Grid Table 2 Accent 5" w:uiPriority="47"/>
+    <w:lsdException w:name="Grid Table 3 Accent 5" w:uiPriority="48"/>
+    <w:lsdException w:name="Grid Table 4 Accent 5" w:uiPriority="49"/>
+    <w:lsdException w:name="Grid Table 5 Dark Accent 5" w:uiPriority="50"/>
+    <w:lsdException w:name="Grid Table 6 Colorful Accent 5" w:uiPriority="51"/>
+    <w:lsdException w:name="Grid Table 7 Colorful Accent 5" w:uiPriority="52"/>
+    <w:lsdException w:name="Grid Table 1 Light Accent 6" w:uiPriority="46"/>
+    <w:lsdException w:name="Grid Table 2 Accent 6" w:uiPriority="47"/>
+    <w:lsdException w:name="Grid Table 3 Accent 6" w:uiPriority="48"/>
+    <w:lsdException w:name="Grid Table 4 Accent 6" w:uiPriority="49"/>
+    <w:lsdException w:name="Grid Table 5 Dark Accent 6" w:uiPriority="50"/>
+    <w:lsdException w:name="Grid Table 6 Colorful Accent 6" w:uiPriority="51"/>
+    <w:lsdException w:name="Grid Table 7 Colorful Accent 6" w:uiPriority="52"/>
+    <w:lsdException w:name="List Table 1 Light" w:uiPriority="46"/>
+    <w:lsdException w:name="List Table 2" w:uiPriority="47"/>
+    <w:lsdException w:name="List Table 3" w:uiPriority="48"/>
+    <w:lsdException w:name="List Table 4" w:uiPriority="49"/>
+    <w:lsdException w:name="List Table 5 Dark" w:uiPriority="50"/>
+    <w:lsdException w:name="List Table 6 Colorful" w:uiPriority="51"/>
+    <w:lsdException w:name="List Table 7 Colorful" w:uiPriority="52"/>
+    <w:lsdException w:name="List Table 1 Light Accent 1" w:uiPriority="46"/>
+    <w:lsdException w:name="List Table 2 Accent 1" w:uiPriority="47"/>
+    <w:lsdException w:name="List Table 3 Accent 1" w:uiPriority="48"/>
+    <w:lsdException w:name="List Table 4 Accent 1" w:uiPriority="49"/>
+    <w:lsdException w:name="List Table 5 Dark Accent 1" w:uiPriority="50"/>
+    <w:lsdException w:name="List Table 6 Colorful Accent 1" w:uiPriority="51"/>
+    <w:lsdException w:name="List Table 7 Colorful Accent 1" w:uiPriority="52"/>
+    <w:lsdException w:name="List Table 1 Light Accent 2" w:uiPriority="46"/>
+    <w:lsdException w:name="List Table 2 Accent 2" w:uiPriority="47"/>
+    <w:lsdException w:name="List Table 3 Accent 2" w:uiPriority="48"/>
+    <w:lsdException w:name="List Table 4 Accent 2" w:uiPriority="49"/>
+    <w:lsdException w:name="List Table 5 Dark Accent 2" w:uiPriority="50"/>
+    <w:lsdException w:name="List Table 6 Colorful Accent 2" w:uiPriority="51"/>
+    <w:lsdException w:name="List Table 7 Colorful Accent 2" w:uiPriority="52"/>
+    <w:lsdException w:name="List Table 1 Light Accent 3" w:uiPriority="46"/>
+    <w:lsdException w:name="List Table 2 Accent 3" w:uiPriority="47"/>
+    <w:lsdException w:name="List Table 3 Accent 3" w:uiPriority="48"/>
+    <w:lsdException w:name="List Table 4 Accent 3" w:uiPriority="49"/>
+    <w:lsdException w:name="List Table 5 Dark Accent 3" w:uiPriority="50"/>
+    <w:lsdException w:name="List Table 6 Colorful Accent 3" w:uiPriority="51"/>
+    <w:lsdException w:name="List Table 7 Colorful Accent 3" w:uiPriority="52"/>
+    <w:lsdException w:name="List Table 1 Light Accent 4" w:uiPriority="46"/>
+    <w:lsdException w:name="List Table 2 Accent 4" w:uiPriority="47"/>
+    <w:lsdException w:name="List Table 3 Accent 4" w:uiPriority="48"/>
+    <w:lsdException w:name="List Table 4 Accent 4" w:uiPriority="49"/>
+    <w:lsdException w:name="List Table 5 Dark Accent 4" w:uiPriority="50"/>
+    <w:lsdException w:name="List Table 6 Colorful Accent 4" w:uiPriority="51"/>
+    <w:lsdException w:name="List Table 7 Colorful Accent 4" w:uiPriority="52"/>
+    <w:lsdException w:name="List Table 1 Light Accent 5" w:uiPriority="46"/>
+    <w:lsdException w:name="List Table 2 Accent 5" w:uiPriority="47"/>
+    <w:lsdException w:name="List Table 3 Accent 5" w:uiPriority="48"/>
+    <w:lsdException w:name="List Table 4 Accent 5" w:uiPriority="49"/>
+    <w:lsdException w:name="List Table 5 Dark Accent 5" w:uiPriority="50"/>
+    <w:lsdException w:name="List Table 6 Colorful Accent 5" w:uiPriority="51"/>
+    <w:lsdException w:name="List Table 7 Colorful Accent 5" w:uiPriority="52"/>
+    <w:lsdException w:name="List Table 1 Light Accent 6" w:uiPriority="46"/>
+    <w:lsdException w:name="List Table 2 Accent 6" w:uiPriority="47"/>
+    <w:lsdException w:name="List Table 3 Accent 6" w:uiPriority="48"/>
+    <w:lsdException w:name="List Table 4 Accent 6" w:uiPriority="49"/>
+    <w:lsdException w:name="List Table 5 Dark Accent 6" w:uiPriority="50"/>
+    <w:lsdException w:name="List Table 6 Colorful Accent 6" w:uiPriority="51"/>
+    <w:lsdException w:name="List Table 7 Colorful Accent 6" w:uiPriority="52"/>
+    <w:lsdException w:name="Mention" w:semiHidden="1" w:unhideWhenUsed="1"/>
+    <w:lsdException w:name="Smart Hyperlink" w:semiHidden="1" w:unhideWhenUsed="1"/>
+    <w:lsdException w:name="Hashtag" w:semiHidden="1" w:unhideWhenUsed="1"/>
+    <w:lsdException w:name="Unresolved Mention" w:semiHidden="1" w:unhideWhenUsed="1"/>
+    <w:lsdException w:name="Smart Link" w:semiHidden="1" w:unhideWhenUsed="1"/>
+  </w:latentStyles>
+  <w:style w:type="paragraph" w:default="1" w:styleId="Normal">
+    <w:name w:val="Normal"/>
+    <w:qFormat/>
+  </w:style>
+  <w:style w:type="paragraph" w:styleId="Ttulo1">
+    <w:name w:val="heading 1"/>
+    <w:basedOn w:val="Normal"/>
+    <w:next w:val="Normal"/>
+    <w:uiPriority w:val="9"/>
+    <w:qFormat/>
+    <w:pPr>
+      <w:keepNext/>
+      <w:keepLines/>
+      <w:spacing w:before="240" w:after="0"/>
+      <w:outlineLvl w:val="0"/>
+    </w:pPr>
+    <w:rPr>
+      <w:color w:val="2E75B5"/>
+      <w:sz w:val="32"/>
+      <w:szCs w:val="32"/>
+    </w:rPr>
+  </w:style>
+  <w:style w:type="paragraph" w:styleId="Ttulo2">
+    <w:name w:val="heading 2"/>
+    <w:basedOn w:val="Normal"/>
+    <w:next w:val="Normal"/>
+    <w:uiPriority w:val="9"/>
+    <w:semiHidden/>
+    <w:unhideWhenUsed/>
+    <w:qFormat/>
+    <w:pPr>
+      <w:keepNext/>
+      <w:keepLines/>
+      <w:spacing w:before="40" w:after="0"/>
+      <w:outlineLvl w:val="1"/>
+    </w:pPr>
+    <w:rPr>
+      <w:color w:val="2E75B5"/>
+      <w:sz w:val="26"/>
+      <w:szCs w:val="26"/>
+    </w:rPr>
+  </w:style>
+  <w:style w:type="paragraph" w:styleId="Ttulo3">
+    <w:name w:val="heading 3"/>
+    <w:basedOn w:val="Normal"/>
+    <w:next w:val="Normal"/>
+    <w:uiPriority w:val="9"/>
+    <w:semiHidden/>
+    <w:unhideWhenUsed/>
+    <w:qFormat/>
+    <w:pPr>
+      <w:keepNext/>
+      <w:keepLines/>
+      <w:spacing w:before="40" w:after="0"/>
+      <w:outlineLvl w:val="2"/>
+    </w:pPr>
+    <w:rPr>
+      <w:color w:val="1E4D78"/>
+      <w:sz w:val="24"/>
+      <w:szCs w:val="24"/>
+    </w:rPr>
+  </w:style>
+  <w:style w:type="paragraph" w:styleId="Ttulo4">
+    <w:name w:val="heading 4"/>
+    <w:basedOn w:val="Normal"/>
+    <w:next w:val="Normal"/>
+    <w:uiPriority w:val="9"/>
+    <w:semiHidden/>
+    <w:unhideWhenUsed/>
+    <w:qFormat/>
+    <w:pPr>
+      <w:keepNext/>
+      <w:keepLines/>
+      <w:spacing w:before="240" w:after="40"/>
+      <w:outlineLvl w:val="3"/>
+    </w:pPr>
+    <w:rPr>
+      <w:b/>
+      <w:bCs/>
+      <w:sz w:val="24"/>
+      <w:szCs w:val="24"/>
+    </w:rPr>
+  </w:style>
+  <w:style w:type="paragraph" w:styleId="Ttulo5">
+    <w:name w:val="heading 5"/>
+    <w:basedOn w:val="Normal"/>
+    <w:next w:val="Normal"/>
+    <w:uiPriority w:val="9"/>
+    <w:semiHidden/>
+    <w:unhideWhenUsed/>
+    <w:qFormat/>
+    <w:pPr>
+      <w:keepNext/>
+      <w:keepLines/>
+      <w:spacing w:before="220" w:after="40"/>
+      <w:outlineLvl w:val="4"/>
+    </w:pPr>
+    <w:rPr>
+      <w:b/>
+      <w:bCs/>
+    </w:rPr>
+  </w:style>
+  <w:style w:type="paragraph" w:styleId="Ttulo6">
+    <w:name w:val="heading 6"/>
+    <w:basedOn w:val="Normal"/>
+    <w:next w:val="Normal"/>
+    <w:uiPriority w:val="9"/>
+    <w:semiHidden/>
+    <w:unhideWhenUsed/>
+    <w:qFormat/>
+    <w:pPr>
+      <w:keepNext/>
+      <w:keepLines/>
+      <w:spacing w:before="200" w:after="40"/>
+      <w:outlineLvl w:val="5"/>
+    </w:pPr>
+    <w:rPr>
+      <w:b/>
+      <w:bCs/>
+      <w:sz w:val="20"/>
+      <w:szCs w:val="20"/>
+    </w:rPr>
+  </w:style>
+  <w:style w:type="character" w:default="1" w:styleId="Fuentedeprrafopredeter">
+    <w:name w:val="Default Paragraph Font"/>
+    <w:uiPriority w:val="1"/>
+    <w:semiHidden/>
+    <w:unhideWhenUsed/>
+  </w:style>
+  <w:style w:type="table" w:default="1" w:styleId="Tablanormal">
+    <w:name w:val="Normal Table"/>
+    <w:uiPriority w:val="99"/>
+    <w:semiHidden/>
+    <w:unhideWhenUsed/>
+    <w:tblPr>
+      <w:tblInd w:w="0" w:type="dxa"/>
+      <w:tblCellMar>
+        <w:top w:w="0" w:type="dxa"/>
+        <w:left w:w="108" w:type="dxa"/>
+        <w:bottom w:w="0" w:type="dxa"/>
+        <w:right w:w="108" w:type="dxa"/>
+      </w:tblCellMar>
+    </w:tblPr>
+  </w:style>
+  <w:style w:type="numbering" w:default="1" w:styleId="Sinlista">
+    <w:name w:val="No List"/>
+    <w:uiPriority w:val="99"/>
+    <w:semiHidden/>
+    <w:unhideWhenUsed/>
+  </w:style>
+  <w:style w:type="table" w:customStyle="1" w:styleId="TableNormal">
     <w:name w:val="TableNormal"/>
     <w:tblPr>
       <w:tblCellMar>
-        <w:top w:w="100.0" w:type="dxa"/>
-        <w:left w:w="100.0" w:type="dxa"/>
-        <w:bottom w:w="100.0" w:type="dxa"/>
-        <w:right w:w="100.0" w:type="dxa"/>
+        <w:top w:w="100" w:type="dxa"/>
+        <w:left w:w="100" w:type="dxa"/>
+        <w:bottom w:w="100" w:type="dxa"/>
+        <w:right w:w="100" w:type="dxa"/>
       </w:tblCellMar>
     </w:tblPr>
   </w:style>
-  <w:style w:type="paragraph" w:styleId="Normal" w:default="1">
-    <w:name w:val="normal"/>
-  </w:style>
-  <w:style w:type="paragraph" w:styleId="Heading1">
-    <w:name w:val="heading 1"/>
-    <w:basedOn w:val="Normal"/>
-    <w:next w:val="Normal"/>
-    <w:pPr>
-      <w:keepNext w:val="1"/>
-      <w:keepLines w:val="1"/>
-      <w:spacing w:after="0" w:before="240" w:lineRule="auto"/>
-    </w:pPr>
-    <w:rPr>
-      <w:rFonts w:ascii="Calibri" w:cs="Calibri" w:eastAsia="Calibri" w:hAnsi="Calibri"/>
-      <w:color w:val="2e75b5"/>
-      <w:sz w:val="32"/>
-      <w:szCs w:val="32"/>
-    </w:rPr>
-  </w:style>
-  <w:style w:type="paragraph" w:styleId="Heading2">
-    <w:name w:val="heading 2"/>
-    <w:basedOn w:val="Normal"/>
-    <w:next w:val="Normal"/>
-    <w:pPr>
-      <w:keepNext w:val="1"/>
-      <w:keepLines w:val="1"/>
-      <w:spacing w:after="0" w:before="40" w:lineRule="auto"/>
-    </w:pPr>
-    <w:rPr>
-      <w:rFonts w:ascii="Calibri" w:cs="Calibri" w:eastAsia="Calibri" w:hAnsi="Calibri"/>
-      <w:color w:val="2e75b5"/>
-      <w:sz w:val="26"/>
-      <w:szCs w:val="26"/>
-    </w:rPr>
-  </w:style>
-  <w:style w:type="paragraph" w:styleId="Heading3">
-    <w:name w:val="heading 3"/>
-    <w:basedOn w:val="Normal"/>
-    <w:next w:val="Normal"/>
-    <w:pPr>
-      <w:keepNext w:val="1"/>
-      <w:keepLines w:val="1"/>
-      <w:spacing w:after="0" w:before="40" w:lineRule="auto"/>
-    </w:pPr>
-    <w:rPr>
-      <w:rFonts w:ascii="Calibri" w:cs="Calibri" w:eastAsia="Calibri" w:hAnsi="Calibri"/>
-      <w:color w:val="1e4d78"/>
-      <w:sz w:val="24"/>
-      <w:szCs w:val="24"/>
-    </w:rPr>
-  </w:style>
-  <w:style w:type="paragraph" w:styleId="Heading4">
-    <w:name w:val="heading 4"/>
-    <w:basedOn w:val="Normal"/>
-    <w:next w:val="Normal"/>
-    <w:pPr>
-      <w:keepNext w:val="1"/>
-      <w:keepLines w:val="1"/>
-      <w:pageBreakBefore w:val="0"/>
-      <w:spacing w:after="40" w:before="240" w:lineRule="auto"/>
-    </w:pPr>
-    <w:rPr>
-      <w:b w:val="1"/>
-      <w:bCs w:val="1"/>
-      <w:sz w:val="24"/>
-      <w:szCs w:val="24"/>
-    </w:rPr>
-  </w:style>
-  <w:style w:type="paragraph" w:styleId="Heading5">
-    <w:name w:val="heading 5"/>
-    <w:basedOn w:val="Normal"/>
-    <w:next w:val="Normal"/>
-    <w:pPr>
-      <w:keepNext w:val="1"/>
-      <w:keepLines w:val="1"/>
-      <w:pageBreakBefore w:val="0"/>
-      <w:spacing w:after="40" w:before="220" w:lineRule="auto"/>
-    </w:pPr>
-    <w:rPr>
-      <w:b w:val="1"/>
-      <w:bCs w:val="1"/>
-      <w:sz w:val="22"/>
-      <w:szCs w:val="22"/>
-    </w:rPr>
-  </w:style>
-  <w:style w:type="paragraph" w:styleId="Heading6">
-    <w:name w:val="heading 6"/>
-    <w:basedOn w:val="Normal"/>
-    <w:next w:val="Normal"/>
-    <w:pPr>
-      <w:keepNext w:val="1"/>
-      <w:keepLines w:val="1"/>
-      <w:pageBreakBefore w:val="0"/>
-      <w:spacing w:after="40" w:before="200" w:lineRule="auto"/>
-    </w:pPr>
-    <w:rPr>
-      <w:b w:val="1"/>
-      <w:bCs w:val="1"/>
-      <w:sz w:val="20"/>
-      <w:szCs w:val="20"/>
-    </w:rPr>
-  </w:style>
-  <w:style w:type="paragraph" w:styleId="Title">
+  <w:style w:type="paragraph" w:styleId="Ttulo">
     <w:name w:val="Title"/>
     <w:basedOn w:val="Normal"/>
     <w:next w:val="Normal"/>
+    <w:uiPriority w:val="10"/>
+    <w:qFormat/>
     <w:pPr>
       <w:spacing w:after="0" w:line="240" w:lineRule="auto"/>
     </w:pPr>
     <w:rPr>
-      <w:rFonts w:ascii="Calibri" w:cs="Calibri" w:eastAsia="Calibri" w:hAnsi="Calibri"/>
       <w:sz w:val="56"/>
       <w:szCs w:val="56"/>
     </w:rPr>
-  </w:style>
-  <w:style w:type="character" w:styleId="Fuentedeprrafopredeter" w:default="1">
-    <w:name w:val="Default Paragraph Font"/>
-    <w:uiPriority w:val="1"/>
-    <w:semiHidden w:val="1"/>
-    <w:unhideWhenUsed w:val="1"/>
-  </w:style>
-  <w:style w:type="table" w:styleId="Tablanormal" w:default="1">
-    <w:name w:val="Normal Table"/>
-    <w:uiPriority w:val="99"/>
-    <w:semiHidden w:val="1"/>
-    <w:unhideWhenUsed w:val="1"/>
-    <w:tblPr>
-      <w:tblInd w:w="0.0" w:type="dxa"/>
-      <w:tblCellMar>
-        <w:top w:w="0.0" w:type="dxa"/>
-        <w:left w:w="108.0" w:type="dxa"/>
-        <w:bottom w:w="0.0" w:type="dxa"/>
-        <w:right w:w="108.0" w:type="dxa"/>
-      </w:tblCellMar>
-    </w:tblPr>
-  </w:style>
-  <w:style w:type="numbering" w:styleId="Sinlista" w:default="1">
-    <w:name w:val="No List"/>
-    <w:uiPriority w:val="99"/>
-    <w:semiHidden w:val="1"/>
-    <w:unhideWhenUsed w:val="1"/>
   </w:style>
   <w:style w:type="paragraph" w:styleId="Sinespaciado">
     <w:name w:val="No Spacing"/>
     <w:link w:val="SinespaciadoCar"/>
     <w:uiPriority w:val="1"/>
-    <w:qFormat w:val="1"/>
+    <w:qFormat/>
     <w:rsid w:val="00E73CFF"/>
     <w:pPr>
       <w:spacing w:after="0" w:line="240" w:lineRule="auto"/>
     </w:pPr>
     <w:rPr>
       <w:rFonts w:eastAsiaTheme="minorEastAsia"/>
-      <w:lang w:eastAsia="es-CL"/>
     </w:rPr>
   </w:style>
-  <w:style w:type="character" w:styleId="SinespaciadoCar" w:customStyle="1">
+  <w:style w:type="character" w:customStyle="1" w:styleId="SinespaciadoCar">
     <w:name w:val="Sin espaciado Car"/>
     <w:basedOn w:val="Fuentedeprrafopredeter"/>
     <w:link w:val="Sinespaciado"/>
@@ -2664,14 +2572,13 @@
       <w:lang w:eastAsia="es-CL"/>
     </w:rPr>
   </w:style>
-  <w:style w:type="character" w:styleId="TtuloCar" w:customStyle="1">
+  <w:style w:type="character" w:customStyle="1" w:styleId="TtuloCar">
     <w:name w:val="Título Car"/>
     <w:basedOn w:val="Fuentedeprrafopredeter"/>
-    <w:link w:val="Ttulo"/>
     <w:uiPriority w:val="10"/>
     <w:rsid w:val="00E73CFF"/>
     <w:rPr>
-      <w:rFonts w:asciiTheme="majorHAnsi" w:cstheme="majorBidi" w:eastAsiaTheme="majorEastAsia" w:hAnsiTheme="majorHAnsi"/>
+      <w:rFonts w:asciiTheme="majorHAnsi" w:eastAsiaTheme="majorEastAsia" w:hAnsiTheme="majorHAnsi" w:cstheme="majorBidi"/>
       <w:spacing w:val="-10"/>
       <w:kern w:val="28"/>
       <w:sz w:val="56"/>
@@ -2688,12 +2595,12 @@
     </w:pPr>
     <w:tblPr>
       <w:tblBorders>
-        <w:top w:color="auto" w:space="0" w:sz="4" w:val="single"/>
-        <w:left w:color="auto" w:space="0" w:sz="4" w:val="single"/>
-        <w:bottom w:color="auto" w:space="0" w:sz="4" w:val="single"/>
-        <w:right w:color="auto" w:space="0" w:sz="4" w:val="single"/>
-        <w:insideH w:color="auto" w:space="0" w:sz="4" w:val="single"/>
-        <w:insideV w:color="auto" w:space="0" w:sz="4" w:val="single"/>
+        <w:top w:val="single" w:sz="4" w:space="0" w:color="auto"/>
+        <w:left w:val="single" w:sz="4" w:space="0" w:color="auto"/>
+        <w:bottom w:val="single" w:sz="4" w:space="0" w:color="auto"/>
+        <w:right w:val="single" w:sz="4" w:space="0" w:color="auto"/>
+        <w:insideH w:val="single" w:sz="4" w:space="0" w:color="auto"/>
+        <w:insideV w:val="single" w:sz="4" w:space="0" w:color="auto"/>
       </w:tblBorders>
     </w:tblPr>
   </w:style>
@@ -2701,7 +2608,7 @@
     <w:name w:val="header"/>
     <w:basedOn w:val="Normal"/>
     <w:link w:val="EncabezadoCar"/>
-    <w:unhideWhenUsed w:val="1"/>
+    <w:unhideWhenUsed/>
     <w:rsid w:val="00DF38AE"/>
     <w:pPr>
       <w:tabs>
@@ -2711,7 +2618,7 @@
       <w:spacing w:after="0" w:line="240" w:lineRule="auto"/>
     </w:pPr>
   </w:style>
-  <w:style w:type="character" w:styleId="EncabezadoCar" w:customStyle="1">
+  <w:style w:type="character" w:customStyle="1" w:styleId="EncabezadoCar">
     <w:name w:val="Encabezado Car"/>
     <w:basedOn w:val="Fuentedeprrafopredeter"/>
     <w:link w:val="Encabezado"/>
@@ -2722,7 +2629,7 @@
     <w:basedOn w:val="Normal"/>
     <w:link w:val="PiedepginaCar"/>
     <w:uiPriority w:val="99"/>
-    <w:unhideWhenUsed w:val="1"/>
+    <w:unhideWhenUsed/>
     <w:rsid w:val="00DF38AE"/>
     <w:pPr>
       <w:tabs>
@@ -2732,14 +2639,14 @@
       <w:spacing w:after="0" w:line="240" w:lineRule="auto"/>
     </w:pPr>
   </w:style>
-  <w:style w:type="character" w:styleId="PiedepginaCar" w:customStyle="1">
+  <w:style w:type="character" w:customStyle="1" w:styleId="PiedepginaCar">
     <w:name w:val="Pie de página Car"/>
     <w:basedOn w:val="Fuentedeprrafopredeter"/>
     <w:link w:val="Piedepgina"/>
     <w:uiPriority w:val="99"/>
     <w:rsid w:val="00DF38AE"/>
   </w:style>
-  <w:style w:type="table" w:styleId="Tablanormal11" w:customStyle="1">
+  <w:style w:type="table" w:customStyle="1" w:styleId="Tablanormal11">
     <w:name w:val="Tabla normal 11"/>
     <w:basedOn w:val="Tablanormal"/>
     <w:uiPriority w:val="41"/>
@@ -2751,54 +2658,54 @@
       <w:tblStyleRowBandSize w:val="1"/>
       <w:tblStyleColBandSize w:val="1"/>
       <w:tblBorders>
-        <w:top w:color="bfbfbf" w:space="0" w:sz="4" w:themeColor="background1" w:themeShade="0000BF" w:val="single"/>
-        <w:left w:color="bfbfbf" w:space="0" w:sz="4" w:themeColor="background1" w:themeShade="0000BF" w:val="single"/>
-        <w:bottom w:color="bfbfbf" w:space="0" w:sz="4" w:themeColor="background1" w:themeShade="0000BF" w:val="single"/>
-        <w:right w:color="bfbfbf" w:space="0" w:sz="4" w:themeColor="background1" w:themeShade="0000BF" w:val="single"/>
-        <w:insideH w:color="bfbfbf" w:space="0" w:sz="4" w:themeColor="background1" w:themeShade="0000BF" w:val="single"/>
-        <w:insideV w:color="bfbfbf" w:space="0" w:sz="4" w:themeColor="background1" w:themeShade="0000BF" w:val="single"/>
+        <w:top w:val="single" w:sz="4" w:space="0" w:color="BFBFBF" w:themeColor="background1" w:themeShade="BF"/>
+        <w:left w:val="single" w:sz="4" w:space="0" w:color="BFBFBF" w:themeColor="background1" w:themeShade="BF"/>
+        <w:bottom w:val="single" w:sz="4" w:space="0" w:color="BFBFBF" w:themeColor="background1" w:themeShade="BF"/>
+        <w:right w:val="single" w:sz="4" w:space="0" w:color="BFBFBF" w:themeColor="background1" w:themeShade="BF"/>
+        <w:insideH w:val="single" w:sz="4" w:space="0" w:color="BFBFBF" w:themeColor="background1" w:themeShade="BF"/>
+        <w:insideV w:val="single" w:sz="4" w:space="0" w:color="BFBFBF" w:themeColor="background1" w:themeShade="BF"/>
       </w:tblBorders>
     </w:tblPr>
     <w:tblStylePr w:type="firstRow">
       <w:rPr>
-        <w:b w:val="1"/>
-        <w:bCs w:val="1"/>
+        <w:b/>
+        <w:bCs/>
       </w:rPr>
     </w:tblStylePr>
     <w:tblStylePr w:type="lastRow">
       <w:rPr>
-        <w:b w:val="1"/>
-        <w:bCs w:val="1"/>
+        <w:b/>
+        <w:bCs/>
       </w:rPr>
       <w:tblPr/>
       <w:tcPr>
         <w:tcBorders>
-          <w:top w:color="bfbfbf" w:space="0" w:sz="4" w:themeColor="background1" w:themeShade="0000BF" w:val="double"/>
+          <w:top w:val="double" w:sz="4" w:space="0" w:color="BFBFBF" w:themeColor="background1" w:themeShade="BF"/>
         </w:tcBorders>
       </w:tcPr>
     </w:tblStylePr>
     <w:tblStylePr w:type="firstCol">
       <w:rPr>
-        <w:b w:val="1"/>
-        <w:bCs w:val="1"/>
+        <w:b/>
+        <w:bCs/>
       </w:rPr>
     </w:tblStylePr>
     <w:tblStylePr w:type="lastCol">
       <w:rPr>
-        <w:b w:val="1"/>
-        <w:bCs w:val="1"/>
+        <w:b/>
+        <w:bCs/>
       </w:rPr>
     </w:tblStylePr>
     <w:tblStylePr w:type="band1Vert">
       <w:tblPr/>
       <w:tcPr>
-        <w:shd w:color="auto" w:fill="f2f2f2" w:themeFill="background1" w:themeFillShade="0000F2" w:val="clear"/>
+        <w:shd w:val="clear" w:color="auto" w:fill="F2F2F2" w:themeFill="background1" w:themeFillShade="F2"/>
       </w:tcPr>
     </w:tblStylePr>
     <w:tblStylePr w:type="band1Horz">
       <w:tblPr/>
       <w:tcPr>
-        <w:shd w:color="auto" w:fill="f2f2f2" w:themeFill="background1" w:themeFillShade="0000F2" w:val="clear"/>
+        <w:shd w:val="clear" w:color="auto" w:fill="F2F2F2" w:themeFill="background1" w:themeFillShade="F2"/>
       </w:tcPr>
     </w:tblStylePr>
   </w:style>
@@ -2807,11 +2714,11 @@
     <w:basedOn w:val="Normal"/>
     <w:link w:val="PrrafodelistaCar"/>
     <w:uiPriority w:val="34"/>
-    <w:qFormat w:val="1"/>
+    <w:qFormat/>
     <w:rsid w:val="00A4202C"/>
     <w:pPr>
       <w:ind w:left="720"/>
-      <w:contextualSpacing w:val="1"/>
+      <w:contextualSpacing/>
     </w:pPr>
   </w:style>
   <w:style w:type="paragraph" w:styleId="Textodeglobo">
@@ -2819,66 +2726,63 @@
     <w:basedOn w:val="Normal"/>
     <w:link w:val="TextodegloboCar"/>
     <w:uiPriority w:val="99"/>
-    <w:semiHidden w:val="1"/>
-    <w:unhideWhenUsed w:val="1"/>
+    <w:semiHidden/>
+    <w:unhideWhenUsed/>
     <w:rsid w:val="00EF2286"/>
     <w:pPr>
       <w:spacing w:after="0" w:line="240" w:lineRule="auto"/>
     </w:pPr>
     <w:rPr>
-      <w:rFonts w:ascii="Segoe UI" w:cs="Segoe UI" w:hAnsi="Segoe UI"/>
+      <w:rFonts w:ascii="Segoe UI" w:hAnsi="Segoe UI" w:cs="Segoe UI"/>
       <w:sz w:val="18"/>
       <w:szCs w:val="18"/>
     </w:rPr>
   </w:style>
-  <w:style w:type="character" w:styleId="TextodegloboCar" w:customStyle="1">
+  <w:style w:type="character" w:customStyle="1" w:styleId="TextodegloboCar">
     <w:name w:val="Texto de globo Car"/>
     <w:basedOn w:val="Fuentedeprrafopredeter"/>
     <w:link w:val="Textodeglobo"/>
     <w:uiPriority w:val="99"/>
-    <w:semiHidden w:val="1"/>
+    <w:semiHidden/>
     <w:rsid w:val="00EF2286"/>
     <w:rPr>
-      <w:rFonts w:ascii="Segoe UI" w:cs="Segoe UI" w:hAnsi="Segoe UI"/>
+      <w:rFonts w:ascii="Segoe UI" w:hAnsi="Segoe UI" w:cs="Segoe UI"/>
       <w:sz w:val="18"/>
       <w:szCs w:val="18"/>
     </w:rPr>
   </w:style>
-  <w:style w:type="character" w:styleId="Ttulo1Car" w:customStyle="1">
+  <w:style w:type="character" w:customStyle="1" w:styleId="Ttulo1Car">
     <w:name w:val="Título 1 Car"/>
     <w:basedOn w:val="Fuentedeprrafopredeter"/>
-    <w:link w:val="Ttulo1"/>
     <w:uiPriority w:val="9"/>
     <w:rsid w:val="00FE4ABA"/>
     <w:rPr>
-      <w:rFonts w:asciiTheme="majorHAnsi" w:cstheme="majorBidi" w:eastAsiaTheme="majorEastAsia" w:hAnsiTheme="majorHAnsi"/>
-      <w:color w:val="2e74b5" w:themeColor="accent1" w:themeShade="0000BF"/>
+      <w:rFonts w:asciiTheme="majorHAnsi" w:eastAsiaTheme="majorEastAsia" w:hAnsiTheme="majorHAnsi" w:cstheme="majorBidi"/>
+      <w:color w:val="2E74B5" w:themeColor="accent1" w:themeShade="BF"/>
       <w:sz w:val="32"/>
       <w:szCs w:val="32"/>
     </w:rPr>
   </w:style>
-  <w:style w:type="character" w:styleId="Ttulo2Car" w:customStyle="1">
+  <w:style w:type="character" w:customStyle="1" w:styleId="Ttulo2Car">
     <w:name w:val="Título 2 Car"/>
     <w:basedOn w:val="Fuentedeprrafopredeter"/>
-    <w:link w:val="Ttulo2"/>
     <w:uiPriority w:val="9"/>
     <w:rsid w:val="00FE4ABA"/>
     <w:rPr>
-      <w:rFonts w:asciiTheme="majorHAnsi" w:cstheme="majorBidi" w:eastAsiaTheme="majorEastAsia" w:hAnsiTheme="majorHAnsi"/>
-      <w:color w:val="2e74b5" w:themeColor="accent1" w:themeShade="0000BF"/>
+      <w:rFonts w:asciiTheme="majorHAnsi" w:eastAsiaTheme="majorEastAsia" w:hAnsiTheme="majorHAnsi" w:cstheme="majorBidi"/>
+      <w:color w:val="2E74B5" w:themeColor="accent1" w:themeShade="BF"/>
       <w:sz w:val="26"/>
       <w:szCs w:val="26"/>
     </w:rPr>
   </w:style>
-  <w:style w:type="character" w:styleId="Ttulo3Car" w:customStyle="1">
+  <w:style w:type="character" w:customStyle="1" w:styleId="Ttulo3Car">
     <w:name w:val="Título 3 Car"/>
     <w:basedOn w:val="Fuentedeprrafopredeter"/>
-    <w:link w:val="Ttulo3"/>
     <w:uiPriority w:val="9"/>
     <w:rsid w:val="00FE4ABA"/>
     <w:rPr>
-      <w:rFonts w:asciiTheme="majorHAnsi" w:cstheme="majorBidi" w:eastAsiaTheme="majorEastAsia" w:hAnsiTheme="majorHAnsi"/>
-      <w:color w:val="1f4d78" w:themeColor="accent1" w:themeShade="00007F"/>
+      <w:rFonts w:asciiTheme="majorHAnsi" w:eastAsiaTheme="majorEastAsia" w:hAnsiTheme="majorHAnsi" w:cstheme="majorBidi"/>
+      <w:color w:val="1F4D78" w:themeColor="accent1" w:themeShade="7F"/>
       <w:sz w:val="24"/>
       <w:szCs w:val="24"/>
     </w:rPr>
@@ -2887,24 +2791,23 @@
     <w:name w:val="Normal (Web)"/>
     <w:basedOn w:val="Normal"/>
     <w:uiPriority w:val="99"/>
-    <w:unhideWhenUsed w:val="1"/>
+    <w:unhideWhenUsed/>
     <w:rsid w:val="004E4F82"/>
     <w:pPr>
-      <w:spacing w:after="100" w:afterAutospacing="1" w:before="100" w:beforeAutospacing="1" w:line="240" w:lineRule="auto"/>
+      <w:spacing w:before="100" w:beforeAutospacing="1" w:after="100" w:afterAutospacing="1" w:line="240" w:lineRule="auto"/>
     </w:pPr>
     <w:rPr>
-      <w:rFonts w:ascii="Times New Roman" w:cs="Times New Roman" w:eastAsia="Times New Roman" w:hAnsi="Times New Roman"/>
+      <w:rFonts w:ascii="Times New Roman" w:eastAsia="Times New Roman" w:hAnsi="Times New Roman" w:cs="Times New Roman"/>
       <w:sz w:val="24"/>
       <w:szCs w:val="24"/>
-      <w:lang w:eastAsia="es-CL"/>
     </w:rPr>
   </w:style>
   <w:style w:type="character" w:styleId="Refdecomentario">
     <w:name w:val="annotation reference"/>
     <w:basedOn w:val="Fuentedeprrafopredeter"/>
     <w:uiPriority w:val="99"/>
-    <w:semiHidden w:val="1"/>
-    <w:unhideWhenUsed w:val="1"/>
+    <w:semiHidden/>
+    <w:unhideWhenUsed/>
     <w:rsid w:val="00284FFB"/>
     <w:rPr>
       <w:sz w:val="16"/>
@@ -2916,7 +2819,7 @@
     <w:basedOn w:val="Normal"/>
     <w:link w:val="TextocomentarioCar"/>
     <w:uiPriority w:val="99"/>
-    <w:unhideWhenUsed w:val="1"/>
+    <w:unhideWhenUsed/>
     <w:rsid w:val="00284FFB"/>
     <w:pPr>
       <w:spacing w:line="240" w:lineRule="auto"/>
@@ -2926,7 +2829,7 @@
       <w:szCs w:val="20"/>
     </w:rPr>
   </w:style>
-  <w:style w:type="character" w:styleId="TextocomentarioCar" w:customStyle="1">
+  <w:style w:type="character" w:customStyle="1" w:styleId="TextocomentarioCar">
     <w:name w:val="Texto comentario Car"/>
     <w:basedOn w:val="Fuentedeprrafopredeter"/>
     <w:link w:val="Textocomentario"/>
@@ -2943,29 +2846,29 @@
     <w:next w:val="Textocomentario"/>
     <w:link w:val="AsuntodelcomentarioCar"/>
     <w:uiPriority w:val="99"/>
-    <w:semiHidden w:val="1"/>
-    <w:unhideWhenUsed w:val="1"/>
+    <w:semiHidden/>
+    <w:unhideWhenUsed/>
     <w:rsid w:val="00284FFB"/>
     <w:rPr>
-      <w:b w:val="1"/>
-      <w:bCs w:val="1"/>
+      <w:b/>
+      <w:bCs/>
     </w:rPr>
   </w:style>
-  <w:style w:type="character" w:styleId="AsuntodelcomentarioCar" w:customStyle="1">
+  <w:style w:type="character" w:customStyle="1" w:styleId="AsuntodelcomentarioCar">
     <w:name w:val="Asunto del comentario Car"/>
     <w:basedOn w:val="TextocomentarioCar"/>
     <w:link w:val="Asuntodelcomentario"/>
     <w:uiPriority w:val="99"/>
-    <w:semiHidden w:val="1"/>
+    <w:semiHidden/>
     <w:rsid w:val="00284FFB"/>
     <w:rPr>
-      <w:b w:val="1"/>
-      <w:bCs w:val="1"/>
+      <w:b/>
+      <w:bCs/>
       <w:sz w:val="20"/>
       <w:szCs w:val="20"/>
     </w:rPr>
   </w:style>
-  <w:style w:type="table" w:styleId="Tablaconcuadrcula1clara-nfasis11" w:customStyle="1">
+  <w:style w:type="table" w:customStyle="1" w:styleId="Tablaconcuadrcula1clara-nfasis11">
     <w:name w:val="Tabla con cuadrícula 1 clara - Énfasis 11"/>
     <w:basedOn w:val="Tablanormal"/>
     <w:uiPriority w:val="46"/>
@@ -2977,48 +2880,48 @@
       <w:tblStyleRowBandSize w:val="1"/>
       <w:tblStyleColBandSize w:val="1"/>
       <w:tblBorders>
-        <w:top w:color="bdd6ee" w:space="0" w:sz="4" w:themeColor="accent1" w:themeTint="000066" w:val="single"/>
-        <w:left w:color="bdd6ee" w:space="0" w:sz="4" w:themeColor="accent1" w:themeTint="000066" w:val="single"/>
-        <w:bottom w:color="bdd6ee" w:space="0" w:sz="4" w:themeColor="accent1" w:themeTint="000066" w:val="single"/>
-        <w:right w:color="bdd6ee" w:space="0" w:sz="4" w:themeColor="accent1" w:themeTint="000066" w:val="single"/>
-        <w:insideH w:color="bdd6ee" w:space="0" w:sz="4" w:themeColor="accent1" w:themeTint="000066" w:val="single"/>
-        <w:insideV w:color="bdd6ee" w:space="0" w:sz="4" w:themeColor="accent1" w:themeTint="000066" w:val="single"/>
+        <w:top w:val="single" w:sz="4" w:space="0" w:color="BDD6EE" w:themeColor="accent1" w:themeTint="66"/>
+        <w:left w:val="single" w:sz="4" w:space="0" w:color="BDD6EE" w:themeColor="accent1" w:themeTint="66"/>
+        <w:bottom w:val="single" w:sz="4" w:space="0" w:color="BDD6EE" w:themeColor="accent1" w:themeTint="66"/>
+        <w:right w:val="single" w:sz="4" w:space="0" w:color="BDD6EE" w:themeColor="accent1" w:themeTint="66"/>
+        <w:insideH w:val="single" w:sz="4" w:space="0" w:color="BDD6EE" w:themeColor="accent1" w:themeTint="66"/>
+        <w:insideV w:val="single" w:sz="4" w:space="0" w:color="BDD6EE" w:themeColor="accent1" w:themeTint="66"/>
       </w:tblBorders>
     </w:tblPr>
     <w:tblStylePr w:type="firstRow">
       <w:rPr>
-        <w:b w:val="1"/>
-        <w:bCs w:val="1"/>
+        <w:b/>
+        <w:bCs/>
       </w:rPr>
       <w:tblPr/>
       <w:tcPr>
         <w:tcBorders>
-          <w:bottom w:color="9cc2e5" w:space="0" w:sz="12" w:themeColor="accent1" w:themeTint="000099" w:val="single"/>
+          <w:bottom w:val="single" w:sz="12" w:space="0" w:color="9CC2E5" w:themeColor="accent1" w:themeTint="99"/>
         </w:tcBorders>
       </w:tcPr>
     </w:tblStylePr>
     <w:tblStylePr w:type="lastRow">
       <w:rPr>
-        <w:b w:val="1"/>
-        <w:bCs w:val="1"/>
+        <w:b/>
+        <w:bCs/>
       </w:rPr>
       <w:tblPr/>
       <w:tcPr>
         <w:tcBorders>
-          <w:top w:color="9cc2e5" w:space="0" w:sz="2" w:themeColor="accent1" w:themeTint="000099" w:val="double"/>
+          <w:top w:val="double" w:sz="2" w:space="0" w:color="9CC2E5" w:themeColor="accent1" w:themeTint="99"/>
         </w:tcBorders>
       </w:tcPr>
     </w:tblStylePr>
     <w:tblStylePr w:type="firstCol">
       <w:rPr>
-        <w:b w:val="1"/>
-        <w:bCs w:val="1"/>
+        <w:b/>
+        <w:bCs/>
       </w:rPr>
     </w:tblStylePr>
     <w:tblStylePr w:type="lastCol">
       <w:rPr>
-        <w:b w:val="1"/>
-        <w:bCs w:val="1"/>
+        <w:b/>
+        <w:bCs/>
       </w:rPr>
     </w:tblStylePr>
   </w:style>
@@ -3026,64 +2929,63 @@
     <w:name w:val="Hyperlink"/>
     <w:basedOn w:val="Fuentedeprrafopredeter"/>
     <w:uiPriority w:val="99"/>
-    <w:unhideWhenUsed w:val="1"/>
+    <w:unhideWhenUsed/>
     <w:rsid w:val="004E40C0"/>
     <w:rPr>
-      <w:color w:val="0563c1" w:themeColor="hyperlink"/>
+      <w:color w:val="0563C1" w:themeColor="hyperlink"/>
       <w:u w:val="single"/>
     </w:rPr>
   </w:style>
-  <w:style w:type="character" w:styleId="Mencinsinresolver1" w:customStyle="1">
+  <w:style w:type="character" w:customStyle="1" w:styleId="Mencinsinresolver1">
     <w:name w:val="Mención sin resolver1"/>
     <w:basedOn w:val="Fuentedeprrafopredeter"/>
     <w:uiPriority w:val="99"/>
-    <w:semiHidden w:val="1"/>
-    <w:unhideWhenUsed w:val="1"/>
+    <w:semiHidden/>
+    <w:unhideWhenUsed/>
     <w:rsid w:val="004E40C0"/>
     <w:rPr>
-      <w:color w:val="605e5c"/>
-      <w:shd w:color="auto" w:fill="e1dfdd" w:val="clear"/>
+      <w:color w:val="605E5C"/>
+      <w:shd w:val="clear" w:color="auto" w:fill="E1DFDD"/>
     </w:rPr>
   </w:style>
-  <w:style w:type="character" w:styleId="SubttuloCar" w:customStyle="1">
+  <w:style w:type="character" w:customStyle="1" w:styleId="SubttuloCar">
     <w:name w:val="Subtítulo Car"/>
     <w:basedOn w:val="Fuentedeprrafopredeter"/>
-    <w:link w:val="Subttulo"/>
     <w:uiPriority w:val="19"/>
     <w:rsid w:val="00446FDE"/>
     <w:rPr>
-      <w:rFonts w:asciiTheme="majorHAnsi" w:cstheme="majorBidi" w:eastAsiaTheme="majorEastAsia" w:hAnsiTheme="majorHAnsi"/>
-      <w:caps w:val="1"/>
-      <w:color w:val="5b9bd5" w:themeColor="accent1"/>
+      <w:rFonts w:asciiTheme="majorHAnsi" w:eastAsiaTheme="majorEastAsia" w:hAnsiTheme="majorHAnsi" w:cstheme="majorBidi"/>
+      <w:caps/>
+      <w:color w:val="5B9BD5" w:themeColor="accent1"/>
       <w:kern w:val="20"/>
       <w:sz w:val="56"/>
       <w:szCs w:val="20"/>
-      <w:lang w:eastAsia="ja-JP" w:val="en-US"/>
+      <w:lang w:val="en-US" w:eastAsia="ja-JP"/>
     </w:rPr>
   </w:style>
-  <w:style w:type="table" w:styleId="Tablafinanciera" w:customStyle="1">
+  <w:style w:type="table" w:customStyle="1" w:styleId="Tablafinanciera">
     <w:name w:val="Tabla financiera"/>
     <w:basedOn w:val="Tablanormal"/>
     <w:uiPriority w:val="99"/>
     <w:rsid w:val="008C1EBE"/>
     <w:pPr>
-      <w:spacing w:after="0" w:before="40" w:line="240" w:lineRule="auto"/>
+      <w:spacing w:before="40" w:after="0" w:line="240" w:lineRule="auto"/>
       <w:ind w:left="144" w:right="144"/>
       <w:jc w:val="right"/>
     </w:pPr>
     <w:rPr>
-      <w:color w:val="595959" w:themeColor="text1" w:themeTint="0000A6"/>
+      <w:color w:val="595959" w:themeColor="text1" w:themeTint="A6"/>
       <w:sz w:val="20"/>
       <w:szCs w:val="20"/>
-      <w:lang w:eastAsia="ja-JP" w:val="en-US"/>
+      <w:lang w:val="en-US" w:eastAsia="ja-JP"/>
     </w:rPr>
     <w:tblPr>
       <w:tblBorders>
-        <w:insideH w:color="d9d9d9" w:space="0" w:sz="4" w:themeColor="background1" w:themeShade="0000D9" w:val="single"/>
+        <w:insideH w:val="single" w:sz="4" w:space="0" w:color="D9D9D9" w:themeColor="background1" w:themeShade="D9"/>
       </w:tblBorders>
       <w:tblCellMar>
-        <w:left w:w="0.0" w:type="dxa"/>
-        <w:right w:w="0.0" w:type="dxa"/>
+        <w:left w:w="0" w:type="dxa"/>
+        <w:right w:w="0" w:type="dxa"/>
       </w:tblCellMar>
     </w:tblPr>
     <w:tcPr>
@@ -3091,15 +2993,15 @@
     </w:tcPr>
     <w:tblStylePr w:type="firstRow">
       <w:pPr>
-        <w:wordWrap w:val="1"/>
+        <w:wordWrap/>
         <w:jc w:val="right"/>
       </w:pPr>
       <w:rPr>
         <w:rFonts w:asciiTheme="majorHAnsi" w:hAnsiTheme="majorHAnsi"/>
         <w:b w:val="0"/>
-        <w:caps w:val="1"/>
+        <w:caps/>
         <w:smallCaps w:val="0"/>
-        <w:color w:val="5b9bd5" w:themeColor="accent1"/>
+        <w:color w:val="5B9BD5" w:themeColor="accent1"/>
         <w:sz w:val="22"/>
       </w:rPr>
       <w:tblPr/>
@@ -3109,11 +3011,11 @@
     </w:tblStylePr>
     <w:tblStylePr w:type="firstCol">
       <w:pPr>
-        <w:wordWrap w:val="1"/>
+        <w:wordWrap/>
         <w:jc w:val="left"/>
       </w:pPr>
       <w:rPr>
-        <w:b w:val="1"/>
+        <w:b/>
       </w:rPr>
     </w:tblStylePr>
   </w:style>
@@ -3131,32 +3033,32 @@
     </w:tblPr>
     <w:tblStylePr w:type="firstRow">
       <w:rPr>
-        <w:rFonts w:asciiTheme="majorHAnsi" w:cstheme="majorBidi" w:eastAsiaTheme="majorEastAsia" w:hAnsiTheme="majorHAnsi"/>
-        <w:i w:val="1"/>
-        <w:iCs w:val="1"/>
+        <w:rFonts w:asciiTheme="majorHAnsi" w:eastAsiaTheme="majorEastAsia" w:hAnsiTheme="majorHAnsi" w:cstheme="majorBidi"/>
+        <w:i/>
+        <w:iCs/>
         <w:sz w:val="26"/>
       </w:rPr>
       <w:tblPr/>
       <w:tcPr>
         <w:tcBorders>
-          <w:bottom w:color="7f7f7f" w:space="0" w:sz="4" w:themeColor="text1" w:themeTint="000080" w:val="single"/>
+          <w:bottom w:val="single" w:sz="4" w:space="0" w:color="7F7F7F" w:themeColor="text1" w:themeTint="80"/>
         </w:tcBorders>
-        <w:shd w:color="auto" w:fill="ffffff" w:themeFill="background1" w:val="clear"/>
+        <w:shd w:val="clear" w:color="auto" w:fill="FFFFFF" w:themeFill="background1"/>
       </w:tcPr>
     </w:tblStylePr>
     <w:tblStylePr w:type="lastRow">
       <w:rPr>
-        <w:rFonts w:asciiTheme="majorHAnsi" w:cstheme="majorBidi" w:eastAsiaTheme="majorEastAsia" w:hAnsiTheme="majorHAnsi"/>
-        <w:i w:val="1"/>
-        <w:iCs w:val="1"/>
+        <w:rFonts w:asciiTheme="majorHAnsi" w:eastAsiaTheme="majorEastAsia" w:hAnsiTheme="majorHAnsi" w:cstheme="majorBidi"/>
+        <w:i/>
+        <w:iCs/>
         <w:sz w:val="26"/>
       </w:rPr>
       <w:tblPr/>
       <w:tcPr>
         <w:tcBorders>
-          <w:top w:color="7f7f7f" w:space="0" w:sz="4" w:themeColor="text1" w:themeTint="000080" w:val="single"/>
+          <w:top w:val="single" w:sz="4" w:space="0" w:color="7F7F7F" w:themeColor="text1" w:themeTint="80"/>
         </w:tcBorders>
-        <w:shd w:color="auto" w:fill="ffffff" w:themeFill="background1" w:val="clear"/>
+        <w:shd w:val="clear" w:color="auto" w:fill="FFFFFF" w:themeFill="background1"/>
       </w:tcPr>
     </w:tblStylePr>
     <w:tblStylePr w:type="firstCol">
@@ -3164,51 +3066,51 @@
         <w:jc w:val="right"/>
       </w:pPr>
       <w:rPr>
-        <w:rFonts w:asciiTheme="majorHAnsi" w:cstheme="majorBidi" w:eastAsiaTheme="majorEastAsia" w:hAnsiTheme="majorHAnsi"/>
-        <w:i w:val="1"/>
-        <w:iCs w:val="1"/>
+        <w:rFonts w:asciiTheme="majorHAnsi" w:eastAsiaTheme="majorEastAsia" w:hAnsiTheme="majorHAnsi" w:cstheme="majorBidi"/>
+        <w:i/>
+        <w:iCs/>
         <w:sz w:val="26"/>
       </w:rPr>
       <w:tblPr/>
       <w:tcPr>
         <w:tcBorders>
-          <w:right w:color="7f7f7f" w:space="0" w:sz="4" w:themeColor="text1" w:themeTint="000080" w:val="single"/>
+          <w:right w:val="single" w:sz="4" w:space="0" w:color="7F7F7F" w:themeColor="text1" w:themeTint="80"/>
         </w:tcBorders>
-        <w:shd w:color="auto" w:fill="ffffff" w:themeFill="background1" w:val="clear"/>
+        <w:shd w:val="clear" w:color="auto" w:fill="FFFFFF" w:themeFill="background1"/>
       </w:tcPr>
     </w:tblStylePr>
     <w:tblStylePr w:type="lastCol">
       <w:rPr>
-        <w:rFonts w:asciiTheme="majorHAnsi" w:cstheme="majorBidi" w:eastAsiaTheme="majorEastAsia" w:hAnsiTheme="majorHAnsi"/>
-        <w:i w:val="1"/>
-        <w:iCs w:val="1"/>
+        <w:rFonts w:asciiTheme="majorHAnsi" w:eastAsiaTheme="majorEastAsia" w:hAnsiTheme="majorHAnsi" w:cstheme="majorBidi"/>
+        <w:i/>
+        <w:iCs/>
         <w:sz w:val="26"/>
       </w:rPr>
       <w:tblPr/>
       <w:tcPr>
         <w:tcBorders>
-          <w:left w:color="7f7f7f" w:space="0" w:sz="4" w:themeColor="text1" w:themeTint="000080" w:val="single"/>
+          <w:left w:val="single" w:sz="4" w:space="0" w:color="7F7F7F" w:themeColor="text1" w:themeTint="80"/>
         </w:tcBorders>
-        <w:shd w:color="auto" w:fill="ffffff" w:themeFill="background1" w:val="clear"/>
+        <w:shd w:val="clear" w:color="auto" w:fill="FFFFFF" w:themeFill="background1"/>
       </w:tcPr>
     </w:tblStylePr>
     <w:tblStylePr w:type="band1Vert">
       <w:tblPr/>
       <w:tcPr>
-        <w:shd w:color="auto" w:fill="f2f2f2" w:themeFill="background1" w:themeFillShade="0000F2" w:val="clear"/>
+        <w:shd w:val="clear" w:color="auto" w:fill="F2F2F2" w:themeFill="background1" w:themeFillShade="F2"/>
       </w:tcPr>
     </w:tblStylePr>
     <w:tblStylePr w:type="band1Horz">
       <w:tblPr/>
       <w:tcPr>
-        <w:shd w:color="auto" w:fill="f2f2f2" w:themeFill="background1" w:themeFillShade="0000F2" w:val="clear"/>
+        <w:shd w:val="clear" w:color="auto" w:fill="F2F2F2" w:themeFill="background1" w:themeFillShade="F2"/>
       </w:tcPr>
     </w:tblStylePr>
     <w:tblStylePr w:type="neCell">
       <w:tblPr/>
       <w:tcPr>
         <w:tcBorders>
-          <w:left w:space="0" w:sz="0" w:val="nil"/>
+          <w:left w:val="nil"/>
         </w:tcBorders>
       </w:tcPr>
     </w:tblStylePr>
@@ -3216,7 +3118,7 @@
       <w:tblPr/>
       <w:tcPr>
         <w:tcBorders>
-          <w:right w:space="0" w:sz="0" w:val="nil"/>
+          <w:right w:val="nil"/>
         </w:tcBorders>
       </w:tcPr>
     </w:tblStylePr>
@@ -3224,7 +3126,7 @@
       <w:tblPr/>
       <w:tcPr>
         <w:tcBorders>
-          <w:left w:space="0" w:sz="0" w:val="nil"/>
+          <w:left w:val="nil"/>
         </w:tcBorders>
       </w:tcPr>
     </w:tblStylePr>
@@ -3232,7 +3134,7 @@
       <w:tblPr/>
       <w:tcPr>
         <w:tcBorders>
-          <w:right w:space="0" w:sz="0" w:val="nil"/>
+          <w:right w:val="nil"/>
         </w:tcBorders>
       </w:tcPr>
     </w:tblStylePr>
@@ -3249,49 +3151,49 @@
       <w:tblStyleRowBandSize w:val="1"/>
       <w:tblStyleColBandSize w:val="1"/>
       <w:tblBorders>
-        <w:top w:color="8eaadb" w:space="0" w:sz="4" w:themeColor="accent5" w:themeTint="000099" w:val="single"/>
-        <w:bottom w:color="8eaadb" w:space="0" w:sz="4" w:themeColor="accent5" w:themeTint="000099" w:val="single"/>
-        <w:insideH w:color="8eaadb" w:space="0" w:sz="4" w:themeColor="accent5" w:themeTint="000099" w:val="single"/>
+        <w:top w:val="single" w:sz="4" w:space="0" w:color="8EAADB" w:themeColor="accent5" w:themeTint="99"/>
+        <w:bottom w:val="single" w:sz="4" w:space="0" w:color="8EAADB" w:themeColor="accent5" w:themeTint="99"/>
+        <w:insideH w:val="single" w:sz="4" w:space="0" w:color="8EAADB" w:themeColor="accent5" w:themeTint="99"/>
       </w:tblBorders>
     </w:tblPr>
     <w:tblStylePr w:type="firstRow">
       <w:rPr>
-        <w:b w:val="1"/>
-        <w:bCs w:val="1"/>
+        <w:b/>
+        <w:bCs/>
       </w:rPr>
     </w:tblStylePr>
     <w:tblStylePr w:type="lastRow">
       <w:rPr>
-        <w:b w:val="1"/>
-        <w:bCs w:val="1"/>
+        <w:b/>
+        <w:bCs/>
       </w:rPr>
     </w:tblStylePr>
     <w:tblStylePr w:type="firstCol">
       <w:rPr>
-        <w:b w:val="1"/>
-        <w:bCs w:val="1"/>
+        <w:b/>
+        <w:bCs/>
       </w:rPr>
     </w:tblStylePr>
     <w:tblStylePr w:type="lastCol">
       <w:rPr>
-        <w:b w:val="1"/>
-        <w:bCs w:val="1"/>
+        <w:b/>
+        <w:bCs/>
       </w:rPr>
     </w:tblStylePr>
     <w:tblStylePr w:type="band1Vert">
       <w:tblPr/>
       <w:tcPr>
-        <w:shd w:color="auto" w:fill="d9e2f3" w:themeFill="accent5" w:themeFillTint="000033" w:val="clear"/>
+        <w:shd w:val="clear" w:color="auto" w:fill="D9E2F3" w:themeFill="accent5" w:themeFillTint="33"/>
       </w:tcPr>
     </w:tblStylePr>
     <w:tblStylePr w:type="band1Horz">
       <w:tblPr/>
       <w:tcPr>
-        <w:shd w:color="auto" w:fill="d9e2f3" w:themeFill="accent5" w:themeFillTint="000033" w:val="clear"/>
+        <w:shd w:val="clear" w:color="auto" w:fill="D9E2F3" w:themeFill="accent5" w:themeFillTint="33"/>
       </w:tcPr>
     </w:tblStylePr>
   </w:style>
-  <w:style w:type="paragraph" w:styleId="3CBD5A742C28424DA5172AD252E32316" w:customStyle="1">
+  <w:style w:type="paragraph" w:customStyle="1" w:styleId="3CBD5A742C28424DA5172AD252E32316">
     <w:name w:val="3CBD5A742C28424DA5172AD252E32316"/>
     <w:rsid w:val="00E53696"/>
     <w:pPr>
@@ -3299,25 +3201,17 @@
     </w:pPr>
     <w:rPr>
       <w:rFonts w:eastAsiaTheme="minorEastAsia"/>
-      <w:lang w:eastAsia="es-CL"/>
     </w:rPr>
   </w:style>
   <w:style w:type="paragraph" w:styleId="TtuloTDC">
     <w:name w:val="TOC Heading"/>
-    <w:basedOn w:val="Ttulo1"/>
     <w:next w:val="Normal"/>
     <w:uiPriority w:val="39"/>
-    <w:unhideWhenUsed w:val="1"/>
-    <w:qFormat w:val="1"/>
+    <w:unhideWhenUsed/>
+    <w:qFormat/>
     <w:rsid w:val="00A46B8F"/>
-    <w:pPr>
-      <w:outlineLvl w:val="9"/>
-    </w:pPr>
-    <w:rPr>
-      <w:lang w:eastAsia="es-CL"/>
-    </w:rPr>
-  </w:style>
-  <w:style w:type="character" w:styleId="PrrafodelistaCar" w:customStyle="1">
+  </w:style>
+  <w:style w:type="character" w:customStyle="1" w:styleId="PrrafodelistaCar">
     <w:name w:val="Párrafo de lista Car"/>
     <w:link w:val="Prrafodelista"/>
     <w:uiPriority w:val="34"/>
@@ -3327,9 +3221,9 @@
     <w:name w:val="toc 1"/>
     <w:basedOn w:val="Normal"/>
     <w:next w:val="Normal"/>
-    <w:autoRedefine w:val="1"/>
+    <w:autoRedefine/>
     <w:uiPriority w:val="39"/>
-    <w:unhideWhenUsed w:val="1"/>
+    <w:unhideWhenUsed/>
     <w:rsid w:val="00A46B8F"/>
     <w:pPr>
       <w:spacing w:after="100"/>
@@ -3339,9 +3233,9 @@
     <w:name w:val="toc 2"/>
     <w:basedOn w:val="Normal"/>
     <w:next w:val="Normal"/>
-    <w:autoRedefine w:val="1"/>
+    <w:autoRedefine/>
     <w:uiPriority w:val="39"/>
-    <w:unhideWhenUsed w:val="1"/>
+    <w:unhideWhenUsed/>
     <w:rsid w:val="00A46B8F"/>
     <w:pPr>
       <w:spacing w:after="100"/>
@@ -3352,9 +3246,9 @@
     <w:name w:val="toc 3"/>
     <w:basedOn w:val="Normal"/>
     <w:next w:val="Normal"/>
-    <w:autoRedefine w:val="1"/>
+    <w:autoRedefine/>
     <w:uiPriority w:val="39"/>
-    <w:unhideWhenUsed w:val="1"/>
+    <w:unhideWhenUsed/>
     <w:rsid w:val="00A46B8F"/>
     <w:pPr>
       <w:spacing w:after="100"/>
@@ -3367,35 +3261,35 @@
     <w:next w:val="Normal"/>
     <w:link w:val="CitadestacadaCar"/>
     <w:uiPriority w:val="30"/>
-    <w:qFormat w:val="1"/>
+    <w:qFormat/>
     <w:rsid w:val="00C04221"/>
     <w:pPr>
       <w:pBdr>
-        <w:bottom w:color="5b9bd5" w:space="4" w:sz="4" w:themeColor="accent1" w:val="single"/>
+        <w:bottom w:val="single" w:sz="4" w:space="4" w:color="5B9BD5" w:themeColor="accent1"/>
       </w:pBdr>
-      <w:spacing w:after="280" w:before="200" w:line="276" w:lineRule="auto"/>
+      <w:spacing w:before="200" w:after="280" w:line="276" w:lineRule="auto"/>
       <w:ind w:left="936" w:right="936"/>
     </w:pPr>
     <w:rPr>
-      <w:b w:val="1"/>
-      <w:bCs w:val="1"/>
-      <w:i w:val="1"/>
-      <w:iCs w:val="1"/>
-      <w:color w:val="5b9bd5" w:themeColor="accent1"/>
+      <w:b/>
+      <w:bCs/>
+      <w:i/>
+      <w:iCs/>
+      <w:color w:val="5B9BD5" w:themeColor="accent1"/>
     </w:rPr>
   </w:style>
-  <w:style w:type="character" w:styleId="CitadestacadaCar" w:customStyle="1">
+  <w:style w:type="character" w:customStyle="1" w:styleId="CitadestacadaCar">
     <w:name w:val="Cita destacada Car"/>
     <w:basedOn w:val="Fuentedeprrafopredeter"/>
     <w:link w:val="Citadestacada"/>
     <w:uiPriority w:val="30"/>
     <w:rsid w:val="00C04221"/>
     <w:rPr>
-      <w:b w:val="1"/>
-      <w:bCs w:val="1"/>
-      <w:i w:val="1"/>
-      <w:iCs w:val="1"/>
-      <w:color w:val="5b9bd5" w:themeColor="accent1"/>
+      <w:b/>
+      <w:bCs/>
+      <w:i/>
+      <w:iCs/>
+      <w:color w:val="5B9BD5" w:themeColor="accent1"/>
     </w:rPr>
   </w:style>
   <w:style w:type="paragraph" w:styleId="Descripcin">
@@ -3403,20 +3297,20 @@
     <w:basedOn w:val="Normal"/>
     <w:next w:val="Normal"/>
     <w:uiPriority w:val="35"/>
-    <w:unhideWhenUsed w:val="1"/>
-    <w:qFormat w:val="1"/>
+    <w:unhideWhenUsed/>
+    <w:qFormat/>
     <w:rsid w:val="00C04221"/>
     <w:pPr>
       <w:spacing w:before="40" w:line="240" w:lineRule="auto"/>
     </w:pPr>
     <w:rPr>
-      <w:b w:val="1"/>
-      <w:bCs w:val="1"/>
-      <w:color w:val="5b9bd5" w:themeColor="accent1"/>
+      <w:b/>
+      <w:bCs/>
+      <w:color w:val="5B9BD5" w:themeColor="accent1"/>
       <w:kern w:val="20"/>
       <w:sz w:val="18"/>
       <w:szCs w:val="20"/>
-      <w:lang w:eastAsia="ja-JP" w:val="en-US"/>
+      <w:lang w:val="en-US" w:eastAsia="ja-JP"/>
     </w:rPr>
   </w:style>
   <w:style w:type="paragraph" w:styleId="Textonotapie">
@@ -3424,8 +3318,8 @@
     <w:basedOn w:val="Normal"/>
     <w:link w:val="TextonotapieCar"/>
     <w:uiPriority w:val="99"/>
-    <w:semiHidden w:val="1"/>
-    <w:unhideWhenUsed w:val="1"/>
+    <w:semiHidden/>
+    <w:unhideWhenUsed/>
     <w:rsid w:val="005D5259"/>
     <w:pPr>
       <w:spacing w:after="0" w:line="240" w:lineRule="auto"/>
@@ -3436,12 +3330,12 @@
       <w:lang w:val="es-ES"/>
     </w:rPr>
   </w:style>
-  <w:style w:type="character" w:styleId="TextonotapieCar" w:customStyle="1">
+  <w:style w:type="character" w:customStyle="1" w:styleId="TextonotapieCar">
     <w:name w:val="Texto nota pie Car"/>
     <w:basedOn w:val="Fuentedeprrafopredeter"/>
     <w:link w:val="Textonotapie"/>
     <w:uiPriority w:val="99"/>
-    <w:semiHidden w:val="1"/>
+    <w:semiHidden/>
     <w:rsid w:val="005D5259"/>
     <w:rPr>
       <w:sz w:val="20"/>
@@ -3452,18 +3346,18 @@
   <w:style w:type="character" w:styleId="Refdenotaalpie">
     <w:name w:val="footnote reference"/>
     <w:basedOn w:val="Fuentedeprrafopredeter"/>
-    <w:unhideWhenUsed w:val="1"/>
+    <w:unhideWhenUsed/>
     <w:rsid w:val="005D5259"/>
     <w:rPr>
       <w:vertAlign w:val="superscript"/>
     </w:rPr>
   </w:style>
-  <w:style w:type="character" w:styleId="normaltextrun" w:customStyle="1">
+  <w:style w:type="character" w:customStyle="1" w:styleId="normaltextrun">
     <w:name w:val="normaltextrun"/>
     <w:basedOn w:val="Fuentedeprrafopredeter"/>
     <w:rsid w:val="0024234D"/>
   </w:style>
-  <w:style w:type="paragraph" w:styleId="Default" w:customStyle="1">
+  <w:style w:type="paragraph" w:customStyle="1" w:styleId="Default">
     <w:name w:val="Default"/>
     <w:rsid w:val="00E454BE"/>
     <w:pPr>
@@ -3473,13 +3367,12 @@
       <w:spacing w:after="0" w:line="240" w:lineRule="auto"/>
     </w:pPr>
     <w:rPr>
-      <w:rFonts w:ascii="Calibri" w:cs="Calibri" w:hAnsi="Calibri"/>
       <w:color w:val="000000"/>
       <w:sz w:val="24"/>
       <w:szCs w:val="24"/>
     </w:rPr>
   </w:style>
-  <w:style w:type="table" w:styleId="Cuadrculadetablaclara">
+  <w:style w:type="table" w:styleId="Tablaconcuadrculaclara">
     <w:name w:val="Grid Table Light"/>
     <w:basedOn w:val="Tablanormal"/>
     <w:uiPriority w:val="40"/>
@@ -3489,19 +3382,19 @@
     </w:pPr>
     <w:tblPr>
       <w:tblBorders>
-        <w:top w:color="bfbfbf" w:space="0" w:sz="4" w:themeColor="background1" w:themeShade="0000BF" w:val="single"/>
-        <w:left w:color="bfbfbf" w:space="0" w:sz="4" w:themeColor="background1" w:themeShade="0000BF" w:val="single"/>
-        <w:bottom w:color="bfbfbf" w:space="0" w:sz="4" w:themeColor="background1" w:themeShade="0000BF" w:val="single"/>
-        <w:right w:color="bfbfbf" w:space="0" w:sz="4" w:themeColor="background1" w:themeShade="0000BF" w:val="single"/>
-        <w:insideH w:color="bfbfbf" w:space="0" w:sz="4" w:themeColor="background1" w:themeShade="0000BF" w:val="single"/>
-        <w:insideV w:color="bfbfbf" w:space="0" w:sz="4" w:themeColor="background1" w:themeShade="0000BF" w:val="single"/>
+        <w:top w:val="single" w:sz="4" w:space="0" w:color="BFBFBF" w:themeColor="background1" w:themeShade="BF"/>
+        <w:left w:val="single" w:sz="4" w:space="0" w:color="BFBFBF" w:themeColor="background1" w:themeShade="BF"/>
+        <w:bottom w:val="single" w:sz="4" w:space="0" w:color="BFBFBF" w:themeColor="background1" w:themeShade="BF"/>
+        <w:right w:val="single" w:sz="4" w:space="0" w:color="BFBFBF" w:themeColor="background1" w:themeShade="BF"/>
+        <w:insideH w:val="single" w:sz="4" w:space="0" w:color="BFBFBF" w:themeColor="background1" w:themeShade="BF"/>
+        <w:insideV w:val="single" w:sz="4" w:space="0" w:color="BFBFBF" w:themeColor="background1" w:themeShade="BF"/>
       </w:tblBorders>
     </w:tblPr>
   </w:style>
-  <w:style w:type="table" w:styleId="Cuadrculadetablaclara1" w:customStyle="1">
+  <w:style w:type="table" w:customStyle="1" w:styleId="Cuadrculadetablaclara1">
     <w:name w:val="Cuadrícula de tabla clara1"/>
     <w:basedOn w:val="Tablanormal"/>
-    <w:next w:val="Cuadrculadetablaclara"/>
+    <w:next w:val="Tablaconcuadrculaclara"/>
     <w:uiPriority w:val="40"/>
     <w:rsid w:val="00943DF1"/>
     <w:pPr>
@@ -3509,66 +3402,66 @@
     </w:pPr>
     <w:tblPr>
       <w:tblBorders>
-        <w:top w:color="bfbfbf" w:space="0" w:sz="4" w:themeColor="background1" w:themeShade="0000BF" w:val="single"/>
-        <w:left w:color="bfbfbf" w:space="0" w:sz="4" w:themeColor="background1" w:themeShade="0000BF" w:val="single"/>
-        <w:bottom w:color="bfbfbf" w:space="0" w:sz="4" w:themeColor="background1" w:themeShade="0000BF" w:val="single"/>
-        <w:right w:color="bfbfbf" w:space="0" w:sz="4" w:themeColor="background1" w:themeShade="0000BF" w:val="single"/>
-        <w:insideH w:color="bfbfbf" w:space="0" w:sz="4" w:themeColor="background1" w:themeShade="0000BF" w:val="single"/>
-        <w:insideV w:color="bfbfbf" w:space="0" w:sz="4" w:themeColor="background1" w:themeShade="0000BF" w:val="single"/>
+        <w:top w:val="single" w:sz="4" w:space="0" w:color="BFBFBF" w:themeColor="background1" w:themeShade="BF"/>
+        <w:left w:val="single" w:sz="4" w:space="0" w:color="BFBFBF" w:themeColor="background1" w:themeShade="BF"/>
+        <w:bottom w:val="single" w:sz="4" w:space="0" w:color="BFBFBF" w:themeColor="background1" w:themeShade="BF"/>
+        <w:right w:val="single" w:sz="4" w:space="0" w:color="BFBFBF" w:themeColor="background1" w:themeShade="BF"/>
+        <w:insideH w:val="single" w:sz="4" w:space="0" w:color="BFBFBF" w:themeColor="background1" w:themeShade="BF"/>
+        <w:insideV w:val="single" w:sz="4" w:space="0" w:color="BFBFBF" w:themeColor="background1" w:themeShade="BF"/>
       </w:tblBorders>
     </w:tblPr>
   </w:style>
-  <w:style w:type="paragraph" w:styleId="m4042760116434134222msolistparagraph" w:customStyle="1">
+  <w:style w:type="paragraph" w:customStyle="1" w:styleId="m4042760116434134222msolistparagraph">
     <w:name w:val="m_4042760116434134222msolistparagraph"/>
     <w:basedOn w:val="Normal"/>
     <w:rsid w:val="004F1A46"/>
     <w:pPr>
-      <w:spacing w:after="100" w:afterAutospacing="1" w:before="100" w:beforeAutospacing="1" w:line="240" w:lineRule="auto"/>
+      <w:spacing w:before="100" w:beforeAutospacing="1" w:after="100" w:afterAutospacing="1" w:line="240" w:lineRule="auto"/>
     </w:pPr>
     <w:rPr>
-      <w:rFonts w:ascii="Times New Roman" w:cs="Times New Roman" w:eastAsia="Times New Roman" w:hAnsi="Times New Roman"/>
+      <w:rFonts w:ascii="Times New Roman" w:eastAsia="Times New Roman" w:hAnsi="Times New Roman" w:cs="Times New Roman"/>
       <w:sz w:val="24"/>
       <w:szCs w:val="24"/>
-      <w:lang w:eastAsia="es-CL"/>
     </w:rPr>
   </w:style>
   <w:style w:type="paragraph" w:styleId="Revisin">
     <w:name w:val="Revision"/>
-    <w:hidden w:val="1"/>
+    <w:hidden/>
     <w:uiPriority w:val="99"/>
-    <w:semiHidden w:val="1"/>
+    <w:semiHidden/>
     <w:rsid w:val="00C73FD9"/>
     <w:pPr>
       <w:spacing w:after="0" w:line="240" w:lineRule="auto"/>
     </w:pPr>
   </w:style>
-  <w:style w:type="character" w:styleId="Textoennegrita">
+  <w:style w:type="character" w:styleId="Fuerte">
     <w:name w:val="Strong"/>
     <w:basedOn w:val="Fuentedeprrafopredeter"/>
     <w:uiPriority w:val="22"/>
-    <w:qFormat w:val="1"/>
+    <w:qFormat/>
     <w:rsid w:val="002C4FB7"/>
     <w:rPr>
-      <w:b w:val="1"/>
-      <w:bCs w:val="1"/>
+      <w:b/>
+      <w:bCs/>
     </w:rPr>
   </w:style>
-  <w:style w:type="paragraph" w:styleId="Subtitle">
+  <w:style w:type="paragraph" w:styleId="Subttulo">
     <w:name w:val="Subtitle"/>
     <w:basedOn w:val="Normal"/>
     <w:next w:val="Normal"/>
+    <w:uiPriority w:val="11"/>
+    <w:qFormat/>
     <w:pPr>
       <w:spacing w:before="40" w:line="288" w:lineRule="auto"/>
       <w:ind w:left="432" w:right="1080"/>
     </w:pPr>
     <w:rPr>
-      <w:rFonts w:ascii="Calibri" w:cs="Calibri" w:eastAsia="Calibri" w:hAnsi="Calibri"/>
-      <w:color w:val="5b9bd5"/>
+      <w:color w:val="5B9BD5"/>
       <w:sz w:val="56"/>
       <w:szCs w:val="56"/>
     </w:rPr>
   </w:style>
-  <w:style w:type="table" w:styleId="Table1">
+  <w:style w:type="table" w:customStyle="1" w:styleId="a">
     <w:basedOn w:val="TableNormal"/>
     <w:pPr>
       <w:spacing w:after="0" w:line="240" w:lineRule="auto"/>
@@ -3577,27 +3470,27 @@
       <w:tblStyleRowBandSize w:val="1"/>
       <w:tblStyleColBandSize w:val="1"/>
       <w:tblCellMar>
-        <w:top w:w="0.0" w:type="dxa"/>
-        <w:left w:w="108.0" w:type="dxa"/>
-        <w:bottom w:w="0.0" w:type="dxa"/>
-        <w:right w:w="108.0" w:type="dxa"/>
+        <w:top w:w="0" w:type="dxa"/>
+        <w:left w:w="108" w:type="dxa"/>
+        <w:bottom w:w="0" w:type="dxa"/>
+        <w:right w:w="108" w:type="dxa"/>
       </w:tblCellMar>
     </w:tblPr>
   </w:style>
-  <w:style w:type="table" w:styleId="Table2">
+  <w:style w:type="table" w:customStyle="1" w:styleId="a0">
     <w:basedOn w:val="TableNormal"/>
     <w:tblPr>
       <w:tblStyleRowBandSize w:val="1"/>
       <w:tblStyleColBandSize w:val="1"/>
       <w:tblCellMar>
-        <w:top w:w="15.0" w:type="dxa"/>
-        <w:left w:w="15.0" w:type="dxa"/>
-        <w:bottom w:w="15.0" w:type="dxa"/>
-        <w:right w:w="15.0" w:type="dxa"/>
+        <w:top w:w="15" w:type="dxa"/>
+        <w:left w:w="15" w:type="dxa"/>
+        <w:bottom w:w="15" w:type="dxa"/>
+        <w:right w:w="15" w:type="dxa"/>
       </w:tblCellMar>
     </w:tblPr>
   </w:style>
-  <w:style w:type="table" w:styleId="Table3">
+  <w:style w:type="table" w:customStyle="1" w:styleId="a1">
     <w:basedOn w:val="TableNormal"/>
     <w:pPr>
       <w:spacing w:after="0" w:line="240" w:lineRule="auto"/>
@@ -3606,14 +3499,14 @@
       <w:tblStyleRowBandSize w:val="1"/>
       <w:tblStyleColBandSize w:val="1"/>
       <w:tblCellMar>
-        <w:top w:w="0.0" w:type="dxa"/>
-        <w:left w:w="108.0" w:type="dxa"/>
-        <w:bottom w:w="0.0" w:type="dxa"/>
-        <w:right w:w="108.0" w:type="dxa"/>
+        <w:top w:w="0" w:type="dxa"/>
+        <w:left w:w="108" w:type="dxa"/>
+        <w:bottom w:w="0" w:type="dxa"/>
+        <w:right w:w="108" w:type="dxa"/>
       </w:tblCellMar>
     </w:tblPr>
   </w:style>
-  <w:style w:type="table" w:styleId="Table4">
+  <w:style w:type="table" w:customStyle="1" w:styleId="a2">
     <w:basedOn w:val="TableNormal"/>
     <w:pPr>
       <w:spacing w:after="0" w:line="240" w:lineRule="auto"/>
@@ -3622,14 +3515,14 @@
       <w:tblStyleRowBandSize w:val="1"/>
       <w:tblStyleColBandSize w:val="1"/>
       <w:tblCellMar>
-        <w:top w:w="0.0" w:type="dxa"/>
-        <w:left w:w="108.0" w:type="dxa"/>
-        <w:bottom w:w="0.0" w:type="dxa"/>
-        <w:right w:w="108.0" w:type="dxa"/>
+        <w:top w:w="0" w:type="dxa"/>
+        <w:left w:w="108" w:type="dxa"/>
+        <w:bottom w:w="0" w:type="dxa"/>
+        <w:right w:w="108" w:type="dxa"/>
       </w:tblCellMar>
     </w:tblPr>
   </w:style>
-  <w:style w:type="table" w:styleId="Table5">
+  <w:style w:type="table" w:customStyle="1" w:styleId="a3">
     <w:basedOn w:val="TableNormal"/>
     <w:pPr>
       <w:spacing w:after="0" w:line="240" w:lineRule="auto"/>
@@ -3638,14 +3531,14 @@
       <w:tblStyleRowBandSize w:val="1"/>
       <w:tblStyleColBandSize w:val="1"/>
       <w:tblCellMar>
-        <w:top w:w="0.0" w:type="dxa"/>
-        <w:left w:w="108.0" w:type="dxa"/>
-        <w:bottom w:w="0.0" w:type="dxa"/>
-        <w:right w:w="108.0" w:type="dxa"/>
+        <w:top w:w="0" w:type="dxa"/>
+        <w:left w:w="108" w:type="dxa"/>
+        <w:bottom w:w="0" w:type="dxa"/>
+        <w:right w:w="108" w:type="dxa"/>
       </w:tblCellMar>
     </w:tblPr>
   </w:style>
-  <w:style w:type="table" w:styleId="Table6">
+  <w:style w:type="table" w:customStyle="1" w:styleId="a4">
     <w:basedOn w:val="TableNormal"/>
     <w:pPr>
       <w:spacing w:after="0" w:line="240" w:lineRule="auto"/>
@@ -3654,14 +3547,14 @@
       <w:tblStyleRowBandSize w:val="1"/>
       <w:tblStyleColBandSize w:val="1"/>
       <w:tblCellMar>
-        <w:top w:w="0.0" w:type="dxa"/>
-        <w:left w:w="108.0" w:type="dxa"/>
-        <w:bottom w:w="0.0" w:type="dxa"/>
-        <w:right w:w="108.0" w:type="dxa"/>
+        <w:top w:w="0" w:type="dxa"/>
+        <w:left w:w="108" w:type="dxa"/>
+        <w:bottom w:w="0" w:type="dxa"/>
+        <w:right w:w="108" w:type="dxa"/>
       </w:tblCellMar>
     </w:tblPr>
   </w:style>
-  <w:style w:type="table" w:styleId="Table7">
+  <w:style w:type="table" w:customStyle="1" w:styleId="a5">
     <w:basedOn w:val="TableNormal"/>
     <w:pPr>
       <w:spacing w:after="0" w:line="240" w:lineRule="auto"/>
@@ -3670,14 +3563,14 @@
       <w:tblStyleRowBandSize w:val="1"/>
       <w:tblStyleColBandSize w:val="1"/>
       <w:tblCellMar>
-        <w:top w:w="0.0" w:type="dxa"/>
-        <w:left w:w="108.0" w:type="dxa"/>
-        <w:bottom w:w="0.0" w:type="dxa"/>
-        <w:right w:w="108.0" w:type="dxa"/>
+        <w:top w:w="0" w:type="dxa"/>
+        <w:left w:w="108" w:type="dxa"/>
+        <w:bottom w:w="0" w:type="dxa"/>
+        <w:right w:w="108" w:type="dxa"/>
       </w:tblCellMar>
     </w:tblPr>
   </w:style>
-  <w:style w:type="table" w:styleId="Table8">
+  <w:style w:type="table" w:customStyle="1" w:styleId="a6">
     <w:basedOn w:val="TableNormal"/>
     <w:pPr>
       <w:spacing w:after="0" w:line="240" w:lineRule="auto"/>
@@ -3686,14 +3579,14 @@
       <w:tblStyleRowBandSize w:val="1"/>
       <w:tblStyleColBandSize w:val="1"/>
       <w:tblCellMar>
-        <w:top w:w="0.0" w:type="dxa"/>
-        <w:left w:w="108.0" w:type="dxa"/>
-        <w:bottom w:w="0.0" w:type="dxa"/>
-        <w:right w:w="108.0" w:type="dxa"/>
+        <w:top w:w="0" w:type="dxa"/>
+        <w:left w:w="108" w:type="dxa"/>
+        <w:bottom w:w="0" w:type="dxa"/>
+        <w:right w:w="108" w:type="dxa"/>
       </w:tblCellMar>
     </w:tblPr>
   </w:style>
-  <w:style w:type="table" w:styleId="Table9">
+  <w:style w:type="table" w:customStyle="1" w:styleId="a7">
     <w:basedOn w:val="TableNormal"/>
     <w:pPr>
       <w:spacing w:after="0" w:line="240" w:lineRule="auto"/>
@@ -3702,14 +3595,14 @@
       <w:tblStyleRowBandSize w:val="1"/>
       <w:tblStyleColBandSize w:val="1"/>
       <w:tblCellMar>
-        <w:top w:w="0.0" w:type="dxa"/>
-        <w:left w:w="108.0" w:type="dxa"/>
-        <w:bottom w:w="0.0" w:type="dxa"/>
-        <w:right w:w="108.0" w:type="dxa"/>
+        <w:top w:w="0" w:type="dxa"/>
+        <w:left w:w="108" w:type="dxa"/>
+        <w:bottom w:w="0" w:type="dxa"/>
+        <w:right w:w="108" w:type="dxa"/>
       </w:tblCellMar>
     </w:tblPr>
   </w:style>
-  <w:style w:type="table" w:styleId="Table10">
+  <w:style w:type="table" w:customStyle="1" w:styleId="a8">
     <w:basedOn w:val="TableNormal"/>
     <w:pPr>
       <w:spacing w:after="0" w:line="240" w:lineRule="auto"/>
@@ -3718,10 +3611,10 @@
       <w:tblStyleRowBandSize w:val="1"/>
       <w:tblStyleColBandSize w:val="1"/>
       <w:tblCellMar>
-        <w:top w:w="0.0" w:type="dxa"/>
-        <w:left w:w="108.0" w:type="dxa"/>
-        <w:bottom w:w="0.0" w:type="dxa"/>
-        <w:right w:w="108.0" w:type="dxa"/>
+        <w:top w:w="0" w:type="dxa"/>
+        <w:left w:w="108" w:type="dxa"/>
+        <w:bottom w:w="0" w:type="dxa"/>
+        <w:right w:w="108" w:type="dxa"/>
       </w:tblCellMar>
     </w:tblPr>
   </w:style>
@@ -3989,17 +3882,17 @@
 </a:theme>
 </file>
 
-<file path=customXML/item1.xml><?xml version="1.0" encoding="utf-8"?>
+<file path=customXml/item1.xml><?xml version="1.0" encoding="utf-8"?>
 <go:gDocsCustomXmlDataStorage xmlns:go="http://customooxmlschemas.google.com/" xmlns:r="http://schemas.openxmlformats.org/officeDocument/2006/relationships" uri="GoogleDocsCustomDataVersion2">
   <go:docsCustomData xmlns:go="http://customooxmlschemas.google.com/" roundtripDataSignature="AMtx7miz20BA5ual8nXfUsvfyMJc0puqJw==">CgMxLjAyDmguaGk0a2xocTU2ZDZ2OAByITFybGVtUkU1eTNUbWpmVnhwT0hGSjljQjI4SjBrLWtNbA==</go:docsCustomData>
 </go:gDocsCustomXmlDataStorage>
 </file>
 
-<file path=customXML/itemProps1.xml><?xml version="1.0" encoding="utf-8"?>
+<file path=customXml/itemProps1.xml><?xml version="1.0" encoding="utf-8"?>
 <ds:datastoreItem xmlns:ds="http://schemas.openxmlformats.org/officeDocument/2006/customXml" ds:itemID="{11111111-1234-1234-1234-123412341234}">
   <ds:schemaRefs>
+    <ds:schemaRef ds:uri="http://customooxmlschemas.google.com/"/>
     <ds:schemaRef ds:uri="http://schemas.openxmlformats.org/officeDocument/2006/relationships"/>
-    <ds:schemaRef ds:uri="http://customooxmlschemas.google.com/"/>
   </ds:schemaRefs>
 </ds:datastoreItem>
 </file>
</xml_diff>